<commit_message>
Replicated the WI logic for upload and delete in OPL 2p0
</commit_message>
<xml_diff>
--- a/Documentation/APIs Docs 2.0/One Point Lesson 2.0.docx
+++ b/Documentation/APIs Docs 2.0/One Point Lesson 2.0.docx
@@ -13,16 +13,16 @@
         <w:rPr>
           <w:rStyle w:val="Strong"/>
         </w:rPr>
-        <w:t>updated API documentation for One Point Lesson 2.0</w:t>
-      </w:r>
-      <w:r>
-        <w:t xml:space="preserve"> to share with your frontend developer.</w:t>
-      </w:r>
-    </w:p>
-    <w:p>
-      <w:r>
-        <w:pict w14:anchorId="601A86D3">
-          <v:rect id="_x0000_i1065" style="width:0;height:1.5pt" o:hralign="center" o:hrstd="t" o:hr="t" fillcolor="#a0a0a0" stroked="f"/>
+        <w:t>API documentation for One Point Lesson 2.0 (OPL 2.0)</w:t>
+      </w:r>
+      <w:r>
+        <w:t xml:space="preserve"> in a format ready to be shared with your frontend developer team:</w:t>
+      </w:r>
+    </w:p>
+    <w:p>
+      <w:r>
+        <w:pict w14:anchorId="733594B9">
+          <v:rect id="_x0000_i1041" style="width:0;height:1.5pt" o:hralign="center" o:hrstd="t" o:hr="t" fillcolor="#a0a0a0" stroked="f"/>
         </w:pict>
       </w:r>
     </w:p>
@@ -37,7 +37,52 @@
         <w:t>📘</w:t>
       </w:r>
       <w:r>
-        <w:t xml:space="preserve"> One Point Lesson 2.0 API Documentation</w:t>
+        <w:t xml:space="preserve"> One Point Lesson 2.0 – API Documentation</w:t>
+      </w:r>
+    </w:p>
+    <w:p>
+      <w:pPr>
+        <w:pStyle w:val="Heading3"/>
+      </w:pPr>
+      <w:r>
+        <w:t>Base URL:</w:t>
+      </w:r>
+    </w:p>
+    <w:p>
+      <w:pPr>
+        <w:pStyle w:val="HTMLPreformatted"/>
+        <w:rPr>
+          <w:rStyle w:val="HTMLCode"/>
+          <w:rFonts w:eastAsiaTheme="majorEastAsia"/>
+        </w:rPr>
+      </w:pPr>
+      <w:r>
+        <w:rPr>
+          <w:rStyle w:val="HTMLCode"/>
+          <w:rFonts w:eastAsiaTheme="majorEastAsia"/>
+        </w:rPr>
+        <w:t>http://&lt;your_server_ip&gt;:&lt;port&gt;/api/onepointlesson2p0</w:t>
+      </w:r>
+    </w:p>
+    <w:p>
+      <w:r>
+        <w:pict w14:anchorId="69976EA5">
+          <v:rect id="_x0000_i1042" style="width:0;height:1.5pt" o:hralign="center" o:hrstd="t" o:hr="t" fillcolor="#a0a0a0" stroked="f"/>
+        </w:pict>
+      </w:r>
+    </w:p>
+    <w:p>
+      <w:pPr>
+        <w:pStyle w:val="Heading3"/>
+      </w:pPr>
+      <w:r>
+        <w:rPr>
+          <w:rFonts w:ascii="Segoe UI Emoji" w:hAnsi="Segoe UI Emoji" w:cs="Segoe UI Emoji"/>
+        </w:rPr>
+        <w:t>📤</w:t>
+      </w:r>
+      <w:r>
+        <w:t xml:space="preserve"> 1. Upload Multiple OPL Steps</w:t>
       </w:r>
     </w:p>
     <w:p>
@@ -45,53 +90,10 @@
         <w:pStyle w:val="NormalWeb"/>
       </w:pPr>
       <w:r>
-        <w:t>Base URL:</w:t>
-      </w:r>
-    </w:p>
-    <w:p>
-      <w:pPr>
-        <w:pStyle w:val="HTMLPreformatted"/>
-        <w:rPr>
-          <w:rStyle w:val="HTMLCode"/>
-        </w:rPr>
-      </w:pPr>
-      <w:r>
-        <w:rPr>
-          <w:rStyle w:val="HTMLCode"/>
-        </w:rPr>
-        <w:t>http://&lt;your-server-ip&gt;:&lt;port&gt;/api/onepointlesson2p0</w:t>
-      </w:r>
-    </w:p>
-    <w:p>
-      <w:r>
-        <w:pict w14:anchorId="74B33FAA">
-          <v:rect id="_x0000_i1066" style="width:0;height:1.5pt" o:hralign="center" o:hrstd="t" o:hr="t" fillcolor="#a0a0a0" stroked="f"/>
-        </w:pict>
-      </w:r>
-    </w:p>
-    <w:p>
-      <w:pPr>
-        <w:pStyle w:val="Heading3"/>
-      </w:pPr>
-      <w:r>
-        <w:rPr>
-          <w:rFonts w:ascii="Segoe UI Emoji" w:hAnsi="Segoe UI Emoji" w:cs="Segoe UI Emoji"/>
-        </w:rPr>
-        <w:t>📤</w:t>
-      </w:r>
-      <w:r>
-        <w:t xml:space="preserve"> 1. Upload One Point Lesson</w:t>
-      </w:r>
-    </w:p>
-    <w:p>
-      <w:pPr>
-        <w:pStyle w:val="NormalWeb"/>
-      </w:pPr>
-      <w:r>
         <w:rPr>
           <w:rStyle w:val="Strong"/>
         </w:rPr>
-        <w:t>Endpoint:</w:t>
+        <w:t>POST</w:t>
       </w:r>
       <w:r>
         <w:t xml:space="preserve"> </w:t>
@@ -99,20 +101,22 @@
       <w:r>
         <w:rPr>
           <w:rStyle w:val="HTMLCode"/>
-        </w:rPr>
-        <w:t>POST /upload</w:t>
-      </w:r>
+          <w:rFonts w:eastAsiaTheme="majorEastAsia"/>
+        </w:rPr>
+        <w:t>/</w:t>
+      </w:r>
+      <w:proofErr w:type="spellStart"/>
+      <w:r>
+        <w:rPr>
+          <w:rStyle w:val="HTMLCode"/>
+          <w:rFonts w:eastAsiaTheme="majorEastAsia"/>
+        </w:rPr>
+        <w:t>uploadMultiple</w:t>
+      </w:r>
+      <w:proofErr w:type="spellEnd"/>
       <w:r>
         <w:br/>
-      </w:r>
-      <w:r>
-        <w:rPr>
-          <w:rStyle w:val="Strong"/>
-        </w:rPr>
-        <w:t>Description:</w:t>
-      </w:r>
-      <w:r>
-        <w:t xml:space="preserve"> Upload multiple lesson steps with images, step numbers, and descriptions.</w:t>
+        <w:t>Upload multiple steps under one lesson.</w:t>
       </w:r>
     </w:p>
     <w:p>
@@ -120,7 +124,7 @@
         <w:pStyle w:val="Heading4"/>
       </w:pPr>
       <w:r>
-        <w:t>Request (multipart/form-data)</w:t>
+        <w:t>Form Data (Multipart):</w:t>
       </w:r>
     </w:p>
     <w:tbl>
@@ -137,9 +141,9 @@
       </w:tblPr>
       <w:tblGrid>
         <w:gridCol w:w="1516"/>
-        <w:gridCol w:w="1621"/>
+        <w:gridCol w:w="564"/>
         <w:gridCol w:w="887"/>
-        <w:gridCol w:w="3885"/>
+        <w:gridCol w:w="5416"/>
       </w:tblGrid>
       <w:tr>
         <w:trPr>
@@ -250,13 +254,15 @@
             <w:hideMark/>
           </w:tcPr>
           <w:p>
+            <w:proofErr w:type="spellStart"/>
             <w:r>
               <w:rPr>
                 <w:rStyle w:val="HTMLCode"/>
-                <w:rFonts w:eastAsiaTheme="minorHAnsi"/>
+                <w:rFonts w:eastAsiaTheme="majorEastAsia"/>
               </w:rPr>
-              <w:t>name</w:t>
+              <w:t>lessonName</w:t>
             </w:r>
+            <w:proofErr w:type="spellEnd"/>
           </w:p>
         </w:tc>
         <w:tc>
@@ -267,10 +273,6 @@
           </w:tcPr>
           <w:p>
             <w:r>
-              <w:rPr>
-                <w:rStyle w:val="HTMLCode"/>
-                <w:rFonts w:eastAsiaTheme="minorHAnsi"/>
-              </w:rPr>
               <w:t>string</w:t>
             </w:r>
           </w:p>
@@ -288,9 +290,6 @@
               </w:rPr>
               <w:t>✅</w:t>
             </w:r>
-            <w:r>
-              <w:t xml:space="preserve"> Yes</w:t>
-            </w:r>
           </w:p>
         </w:tc>
         <w:tc>
@@ -301,7 +300,7 @@
           </w:tcPr>
           <w:p>
             <w:r>
-              <w:t>Name/title of the lesson</w:t>
+              <w:t>Name of the lesson</w:t>
             </w:r>
           </w:p>
         </w:tc>
@@ -321,7 +320,7 @@
             <w:r>
               <w:rPr>
                 <w:rStyle w:val="HTMLCode"/>
-                <w:rFonts w:eastAsiaTheme="minorHAnsi"/>
+                <w:rFonts w:eastAsiaTheme="majorEastAsia"/>
               </w:rPr>
               <w:t>machineCode</w:t>
             </w:r>
@@ -336,10 +335,6 @@
           </w:tcPr>
           <w:p>
             <w:r>
-              <w:rPr>
-                <w:rStyle w:val="HTMLCode"/>
-                <w:rFonts w:eastAsiaTheme="minorHAnsi"/>
-              </w:rPr>
               <w:t>string</w:t>
             </w:r>
           </w:p>
@@ -357,9 +352,6 @@
               </w:rPr>
               <w:t>✅</w:t>
             </w:r>
-            <w:r>
-              <w:t xml:space="preserve"> Yes</w:t>
-            </w:r>
           </w:p>
         </w:tc>
         <w:tc>
@@ -370,7 +362,7 @@
           </w:tcPr>
           <w:p>
             <w:r>
-              <w:t>Machine code the lesson applies to</w:t>
+              <w:t>Code of the machine</w:t>
             </w:r>
           </w:p>
         </w:tc>
@@ -390,7 +382,7 @@
             <w:r>
               <w:rPr>
                 <w:rStyle w:val="HTMLCode"/>
-                <w:rFonts w:eastAsiaTheme="minorHAnsi"/>
+                <w:rFonts w:eastAsiaTheme="majorEastAsia"/>
               </w:rPr>
               <w:t>stepNumbers</w:t>
             </w:r>
@@ -405,11 +397,7 @@
           </w:tcPr>
           <w:p>
             <w:r>
-              <w:rPr>
-                <w:rStyle w:val="HTMLCode"/>
-                <w:rFonts w:eastAsiaTheme="minorHAnsi"/>
-              </w:rPr>
-              <w:t>array[number]</w:t>
+              <w:t>array</w:t>
             </w:r>
           </w:p>
         </w:tc>
@@ -426,9 +414,6 @@
               </w:rPr>
               <w:t>✅</w:t>
             </w:r>
-            <w:r>
-              <w:t xml:space="preserve"> Yes</w:t>
-            </w:r>
           </w:p>
         </w:tc>
         <w:tc>
@@ -439,7 +424,17 @@
           </w:tcPr>
           <w:p>
             <w:r>
-              <w:t>Step numbers (e.g., 1, 2, 3...)</w:t>
+              <w:t xml:space="preserve">JSON string of step numbers (e.g. </w:t>
+            </w:r>
+            <w:r>
+              <w:rPr>
+                <w:rStyle w:val="HTMLCode"/>
+                <w:rFonts w:eastAsiaTheme="majorEastAsia"/>
+              </w:rPr>
+              <w:t>[1, 2]</w:t>
+            </w:r>
+            <w:r>
+              <w:t>)</w:t>
             </w:r>
           </w:p>
         </w:tc>
@@ -458,7 +453,7 @@
             <w:r>
               <w:rPr>
                 <w:rStyle w:val="HTMLCode"/>
-                <w:rFonts w:eastAsiaTheme="minorHAnsi"/>
+                <w:rFonts w:eastAsiaTheme="majorEastAsia"/>
               </w:rPr>
               <w:t>descriptions</w:t>
             </w:r>
@@ -472,11 +467,7 @@
           </w:tcPr>
           <w:p>
             <w:r>
-              <w:rPr>
-                <w:rStyle w:val="HTMLCode"/>
-                <w:rFonts w:eastAsiaTheme="minorHAnsi"/>
-              </w:rPr>
-              <w:t>array[string]</w:t>
+              <w:t>array</w:t>
             </w:r>
           </w:p>
         </w:tc>
@@ -493,9 +484,6 @@
               </w:rPr>
               <w:t>✅</w:t>
             </w:r>
-            <w:r>
-              <w:t xml:space="preserve"> Yes</w:t>
-            </w:r>
           </w:p>
         </w:tc>
         <w:tc>
@@ -506,7 +494,17 @@
           </w:tcPr>
           <w:p>
             <w:r>
-              <w:t>Step descriptions</w:t>
+              <w:t xml:space="preserve">JSON string of descriptions (e.g. </w:t>
+            </w:r>
+            <w:r>
+              <w:rPr>
+                <w:rStyle w:val="HTMLCode"/>
+                <w:rFonts w:eastAsiaTheme="majorEastAsia"/>
+              </w:rPr>
+              <w:t>["Step 1", "Step 2"]</w:t>
+            </w:r>
+            <w:r>
+              <w:t>)</w:t>
             </w:r>
           </w:p>
         </w:tc>
@@ -525,9 +523,9 @@
             <w:r>
               <w:rPr>
                 <w:rStyle w:val="HTMLCode"/>
-                <w:rFonts w:eastAsiaTheme="minorHAnsi"/>
+                <w:rFonts w:eastAsiaTheme="majorEastAsia"/>
               </w:rPr>
-              <w:t>steps</w:t>
+              <w:t>images</w:t>
             </w:r>
           </w:p>
         </w:tc>
@@ -538,12 +536,13 @@
             <w:hideMark/>
           </w:tcPr>
           <w:p>
+            <w:proofErr w:type="gramStart"/>
             <w:r>
-              <w:rPr>
-                <w:rStyle w:val="HTMLCode"/>
-                <w:rFonts w:eastAsiaTheme="minorHAnsi"/>
-              </w:rPr>
-              <w:t>array[file]</w:t>
+              <w:t>file[</w:t>
+            </w:r>
+            <w:proofErr w:type="gramEnd"/>
+            <w:r>
+              <w:t>]</w:t>
             </w:r>
           </w:p>
         </w:tc>
@@ -560,9 +559,6 @@
               </w:rPr>
               <w:t>✅</w:t>
             </w:r>
-            <w:r>
-              <w:t xml:space="preserve"> Yes</w:t>
-            </w:r>
           </w:p>
         </w:tc>
         <w:tc>
@@ -573,7 +569,15 @@
           </w:tcPr>
           <w:p>
             <w:r>
-              <w:t>Images for each step (JPEG, JPG, PNG only)</w:t>
+              <w:t>Array of image files (jpg/</w:t>
+            </w:r>
+            <w:proofErr w:type="spellStart"/>
+            <w:r>
+              <w:t>png</w:t>
+            </w:r>
+            <w:proofErr w:type="spellEnd"/>
+            <w:r>
+              <w:t>/jpeg)</w:t>
             </w:r>
           </w:p>
         </w:tc>
@@ -584,1187 +588,7 @@
         <w:pStyle w:val="Heading4"/>
       </w:pPr>
       <w:r>
-        <w:t>Example (Postman):</w:t>
-      </w:r>
-    </w:p>
-    <w:p>
-      <w:pPr>
-        <w:pStyle w:val="HTMLPreformatted"/>
-        <w:rPr>
-          <w:rStyle w:val="HTMLCode"/>
-        </w:rPr>
-      </w:pPr>
-      <w:r>
-        <w:rPr>
-          <w:rStyle w:val="HTMLCode"/>
-        </w:rPr>
-        <w:t xml:space="preserve">name = OPL - Safety Instructions  </w:t>
-      </w:r>
-    </w:p>
-    <w:p>
-      <w:pPr>
-        <w:pStyle w:val="HTMLPreformatted"/>
-        <w:rPr>
-          <w:rStyle w:val="HTMLCode"/>
-        </w:rPr>
-      </w:pPr>
-      <w:proofErr w:type="spellStart"/>
-      <w:r>
-        <w:rPr>
-          <w:rStyle w:val="HTMLCode"/>
-        </w:rPr>
-        <w:t>machineCode</w:t>
-      </w:r>
-      <w:proofErr w:type="spellEnd"/>
-      <w:r>
-        <w:rPr>
-          <w:rStyle w:val="HTMLCode"/>
-        </w:rPr>
-        <w:t xml:space="preserve"> = MC1001  </w:t>
-      </w:r>
-    </w:p>
-    <w:p>
-      <w:pPr>
-        <w:pStyle w:val="HTMLPreformatted"/>
-        <w:rPr>
-          <w:rStyle w:val="HTMLCode"/>
-        </w:rPr>
-      </w:pPr>
-      <w:proofErr w:type="spellStart"/>
-      <w:r>
-        <w:rPr>
-          <w:rStyle w:val="HTMLCode"/>
-        </w:rPr>
-        <w:t>stepNumbers</w:t>
-      </w:r>
-      <w:proofErr w:type="spellEnd"/>
-      <w:r>
-        <w:rPr>
-          <w:rStyle w:val="HTMLCode"/>
-        </w:rPr>
-        <w:t xml:space="preserve"> = 1, 2  </w:t>
-      </w:r>
-    </w:p>
-    <w:p>
-      <w:pPr>
-        <w:pStyle w:val="HTMLPreformatted"/>
-        <w:rPr>
-          <w:rStyle w:val="HTMLCode"/>
-        </w:rPr>
-      </w:pPr>
-      <w:r>
-        <w:rPr>
-          <w:rStyle w:val="HTMLCode"/>
-        </w:rPr>
-        <w:t xml:space="preserve">descriptions = Wear gloves, Shut down before maintenance  </w:t>
-      </w:r>
-    </w:p>
-    <w:p>
-      <w:pPr>
-        <w:pStyle w:val="HTMLPreformatted"/>
-        <w:rPr>
-          <w:rStyle w:val="HTMLCode"/>
-        </w:rPr>
-      </w:pPr>
-      <w:r>
-        <w:rPr>
-          <w:rStyle w:val="HTMLCode"/>
-        </w:rPr>
-        <w:t>steps = [gloves.jpg, shutdown.jpg]</w:t>
-      </w:r>
-    </w:p>
-    <w:p>
-      <w:pPr>
-        <w:pStyle w:val="Heading4"/>
-      </w:pPr>
-      <w:r>
-        <w:t>Response (201 Created)</w:t>
-      </w:r>
-    </w:p>
-    <w:p>
-      <w:pPr>
-        <w:pStyle w:val="HTMLPreformatted"/>
-        <w:rPr>
-          <w:rStyle w:val="HTMLCode"/>
-        </w:rPr>
-      </w:pPr>
-      <w:r>
-        <w:rPr>
-          <w:rStyle w:val="HTMLCode"/>
-        </w:rPr>
-        <w:t>{</w:t>
-      </w:r>
-    </w:p>
-    <w:p>
-      <w:pPr>
-        <w:pStyle w:val="HTMLPreformatted"/>
-        <w:rPr>
-          <w:rStyle w:val="HTMLCode"/>
-        </w:rPr>
-      </w:pPr>
-      <w:r>
-        <w:rPr>
-          <w:rStyle w:val="HTMLCode"/>
-        </w:rPr>
-        <w:t xml:space="preserve">  "message": "Lesson uploaded",</w:t>
-      </w:r>
-    </w:p>
-    <w:p>
-      <w:pPr>
-        <w:pStyle w:val="HTMLPreformatted"/>
-        <w:rPr>
-          <w:rStyle w:val="HTMLCode"/>
-        </w:rPr>
-      </w:pPr>
-      <w:r>
-        <w:rPr>
-          <w:rStyle w:val="HTMLCode"/>
-        </w:rPr>
-        <w:t xml:space="preserve">  "data": {</w:t>
-      </w:r>
-    </w:p>
-    <w:p>
-      <w:pPr>
-        <w:pStyle w:val="HTMLPreformatted"/>
-        <w:rPr>
-          <w:rStyle w:val="HTMLCode"/>
-        </w:rPr>
-      </w:pPr>
-      <w:r>
-        <w:rPr>
-          <w:rStyle w:val="HTMLCode"/>
-        </w:rPr>
-        <w:t xml:space="preserve">    "_id": "665fcd13c...",</w:t>
-      </w:r>
-    </w:p>
-    <w:p>
-      <w:pPr>
-        <w:pStyle w:val="HTMLPreformatted"/>
-        <w:rPr>
-          <w:rStyle w:val="HTMLCode"/>
-        </w:rPr>
-      </w:pPr>
-      <w:r>
-        <w:rPr>
-          <w:rStyle w:val="HTMLCode"/>
-        </w:rPr>
-        <w:t xml:space="preserve">    "name": "OPL - Safety Instructions",</w:t>
-      </w:r>
-    </w:p>
-    <w:p>
-      <w:pPr>
-        <w:pStyle w:val="HTMLPreformatted"/>
-        <w:rPr>
-          <w:rStyle w:val="HTMLCode"/>
-        </w:rPr>
-      </w:pPr>
-      <w:r>
-        <w:rPr>
-          <w:rStyle w:val="HTMLCode"/>
-        </w:rPr>
-        <w:t xml:space="preserve">    "</w:t>
-      </w:r>
-      <w:proofErr w:type="spellStart"/>
-      <w:r>
-        <w:rPr>
-          <w:rStyle w:val="HTMLCode"/>
-        </w:rPr>
-        <w:t>machineCode</w:t>
-      </w:r>
-      <w:proofErr w:type="spellEnd"/>
-      <w:r>
-        <w:rPr>
-          <w:rStyle w:val="HTMLCode"/>
-        </w:rPr>
-        <w:t>": "MC1001",</w:t>
-      </w:r>
-    </w:p>
-    <w:p>
-      <w:pPr>
-        <w:pStyle w:val="HTMLPreformatted"/>
-        <w:rPr>
-          <w:rStyle w:val="HTMLCode"/>
-        </w:rPr>
-      </w:pPr>
-      <w:r>
-        <w:rPr>
-          <w:rStyle w:val="HTMLCode"/>
-        </w:rPr>
-        <w:t xml:space="preserve">    "steps": [</w:t>
-      </w:r>
-    </w:p>
-    <w:p>
-      <w:pPr>
-        <w:pStyle w:val="HTMLPreformatted"/>
-        <w:rPr>
-          <w:rStyle w:val="HTMLCode"/>
-        </w:rPr>
-      </w:pPr>
-      <w:r>
-        <w:rPr>
-          <w:rStyle w:val="HTMLCode"/>
-        </w:rPr>
-        <w:t xml:space="preserve">      {</w:t>
-      </w:r>
-    </w:p>
-    <w:p>
-      <w:pPr>
-        <w:pStyle w:val="HTMLPreformatted"/>
-        <w:rPr>
-          <w:rStyle w:val="HTMLCode"/>
-        </w:rPr>
-      </w:pPr>
-      <w:r>
-        <w:rPr>
-          <w:rStyle w:val="HTMLCode"/>
-        </w:rPr>
-        <w:t xml:space="preserve">        "</w:t>
-      </w:r>
-      <w:proofErr w:type="spellStart"/>
-      <w:r>
-        <w:rPr>
-          <w:rStyle w:val="HTMLCode"/>
-        </w:rPr>
-        <w:t>stepNumber</w:t>
-      </w:r>
-      <w:proofErr w:type="spellEnd"/>
-      <w:r>
-        <w:rPr>
-          <w:rStyle w:val="HTMLCode"/>
-        </w:rPr>
-        <w:t>": 1,</w:t>
-      </w:r>
-    </w:p>
-    <w:p>
-      <w:pPr>
-        <w:pStyle w:val="HTMLPreformatted"/>
-        <w:rPr>
-          <w:rStyle w:val="HTMLCode"/>
-        </w:rPr>
-      </w:pPr>
-      <w:r>
-        <w:rPr>
-          <w:rStyle w:val="HTMLCode"/>
-        </w:rPr>
-        <w:t xml:space="preserve">        "description": "Wear gloves",</w:t>
-      </w:r>
-    </w:p>
-    <w:p>
-      <w:pPr>
-        <w:pStyle w:val="HTMLPreformatted"/>
-        <w:rPr>
-          <w:rStyle w:val="HTMLCode"/>
-        </w:rPr>
-      </w:pPr>
-      <w:r>
-        <w:rPr>
-          <w:rStyle w:val="HTMLCode"/>
-        </w:rPr>
-        <w:t xml:space="preserve">        "</w:t>
-      </w:r>
-      <w:proofErr w:type="spellStart"/>
-      <w:r>
-        <w:rPr>
-          <w:rStyle w:val="HTMLCode"/>
-        </w:rPr>
-        <w:t>imagePath</w:t>
-      </w:r>
-      <w:proofErr w:type="spellEnd"/>
-      <w:r>
-        <w:rPr>
-          <w:rStyle w:val="HTMLCode"/>
-        </w:rPr>
-        <w:t>": "uploads/onepointlesson2p0/1717571001_gloves.jpg"</w:t>
-      </w:r>
-    </w:p>
-    <w:p>
-      <w:pPr>
-        <w:pStyle w:val="HTMLPreformatted"/>
-        <w:rPr>
-          <w:rStyle w:val="HTMLCode"/>
-        </w:rPr>
-      </w:pPr>
-      <w:r>
-        <w:rPr>
-          <w:rStyle w:val="HTMLCode"/>
-        </w:rPr>
-        <w:t xml:space="preserve">      },</w:t>
-      </w:r>
-    </w:p>
-    <w:p>
-      <w:pPr>
-        <w:pStyle w:val="HTMLPreformatted"/>
-        <w:rPr>
-          <w:rStyle w:val="HTMLCode"/>
-        </w:rPr>
-      </w:pPr>
-      <w:r>
-        <w:rPr>
-          <w:rStyle w:val="HTMLCode"/>
-        </w:rPr>
-        <w:t xml:space="preserve">      {</w:t>
-      </w:r>
-    </w:p>
-    <w:p>
-      <w:pPr>
-        <w:pStyle w:val="HTMLPreformatted"/>
-        <w:rPr>
-          <w:rStyle w:val="HTMLCode"/>
-        </w:rPr>
-      </w:pPr>
-      <w:r>
-        <w:rPr>
-          <w:rStyle w:val="HTMLCode"/>
-        </w:rPr>
-        <w:t xml:space="preserve">        "</w:t>
-      </w:r>
-      <w:proofErr w:type="spellStart"/>
-      <w:r>
-        <w:rPr>
-          <w:rStyle w:val="HTMLCode"/>
-        </w:rPr>
-        <w:t>stepNumber</w:t>
-      </w:r>
-      <w:proofErr w:type="spellEnd"/>
-      <w:r>
-        <w:rPr>
-          <w:rStyle w:val="HTMLCode"/>
-        </w:rPr>
-        <w:t>": 2,</w:t>
-      </w:r>
-    </w:p>
-    <w:p>
-      <w:pPr>
-        <w:pStyle w:val="HTMLPreformatted"/>
-        <w:rPr>
-          <w:rStyle w:val="HTMLCode"/>
-        </w:rPr>
-      </w:pPr>
-      <w:r>
-        <w:rPr>
-          <w:rStyle w:val="HTMLCode"/>
-        </w:rPr>
-        <w:t xml:space="preserve">        "description": "Shut down before maintenance",</w:t>
-      </w:r>
-    </w:p>
-    <w:p>
-      <w:pPr>
-        <w:pStyle w:val="HTMLPreformatted"/>
-        <w:rPr>
-          <w:rStyle w:val="HTMLCode"/>
-        </w:rPr>
-      </w:pPr>
-      <w:r>
-        <w:rPr>
-          <w:rStyle w:val="HTMLCode"/>
-        </w:rPr>
-        <w:t xml:space="preserve">        "</w:t>
-      </w:r>
-      <w:proofErr w:type="spellStart"/>
-      <w:r>
-        <w:rPr>
-          <w:rStyle w:val="HTMLCode"/>
-        </w:rPr>
-        <w:t>imagePath</w:t>
-      </w:r>
-      <w:proofErr w:type="spellEnd"/>
-      <w:r>
-        <w:rPr>
-          <w:rStyle w:val="HTMLCode"/>
-        </w:rPr>
-        <w:t>": "uploads/onepointlesson2p0/1717571002_shutdown.jpg"</w:t>
-      </w:r>
-    </w:p>
-    <w:p>
-      <w:pPr>
-        <w:pStyle w:val="HTMLPreformatted"/>
-        <w:rPr>
-          <w:rStyle w:val="HTMLCode"/>
-        </w:rPr>
-      </w:pPr>
-      <w:r>
-        <w:rPr>
-          <w:rStyle w:val="HTMLCode"/>
-        </w:rPr>
-        <w:lastRenderedPageBreak/>
-        <w:t xml:space="preserve">      }</w:t>
-      </w:r>
-    </w:p>
-    <w:p>
-      <w:pPr>
-        <w:pStyle w:val="HTMLPreformatted"/>
-        <w:rPr>
-          <w:rStyle w:val="HTMLCode"/>
-        </w:rPr>
-      </w:pPr>
-      <w:r>
-        <w:rPr>
-          <w:rStyle w:val="HTMLCode"/>
-        </w:rPr>
-        <w:t xml:space="preserve">    ]</w:t>
-      </w:r>
-    </w:p>
-    <w:p>
-      <w:pPr>
-        <w:pStyle w:val="HTMLPreformatted"/>
-        <w:rPr>
-          <w:rStyle w:val="HTMLCode"/>
-        </w:rPr>
-      </w:pPr>
-      <w:r>
-        <w:rPr>
-          <w:rStyle w:val="HTMLCode"/>
-        </w:rPr>
-        <w:t xml:space="preserve">  }</w:t>
-      </w:r>
-    </w:p>
-    <w:p>
-      <w:pPr>
-        <w:pStyle w:val="HTMLPreformatted"/>
-        <w:rPr>
-          <w:rStyle w:val="HTMLCode"/>
-        </w:rPr>
-      </w:pPr>
-      <w:r>
-        <w:rPr>
-          <w:rStyle w:val="HTMLCode"/>
-        </w:rPr>
-        <w:t>}</w:t>
-      </w:r>
-    </w:p>
-    <w:p>
-      <w:r>
-        <w:pict w14:anchorId="1B9E55FF">
-          <v:rect id="_x0000_i1067" style="width:0;height:1.5pt" o:hralign="center" o:hrstd="t" o:hr="t" fillcolor="#a0a0a0" stroked="f"/>
-        </w:pict>
-      </w:r>
-    </w:p>
-    <w:p>
-      <w:pPr>
-        <w:pStyle w:val="Heading3"/>
-      </w:pPr>
-      <w:r>
-        <w:rPr>
-          <w:rFonts w:ascii="Segoe UI Emoji" w:hAnsi="Segoe UI Emoji" w:cs="Segoe UI Emoji"/>
-        </w:rPr>
-        <w:t>📥</w:t>
-      </w:r>
-      <w:r>
-        <w:t xml:space="preserve"> 2. Get One Point Lessons</w:t>
-      </w:r>
-    </w:p>
-    <w:p>
-      <w:pPr>
-        <w:pStyle w:val="NormalWeb"/>
-      </w:pPr>
-      <w:r>
-        <w:rPr>
-          <w:rStyle w:val="Strong"/>
-        </w:rPr>
-        <w:t>Endpoint:</w:t>
-      </w:r>
-      <w:r>
-        <w:t xml:space="preserve"> </w:t>
-      </w:r>
-      <w:r>
-        <w:rPr>
-          <w:rStyle w:val="HTMLCode"/>
-        </w:rPr>
-        <w:t>GET /</w:t>
-      </w:r>
-      <w:r>
-        <w:br/>
-      </w:r>
-      <w:r>
-        <w:rPr>
-          <w:rStyle w:val="Strong"/>
-        </w:rPr>
-        <w:t>Description:</w:t>
-      </w:r>
-      <w:r>
-        <w:t xml:space="preserve"> Fetch all One Point Lessons. Optionally filter by </w:t>
-      </w:r>
-      <w:proofErr w:type="spellStart"/>
-      <w:r>
-        <w:rPr>
-          <w:rStyle w:val="HTMLCode"/>
-        </w:rPr>
-        <w:t>machineCode</w:t>
-      </w:r>
-      <w:proofErr w:type="spellEnd"/>
-      <w:r>
-        <w:t>.</w:t>
-      </w:r>
-    </w:p>
-    <w:p>
-      <w:pPr>
-        <w:pStyle w:val="Heading4"/>
-      </w:pPr>
-      <w:r>
-        <w:t>Query Parameters:</w:t>
-      </w:r>
-    </w:p>
-    <w:tbl>
-      <w:tblPr>
-        <w:tblW w:w="0" w:type="auto"/>
-        <w:tblCellSpacing w:w="15" w:type="dxa"/>
-        <w:tblCellMar>
-          <w:top w:w="15" w:type="dxa"/>
-          <w:left w:w="15" w:type="dxa"/>
-          <w:bottom w:w="15" w:type="dxa"/>
-          <w:right w:w="15" w:type="dxa"/>
-        </w:tblCellMar>
-        <w:tblLook w:val="04A0" w:firstRow="1" w:lastRow="0" w:firstColumn="1" w:lastColumn="0" w:noHBand="0" w:noVBand="1"/>
-      </w:tblPr>
-      <w:tblGrid>
-        <w:gridCol w:w="1396"/>
-        <w:gridCol w:w="781"/>
-        <w:gridCol w:w="3049"/>
-      </w:tblGrid>
-      <w:tr>
-        <w:trPr>
-          <w:tblHeader/>
-          <w:tblCellSpacing w:w="15" w:type="dxa"/>
-        </w:trPr>
-        <w:tc>
-          <w:tcPr>
-            <w:tcW w:w="0" w:type="auto"/>
-            <w:vAlign w:val="center"/>
-            <w:hideMark/>
-          </w:tcPr>
-          <w:p>
-            <w:pPr>
-              <w:jc w:val="center"/>
-              <w:rPr>
-                <w:b/>
-                <w:bCs/>
-              </w:rPr>
-            </w:pPr>
-            <w:r>
-              <w:rPr>
-                <w:b/>
-                <w:bCs/>
-              </w:rPr>
-              <w:t>Parameter</w:t>
-            </w:r>
-          </w:p>
-        </w:tc>
-        <w:tc>
-          <w:tcPr>
-            <w:tcW w:w="0" w:type="auto"/>
-            <w:vAlign w:val="center"/>
-            <w:hideMark/>
-          </w:tcPr>
-          <w:p>
-            <w:pPr>
-              <w:jc w:val="center"/>
-              <w:rPr>
-                <w:b/>
-                <w:bCs/>
-              </w:rPr>
-            </w:pPr>
-            <w:r>
-              <w:rPr>
-                <w:b/>
-                <w:bCs/>
-              </w:rPr>
-              <w:t>Type</w:t>
-            </w:r>
-          </w:p>
-        </w:tc>
-        <w:tc>
-          <w:tcPr>
-            <w:tcW w:w="0" w:type="auto"/>
-            <w:vAlign w:val="center"/>
-            <w:hideMark/>
-          </w:tcPr>
-          <w:p>
-            <w:pPr>
-              <w:jc w:val="center"/>
-              <w:rPr>
-                <w:b/>
-                <w:bCs/>
-              </w:rPr>
-            </w:pPr>
-            <w:r>
-              <w:rPr>
-                <w:b/>
-                <w:bCs/>
-              </w:rPr>
-              <w:t>Description</w:t>
-            </w:r>
-          </w:p>
-        </w:tc>
-      </w:tr>
-      <w:tr>
-        <w:trPr>
-          <w:tblCellSpacing w:w="15" w:type="dxa"/>
-        </w:trPr>
-        <w:tc>
-          <w:tcPr>
-            <w:tcW w:w="0" w:type="auto"/>
-            <w:vAlign w:val="center"/>
-            <w:hideMark/>
-          </w:tcPr>
-          <w:p>
-            <w:proofErr w:type="spellStart"/>
-            <w:r>
-              <w:rPr>
-                <w:rStyle w:val="HTMLCode"/>
-                <w:rFonts w:eastAsiaTheme="minorHAnsi"/>
-              </w:rPr>
-              <w:t>machineCode</w:t>
-            </w:r>
-            <w:proofErr w:type="spellEnd"/>
-          </w:p>
-        </w:tc>
-        <w:tc>
-          <w:tcPr>
-            <w:tcW w:w="0" w:type="auto"/>
-            <w:vAlign w:val="center"/>
-            <w:hideMark/>
-          </w:tcPr>
-          <w:p>
-            <w:r>
-              <w:rPr>
-                <w:rStyle w:val="HTMLCode"/>
-                <w:rFonts w:eastAsiaTheme="minorHAnsi"/>
-              </w:rPr>
-              <w:t>string</w:t>
-            </w:r>
-          </w:p>
-        </w:tc>
-        <w:tc>
-          <w:tcPr>
-            <w:tcW w:w="0" w:type="auto"/>
-            <w:vAlign w:val="center"/>
-            <w:hideMark/>
-          </w:tcPr>
-          <w:p>
-            <w:r>
-              <w:t>(Optional) Filter by machine code</w:t>
-            </w:r>
-          </w:p>
-        </w:tc>
-      </w:tr>
-    </w:tbl>
-    <w:p>
-      <w:pPr>
-        <w:pStyle w:val="Heading4"/>
-      </w:pPr>
-      <w:r>
-        <w:t>Example:</w:t>
-      </w:r>
-    </w:p>
-    <w:p>
-      <w:pPr>
-        <w:pStyle w:val="HTMLPreformatted"/>
-        <w:rPr>
-          <w:rStyle w:val="HTMLCode"/>
-        </w:rPr>
-      </w:pPr>
-      <w:r>
-        <w:rPr>
-          <w:rStyle w:val="HTMLCode"/>
-        </w:rPr>
-        <w:t>GET /</w:t>
-      </w:r>
-      <w:proofErr w:type="spellStart"/>
-      <w:r>
-        <w:rPr>
-          <w:rStyle w:val="HTMLCode"/>
-        </w:rPr>
-        <w:t>api</w:t>
-      </w:r>
-      <w:proofErr w:type="spellEnd"/>
-      <w:r>
-        <w:rPr>
-          <w:rStyle w:val="HTMLCode"/>
-        </w:rPr>
-        <w:t>/onepointlesson2p0?machineCode=MC1001</w:t>
-      </w:r>
-    </w:p>
-    <w:p>
-      <w:pPr>
-        <w:pStyle w:val="Heading4"/>
-      </w:pPr>
-      <w:r>
-        <w:t>Response (200 OK)</w:t>
-      </w:r>
-    </w:p>
-    <w:p>
-      <w:pPr>
-        <w:pStyle w:val="HTMLPreformatted"/>
-        <w:rPr>
-          <w:rStyle w:val="HTMLCode"/>
-        </w:rPr>
-      </w:pPr>
-      <w:r>
-        <w:rPr>
-          <w:rStyle w:val="HTMLCode"/>
-        </w:rPr>
-        <w:t>[</w:t>
-      </w:r>
-    </w:p>
-    <w:p>
-      <w:pPr>
-        <w:pStyle w:val="HTMLPreformatted"/>
-        <w:rPr>
-          <w:rStyle w:val="HTMLCode"/>
-        </w:rPr>
-      </w:pPr>
-      <w:r>
-        <w:rPr>
-          <w:rStyle w:val="HTMLCode"/>
-        </w:rPr>
-        <w:t xml:space="preserve">  {</w:t>
-      </w:r>
-    </w:p>
-    <w:p>
-      <w:pPr>
-        <w:pStyle w:val="HTMLPreformatted"/>
-        <w:rPr>
-          <w:rStyle w:val="HTMLCode"/>
-        </w:rPr>
-      </w:pPr>
-      <w:r>
-        <w:rPr>
-          <w:rStyle w:val="HTMLCode"/>
-        </w:rPr>
-        <w:t xml:space="preserve">    "_id": "665fcd13c...",</w:t>
-      </w:r>
-    </w:p>
-    <w:p>
-      <w:pPr>
-        <w:pStyle w:val="HTMLPreformatted"/>
-        <w:rPr>
-          <w:rStyle w:val="HTMLCode"/>
-        </w:rPr>
-      </w:pPr>
-      <w:r>
-        <w:rPr>
-          <w:rStyle w:val="HTMLCode"/>
-        </w:rPr>
-        <w:t xml:space="preserve">    "name": "OPL - Safety Instructions",</w:t>
-      </w:r>
-    </w:p>
-    <w:p>
-      <w:pPr>
-        <w:pStyle w:val="HTMLPreformatted"/>
-        <w:rPr>
-          <w:rStyle w:val="HTMLCode"/>
-        </w:rPr>
-      </w:pPr>
-      <w:r>
-        <w:rPr>
-          <w:rStyle w:val="HTMLCode"/>
-        </w:rPr>
-        <w:t xml:space="preserve">    "</w:t>
-      </w:r>
-      <w:proofErr w:type="spellStart"/>
-      <w:r>
-        <w:rPr>
-          <w:rStyle w:val="HTMLCode"/>
-        </w:rPr>
-        <w:t>machineCode</w:t>
-      </w:r>
-      <w:proofErr w:type="spellEnd"/>
-      <w:r>
-        <w:rPr>
-          <w:rStyle w:val="HTMLCode"/>
-        </w:rPr>
-        <w:t>": "MC1001",</w:t>
-      </w:r>
-    </w:p>
-    <w:p>
-      <w:pPr>
-        <w:pStyle w:val="HTMLPreformatted"/>
-        <w:rPr>
-          <w:rStyle w:val="HTMLCode"/>
-        </w:rPr>
-      </w:pPr>
-      <w:r>
-        <w:rPr>
-          <w:rStyle w:val="HTMLCode"/>
-        </w:rPr>
-        <w:t xml:space="preserve">    "steps": [</w:t>
-      </w:r>
-    </w:p>
-    <w:p>
-      <w:pPr>
-        <w:pStyle w:val="HTMLPreformatted"/>
-        <w:rPr>
-          <w:rStyle w:val="HTMLCode"/>
-        </w:rPr>
-      </w:pPr>
-      <w:r>
-        <w:rPr>
-          <w:rStyle w:val="HTMLCode"/>
-        </w:rPr>
-        <w:t xml:space="preserve">      {</w:t>
-      </w:r>
-    </w:p>
-    <w:p>
-      <w:pPr>
-        <w:pStyle w:val="HTMLPreformatted"/>
-        <w:rPr>
-          <w:rStyle w:val="HTMLCode"/>
-        </w:rPr>
-      </w:pPr>
-      <w:r>
-        <w:rPr>
-          <w:rStyle w:val="HTMLCode"/>
-        </w:rPr>
-        <w:t xml:space="preserve">        "</w:t>
-      </w:r>
-      <w:proofErr w:type="spellStart"/>
-      <w:r>
-        <w:rPr>
-          <w:rStyle w:val="HTMLCode"/>
-        </w:rPr>
-        <w:t>stepNumber</w:t>
-      </w:r>
-      <w:proofErr w:type="spellEnd"/>
-      <w:r>
-        <w:rPr>
-          <w:rStyle w:val="HTMLCode"/>
-        </w:rPr>
-        <w:t>": 1,</w:t>
-      </w:r>
-    </w:p>
-    <w:p>
-      <w:pPr>
-        <w:pStyle w:val="HTMLPreformatted"/>
-        <w:rPr>
-          <w:rStyle w:val="HTMLCode"/>
-        </w:rPr>
-      </w:pPr>
-      <w:r>
-        <w:rPr>
-          <w:rStyle w:val="HTMLCode"/>
-        </w:rPr>
-        <w:t xml:space="preserve">        "description": "Wear gloves",</w:t>
-      </w:r>
-    </w:p>
-    <w:p>
-      <w:pPr>
-        <w:pStyle w:val="HTMLPreformatted"/>
-        <w:rPr>
-          <w:rStyle w:val="HTMLCode"/>
-        </w:rPr>
-      </w:pPr>
-      <w:r>
-        <w:rPr>
-          <w:rStyle w:val="HTMLCode"/>
-        </w:rPr>
-        <w:t xml:space="preserve">        "</w:t>
-      </w:r>
-      <w:proofErr w:type="spellStart"/>
-      <w:r>
-        <w:rPr>
-          <w:rStyle w:val="HTMLCode"/>
-        </w:rPr>
-        <w:t>imagePath</w:t>
-      </w:r>
-      <w:proofErr w:type="spellEnd"/>
-      <w:r>
-        <w:rPr>
-          <w:rStyle w:val="HTMLCode"/>
-        </w:rPr>
-        <w:t>": "uploads/onepointlesson2p0/1717571001_gloves.jpg"</w:t>
-      </w:r>
-    </w:p>
-    <w:p>
-      <w:pPr>
-        <w:pStyle w:val="HTMLPreformatted"/>
-        <w:rPr>
-          <w:rStyle w:val="HTMLCode"/>
-        </w:rPr>
-      </w:pPr>
-      <w:r>
-        <w:rPr>
-          <w:rStyle w:val="HTMLCode"/>
-        </w:rPr>
-        <w:t xml:space="preserve">      },</w:t>
-      </w:r>
-    </w:p>
-    <w:p>
-      <w:pPr>
-        <w:pStyle w:val="HTMLPreformatted"/>
-        <w:rPr>
-          <w:rStyle w:val="HTMLCode"/>
-        </w:rPr>
-      </w:pPr>
-      <w:r>
-        <w:rPr>
-          <w:rStyle w:val="HTMLCode"/>
-        </w:rPr>
-        <w:t xml:space="preserve">      {</w:t>
-      </w:r>
-    </w:p>
-    <w:p>
-      <w:pPr>
-        <w:pStyle w:val="HTMLPreformatted"/>
-        <w:rPr>
-          <w:rStyle w:val="HTMLCode"/>
-        </w:rPr>
-      </w:pPr>
-      <w:r>
-        <w:rPr>
-          <w:rStyle w:val="HTMLCode"/>
-        </w:rPr>
-        <w:t xml:space="preserve">        "</w:t>
-      </w:r>
-      <w:proofErr w:type="spellStart"/>
-      <w:r>
-        <w:rPr>
-          <w:rStyle w:val="HTMLCode"/>
-        </w:rPr>
-        <w:t>stepNumber</w:t>
-      </w:r>
-      <w:proofErr w:type="spellEnd"/>
-      <w:r>
-        <w:rPr>
-          <w:rStyle w:val="HTMLCode"/>
-        </w:rPr>
-        <w:t>": 2,</w:t>
-      </w:r>
-    </w:p>
-    <w:p>
-      <w:pPr>
-        <w:pStyle w:val="HTMLPreformatted"/>
-        <w:rPr>
-          <w:rStyle w:val="HTMLCode"/>
-        </w:rPr>
-      </w:pPr>
-      <w:r>
-        <w:rPr>
-          <w:rStyle w:val="HTMLCode"/>
-        </w:rPr>
-        <w:t xml:space="preserve">        "description": "Shut down before maintenance",</w:t>
-      </w:r>
-    </w:p>
-    <w:p>
-      <w:pPr>
-        <w:pStyle w:val="HTMLPreformatted"/>
-        <w:rPr>
-          <w:rStyle w:val="HTMLCode"/>
-        </w:rPr>
-      </w:pPr>
-      <w:r>
-        <w:rPr>
-          <w:rStyle w:val="HTMLCode"/>
-        </w:rPr>
-        <w:t xml:space="preserve">        "</w:t>
-      </w:r>
-      <w:proofErr w:type="spellStart"/>
-      <w:r>
-        <w:rPr>
-          <w:rStyle w:val="HTMLCode"/>
-        </w:rPr>
-        <w:t>imagePath</w:t>
-      </w:r>
-      <w:proofErr w:type="spellEnd"/>
-      <w:r>
-        <w:rPr>
-          <w:rStyle w:val="HTMLCode"/>
-        </w:rPr>
-        <w:t>": "uploads/onepointlesson2p0/1717571002_shutdown.jpg"</w:t>
-      </w:r>
-    </w:p>
-    <w:p>
-      <w:pPr>
-        <w:pStyle w:val="HTMLPreformatted"/>
-        <w:rPr>
-          <w:rStyle w:val="HTMLCode"/>
-        </w:rPr>
-      </w:pPr>
-      <w:r>
-        <w:rPr>
-          <w:rStyle w:val="HTMLCode"/>
-        </w:rPr>
-        <w:t xml:space="preserve">      }</w:t>
-      </w:r>
-    </w:p>
-    <w:p>
-      <w:pPr>
-        <w:pStyle w:val="HTMLPreformatted"/>
-        <w:rPr>
-          <w:rStyle w:val="HTMLCode"/>
-        </w:rPr>
-      </w:pPr>
-      <w:r>
-        <w:rPr>
-          <w:rStyle w:val="HTMLCode"/>
-        </w:rPr>
-        <w:t xml:space="preserve">    ]</w:t>
-      </w:r>
-    </w:p>
-    <w:p>
-      <w:pPr>
-        <w:pStyle w:val="HTMLPreformatted"/>
-        <w:rPr>
-          <w:rStyle w:val="HTMLCode"/>
-        </w:rPr>
-      </w:pPr>
-      <w:r>
-        <w:rPr>
-          <w:rStyle w:val="HTMLCode"/>
-        </w:rPr>
-        <w:t xml:space="preserve">  }</w:t>
-      </w:r>
-    </w:p>
-    <w:p>
-      <w:pPr>
-        <w:pStyle w:val="HTMLPreformatted"/>
-        <w:rPr>
-          <w:rStyle w:val="HTMLCode"/>
-        </w:rPr>
-      </w:pPr>
-      <w:r>
-        <w:rPr>
-          <w:rStyle w:val="HTMLCode"/>
-        </w:rPr>
-        <w:t>]</w:t>
-      </w:r>
-    </w:p>
-    <w:p>
-      <w:r>
-        <w:pict w14:anchorId="2455C738">
-          <v:rect id="_x0000_i1068" style="width:0;height:1.5pt" o:hralign="center" o:hrstd="t" o:hr="t" fillcolor="#a0a0a0" stroked="f"/>
-        </w:pict>
-      </w:r>
-    </w:p>
-    <w:p>
-      <w:pPr>
-        <w:pStyle w:val="Heading3"/>
-      </w:pPr>
-      <w:r>
-        <w:rPr>
-          <w:rFonts w:ascii="Segoe UI Emoji" w:hAnsi="Segoe UI Emoji" w:cs="Segoe UI Emoji"/>
-        </w:rPr>
-        <w:t>🗑️</w:t>
-      </w:r>
-      <w:r>
-        <w:t xml:space="preserve"> 3. Delete One Point Lessons</w:t>
-      </w:r>
-    </w:p>
-    <w:p>
-      <w:pPr>
-        <w:pStyle w:val="NormalWeb"/>
-      </w:pPr>
-      <w:r>
-        <w:rPr>
-          <w:rStyle w:val="Strong"/>
-        </w:rPr>
-        <w:t>Endpoint:</w:t>
-      </w:r>
-      <w:r>
-        <w:t xml:space="preserve"> </w:t>
-      </w:r>
-      <w:r>
-        <w:rPr>
-          <w:rStyle w:val="HTMLCode"/>
-        </w:rPr>
-        <w:t>DELETE /</w:t>
-      </w:r>
-      <w:r>
-        <w:br/>
-      </w:r>
-      <w:r>
-        <w:rPr>
-          <w:rStyle w:val="Strong"/>
-        </w:rPr>
-        <w:t>Description:</w:t>
-      </w:r>
-      <w:r>
-        <w:t xml:space="preserve"> Delete One Point Lessons by name or </w:t>
-      </w:r>
-      <w:proofErr w:type="spellStart"/>
-      <w:r>
-        <w:t>machineCode</w:t>
-      </w:r>
-      <w:proofErr w:type="spellEnd"/>
-      <w:r>
-        <w:t>.</w:t>
-      </w:r>
-    </w:p>
-    <w:p>
-      <w:pPr>
-        <w:pStyle w:val="Heading4"/>
-      </w:pPr>
-      <w:r>
-        <w:t>Request Body (JSON):</w:t>
-      </w:r>
-    </w:p>
-    <w:p>
-      <w:pPr>
-        <w:pStyle w:val="HTMLPreformatted"/>
-        <w:rPr>
-          <w:rStyle w:val="HTMLCode"/>
-        </w:rPr>
-      </w:pPr>
-      <w:r>
-        <w:rPr>
-          <w:rStyle w:val="HTMLCode"/>
-        </w:rPr>
-        <w:t>{</w:t>
-      </w:r>
-    </w:p>
-    <w:p>
-      <w:pPr>
-        <w:pStyle w:val="HTMLPreformatted"/>
-        <w:rPr>
-          <w:rStyle w:val="HTMLCode"/>
-        </w:rPr>
-      </w:pPr>
-      <w:r>
-        <w:rPr>
-          <w:rStyle w:val="HTMLCode"/>
-        </w:rPr>
-        <w:t xml:space="preserve">  "name": "OPL - Safety Instructions",</w:t>
-      </w:r>
-    </w:p>
-    <w:p>
-      <w:pPr>
-        <w:pStyle w:val="HTMLPreformatted"/>
-        <w:rPr>
-          <w:rStyle w:val="HTMLCode"/>
-        </w:rPr>
-      </w:pPr>
-      <w:r>
-        <w:rPr>
-          <w:rStyle w:val="HTMLCode"/>
-        </w:rPr>
-        <w:t xml:space="preserve">  "</w:t>
-      </w:r>
-      <w:proofErr w:type="spellStart"/>
-      <w:r>
-        <w:rPr>
-          <w:rStyle w:val="HTMLCode"/>
-        </w:rPr>
-        <w:t>machineCode</w:t>
-      </w:r>
-      <w:proofErr w:type="spellEnd"/>
-      <w:r>
-        <w:rPr>
-          <w:rStyle w:val="HTMLCode"/>
-        </w:rPr>
-        <w:t>": "MC1001"</w:t>
-      </w:r>
-    </w:p>
-    <w:p>
-      <w:pPr>
-        <w:pStyle w:val="HTMLPreformatted"/>
-        <w:rPr>
-          <w:rStyle w:val="HTMLCode"/>
-        </w:rPr>
-      </w:pPr>
-      <w:r>
-        <w:rPr>
-          <w:rStyle w:val="HTMLCode"/>
-        </w:rPr>
-        <w:t>}</w:t>
+        <w:t>Example using Postman:</w:t>
       </w:r>
     </w:p>
     <w:p>
@@ -1772,103 +596,27 @@
         <w:pStyle w:val="NormalWeb"/>
         <w:numPr>
           <w:ilvl w:val="0"/>
-          <w:numId w:val="10"/>
+          <w:numId w:val="15"/>
         </w:numPr>
       </w:pPr>
-      <w:r>
-        <w:t xml:space="preserve">Either </w:t>
-      </w:r>
-      <w:r>
-        <w:rPr>
-          <w:rStyle w:val="HTMLCode"/>
-        </w:rPr>
-        <w:t>name</w:t>
-      </w:r>
-      <w:r>
-        <w:t xml:space="preserve"> or </w:t>
-      </w:r>
       <w:proofErr w:type="spellStart"/>
       <w:r>
         <w:rPr>
           <w:rStyle w:val="HTMLCode"/>
-        </w:rPr>
-        <w:t>machineCode</w:t>
+          <w:rFonts w:eastAsiaTheme="majorEastAsia"/>
+        </w:rPr>
+        <w:t>stepNumbers</w:t>
       </w:r>
       <w:proofErr w:type="spellEnd"/>
       <w:r>
-        <w:t xml:space="preserve"> must be provided.</w:t>
-      </w:r>
-    </w:p>
-    <w:p>
-      <w:pPr>
-        <w:pStyle w:val="Heading4"/>
-      </w:pPr>
-      <w:r>
-        <w:lastRenderedPageBreak/>
-        <w:t>Response (200 OK)</w:t>
-      </w:r>
-    </w:p>
-    <w:p>
-      <w:pPr>
-        <w:pStyle w:val="HTMLPreformatted"/>
-        <w:rPr>
-          <w:rStyle w:val="HTMLCode"/>
-        </w:rPr>
-      </w:pPr>
-      <w:r>
-        <w:rPr>
-          <w:rStyle w:val="HTMLCode"/>
-        </w:rPr>
-        <w:t>{</w:t>
-      </w:r>
-    </w:p>
-    <w:p>
-      <w:pPr>
-        <w:pStyle w:val="HTMLPreformatted"/>
-        <w:rPr>
-          <w:rStyle w:val="HTMLCode"/>
-        </w:rPr>
-      </w:pPr>
-      <w:r>
-        <w:rPr>
-          <w:rStyle w:val="HTMLCode"/>
-        </w:rPr>
-        <w:t xml:space="preserve">  "message": "Lessons deleted"</w:t>
-      </w:r>
-    </w:p>
-    <w:p>
-      <w:pPr>
-        <w:pStyle w:val="HTMLPreformatted"/>
-        <w:rPr>
-          <w:rStyle w:val="HTMLCode"/>
-        </w:rPr>
-      </w:pPr>
-      <w:r>
-        <w:rPr>
-          <w:rStyle w:val="HTMLCode"/>
-        </w:rPr>
-        <w:t>}</w:t>
-      </w:r>
-    </w:p>
-    <w:p>
-      <w:r>
-        <w:pict w14:anchorId="09C86FF0">
-          <v:rect id="_x0000_i1069" style="width:0;height:1.5pt" o:hralign="center" o:hrstd="t" o:hr="t" fillcolor="#a0a0a0" stroked="f"/>
-        </w:pict>
-      </w:r>
-    </w:p>
-    <w:p>
-      <w:pPr>
-        <w:pStyle w:val="Heading2"/>
-      </w:pPr>
-      <w:r>
-        <w:rPr>
-          <w:rFonts w:ascii="Segoe UI Emoji" w:hAnsi="Segoe UI Emoji" w:cs="Segoe UI Emoji"/>
-        </w:rPr>
-        <w:t>📁</w:t>
-      </w:r>
-      <w:r>
-        <w:t xml:space="preserve"> Notes for Frontend</w:t>
+        <w:t xml:space="preserve">: </w:t>
+      </w:r>
+      <w:r>
+        <w:rPr>
+          <w:rStyle w:val="HTMLCode"/>
+          <w:rFonts w:eastAsiaTheme="majorEastAsia"/>
+        </w:rPr>
+        <w:t>["1","2"]</w:t>
       </w:r>
     </w:p>
     <w:p>
@@ -1876,53 +624,41 @@
         <w:pStyle w:val="NormalWeb"/>
         <w:numPr>
           <w:ilvl w:val="0"/>
-          <w:numId w:val="11"/>
+          <w:numId w:val="15"/>
         </w:numPr>
       </w:pPr>
       <w:r>
-        <w:t>Access uploaded images via:</w:t>
-      </w:r>
-    </w:p>
-    <w:p>
-      <w:pPr>
-        <w:pStyle w:val="HTMLPreformatted"/>
-        <w:numPr>
-          <w:ilvl w:val="0"/>
-          <w:numId w:val="11"/>
-        </w:numPr>
-        <w:tabs>
-          <w:tab w:val="clear" w:pos="720"/>
-        </w:tabs>
-        <w:rPr>
-          <w:rStyle w:val="HTMLCode"/>
-        </w:rPr>
-      </w:pPr>
-      <w:r>
-        <w:rPr>
-          <w:rStyle w:val="HTMLCode"/>
-        </w:rPr>
-        <w:t>http://&lt;your-server-ip&gt;:&lt;port&gt;/&lt;imagePath&gt;</w:t>
-      </w:r>
-    </w:p>
-    <w:p>
-      <w:pPr>
-        <w:pStyle w:val="HTMLPreformatted"/>
-        <w:numPr>
-          <w:ilvl w:val="0"/>
-          <w:numId w:val="11"/>
-        </w:numPr>
-        <w:tabs>
-          <w:tab w:val="clear" w:pos="720"/>
-        </w:tabs>
-        <w:rPr>
-          <w:rStyle w:val="HTMLCode"/>
-        </w:rPr>
-      </w:pPr>
-      <w:r>
-        <w:rPr>
-          <w:rStyle w:val="HTMLCode"/>
-        </w:rPr>
-        <w:t>e.g., http://localhost:5000/uploads/onepointlesson2p0/1717571002_shutdown.jpg</w:t>
+        <w:rPr>
+          <w:rStyle w:val="HTMLCode"/>
+          <w:rFonts w:eastAsiaTheme="majorEastAsia"/>
+        </w:rPr>
+        <w:t>descriptions</w:t>
+      </w:r>
+      <w:r>
+        <w:t xml:space="preserve">: </w:t>
+      </w:r>
+      <w:r>
+        <w:rPr>
+          <w:rStyle w:val="HTMLCode"/>
+          <w:rFonts w:eastAsiaTheme="majorEastAsia"/>
+        </w:rPr>
+        <w:t xml:space="preserve">["Turn off </w:t>
+      </w:r>
+      <w:proofErr w:type="spellStart"/>
+      <w:r>
+        <w:rPr>
+          <w:rStyle w:val="HTMLCode"/>
+          <w:rFonts w:eastAsiaTheme="majorEastAsia"/>
+        </w:rPr>
+        <w:t>power","Check</w:t>
+      </w:r>
+      <w:proofErr w:type="spellEnd"/>
+      <w:r>
+        <w:rPr>
+          <w:rStyle w:val="HTMLCode"/>
+          <w:rFonts w:eastAsiaTheme="majorEastAsia"/>
+        </w:rPr>
+        <w:t xml:space="preserve"> screw"]</w:t>
       </w:r>
     </w:p>
     <w:p>
@@ -1930,22 +666,909 @@
         <w:pStyle w:val="NormalWeb"/>
         <w:numPr>
           <w:ilvl w:val="0"/>
-          <w:numId w:val="11"/>
+          <w:numId w:val="15"/>
         </w:numPr>
       </w:pPr>
       <w:r>
-        <w:t xml:space="preserve">Image preview: Use the </w:t>
+        <w:rPr>
+          <w:rStyle w:val="HTMLCode"/>
+          <w:rFonts w:eastAsiaTheme="majorEastAsia"/>
+        </w:rPr>
+        <w:t>images</w:t>
+      </w:r>
+      <w:r>
+        <w:t>: Upload 2 image files (same order as steps)</w:t>
+      </w:r>
+    </w:p>
+    <w:p>
+      <w:pPr>
+        <w:pStyle w:val="Heading4"/>
+      </w:pPr>
+      <w:r>
+        <w:t>Response:</w:t>
+      </w:r>
+    </w:p>
+    <w:p>
+      <w:pPr>
+        <w:pStyle w:val="HTMLPreformatted"/>
+        <w:rPr>
+          <w:rStyle w:val="HTMLCode"/>
+          <w:rFonts w:eastAsiaTheme="majorEastAsia"/>
+        </w:rPr>
+      </w:pPr>
+      <w:r>
+        <w:rPr>
+          <w:rStyle w:val="HTMLCode"/>
+          <w:rFonts w:eastAsiaTheme="majorEastAsia"/>
+        </w:rPr>
+        <w:t>{</w:t>
+      </w:r>
+    </w:p>
+    <w:p>
+      <w:pPr>
+        <w:pStyle w:val="HTMLPreformatted"/>
+        <w:rPr>
+          <w:rStyle w:val="HTMLCode"/>
+          <w:rFonts w:eastAsiaTheme="majorEastAsia"/>
+        </w:rPr>
+      </w:pPr>
+      <w:r>
+        <w:rPr>
+          <w:rStyle w:val="HTMLCode"/>
+          <w:rFonts w:eastAsiaTheme="majorEastAsia"/>
+        </w:rPr>
+        <w:t xml:space="preserve">  "message": "</w:t>
+      </w:r>
+      <w:r>
+        <w:rPr>
+          <w:rStyle w:val="HTMLCode"/>
+          <w:rFonts w:ascii="Segoe UI Emoji" w:eastAsiaTheme="majorEastAsia" w:hAnsi="Segoe UI Emoji" w:cs="Segoe UI Emoji"/>
+        </w:rPr>
+        <w:t>✅</w:t>
+      </w:r>
+      <w:r>
+        <w:rPr>
+          <w:rStyle w:val="HTMLCode"/>
+          <w:rFonts w:eastAsiaTheme="majorEastAsia"/>
+        </w:rPr>
+        <w:t xml:space="preserve"> Steps uploaded successfully",</w:t>
+      </w:r>
+    </w:p>
+    <w:p>
+      <w:pPr>
+        <w:pStyle w:val="HTMLPreformatted"/>
+        <w:rPr>
+          <w:rStyle w:val="HTMLCode"/>
+          <w:rFonts w:eastAsiaTheme="majorEastAsia"/>
+        </w:rPr>
+      </w:pPr>
+      <w:r>
+        <w:rPr>
+          <w:rStyle w:val="HTMLCode"/>
+          <w:rFonts w:eastAsiaTheme="majorEastAsia"/>
+        </w:rPr>
+        <w:t xml:space="preserve">  "steps": [ </w:t>
+      </w:r>
+      <w:proofErr w:type="gramStart"/>
+      <w:r>
+        <w:rPr>
+          <w:rStyle w:val="HTMLCode"/>
+          <w:rFonts w:eastAsiaTheme="majorEastAsia"/>
+        </w:rPr>
+        <w:t>{ ...</w:t>
+      </w:r>
+      <w:proofErr w:type="gramEnd"/>
+      <w:r>
+        <w:rPr>
+          <w:rStyle w:val="HTMLCode"/>
+          <w:rFonts w:eastAsiaTheme="majorEastAsia"/>
+        </w:rPr>
+        <w:t>stepObj1 }, { ...stepObj2 } ]</w:t>
+      </w:r>
+    </w:p>
+    <w:p>
+      <w:pPr>
+        <w:pStyle w:val="HTMLPreformatted"/>
+        <w:rPr>
+          <w:rStyle w:val="HTMLCode"/>
+          <w:rFonts w:eastAsiaTheme="majorEastAsia"/>
+        </w:rPr>
+      </w:pPr>
+      <w:r>
+        <w:rPr>
+          <w:rStyle w:val="HTMLCode"/>
+          <w:rFonts w:eastAsiaTheme="majorEastAsia"/>
+        </w:rPr>
+        <w:t>}</w:t>
+      </w:r>
+    </w:p>
+    <w:p>
+      <w:r>
+        <w:pict w14:anchorId="717CB071">
+          <v:rect id="_x0000_i1043" style="width:0;height:1.5pt" o:hralign="center" o:hrstd="t" o:hr="t" fillcolor="#a0a0a0" stroked="f"/>
+        </w:pict>
+      </w:r>
+    </w:p>
+    <w:p>
+      <w:pPr>
+        <w:pStyle w:val="Heading3"/>
+      </w:pPr>
+      <w:r>
+        <w:rPr>
+          <w:rFonts w:ascii="Segoe UI Emoji" w:hAnsi="Segoe UI Emoji" w:cs="Segoe UI Emoji"/>
+        </w:rPr>
+        <w:t>📥</w:t>
+      </w:r>
+      <w:r>
+        <w:t xml:space="preserve"> 2. Get All Steps for a Machine</w:t>
+      </w:r>
+    </w:p>
+    <w:p>
+      <w:pPr>
+        <w:pStyle w:val="NormalWeb"/>
+      </w:pPr>
+      <w:r>
+        <w:rPr>
+          <w:rStyle w:val="Strong"/>
+        </w:rPr>
+        <w:t>GET</w:t>
+      </w:r>
+      <w:r>
+        <w:t xml:space="preserve"> </w:t>
+      </w:r>
+      <w:proofErr w:type="gramStart"/>
+      <w:r>
+        <w:rPr>
+          <w:rStyle w:val="HTMLCode"/>
+          <w:rFonts w:eastAsiaTheme="majorEastAsia"/>
+        </w:rPr>
+        <w:t>/:</w:t>
       </w:r>
       <w:proofErr w:type="spellStart"/>
       <w:r>
         <w:rPr>
           <w:rStyle w:val="HTMLCode"/>
+          <w:rFonts w:eastAsiaTheme="majorEastAsia"/>
+        </w:rPr>
+        <w:t>machineCode</w:t>
+      </w:r>
+      <w:proofErr w:type="spellEnd"/>
+      <w:proofErr w:type="gramEnd"/>
+      <w:r>
+        <w:br/>
+        <w:t>Fetch all OPL steps for a given machine code.</w:t>
+      </w:r>
+    </w:p>
+    <w:p>
+      <w:pPr>
+        <w:pStyle w:val="Heading4"/>
+      </w:pPr>
+      <w:r>
+        <w:lastRenderedPageBreak/>
+        <w:t>Example:</w:t>
+      </w:r>
+    </w:p>
+    <w:p>
+      <w:pPr>
+        <w:pStyle w:val="HTMLPreformatted"/>
+        <w:rPr>
+          <w:rStyle w:val="HTMLCode"/>
+          <w:rFonts w:eastAsiaTheme="majorEastAsia"/>
+        </w:rPr>
+      </w:pPr>
+      <w:r>
+        <w:rPr>
+          <w:rStyle w:val="HTMLCode"/>
+          <w:rFonts w:eastAsiaTheme="majorEastAsia"/>
+        </w:rPr>
+        <w:t>GET /</w:t>
+      </w:r>
+      <w:proofErr w:type="spellStart"/>
+      <w:r>
+        <w:rPr>
+          <w:rStyle w:val="HTMLCode"/>
+          <w:rFonts w:eastAsiaTheme="majorEastAsia"/>
+        </w:rPr>
+        <w:t>api</w:t>
+      </w:r>
+      <w:proofErr w:type="spellEnd"/>
+      <w:r>
+        <w:rPr>
+          <w:rStyle w:val="HTMLCode"/>
+          <w:rFonts w:eastAsiaTheme="majorEastAsia"/>
+        </w:rPr>
+        <w:t>/onepointlesson2p0/MAC123</w:t>
+      </w:r>
+    </w:p>
+    <w:p>
+      <w:pPr>
+        <w:pStyle w:val="Heading4"/>
+      </w:pPr>
+      <w:r>
+        <w:t>Response:</w:t>
+      </w:r>
+    </w:p>
+    <w:p>
+      <w:pPr>
+        <w:pStyle w:val="HTMLPreformatted"/>
+        <w:rPr>
+          <w:rStyle w:val="HTMLCode"/>
+          <w:rFonts w:eastAsiaTheme="majorEastAsia"/>
+        </w:rPr>
+      </w:pPr>
+      <w:r>
+        <w:rPr>
+          <w:rStyle w:val="HTMLCode"/>
+          <w:rFonts w:eastAsiaTheme="majorEastAsia"/>
+        </w:rPr>
+        <w:t>[</w:t>
+      </w:r>
+    </w:p>
+    <w:p>
+      <w:pPr>
+        <w:pStyle w:val="HTMLPreformatted"/>
+        <w:rPr>
+          <w:rStyle w:val="HTMLCode"/>
+          <w:rFonts w:eastAsiaTheme="majorEastAsia"/>
+        </w:rPr>
+      </w:pPr>
+      <w:r>
+        <w:rPr>
+          <w:rStyle w:val="HTMLCode"/>
+          <w:rFonts w:eastAsiaTheme="majorEastAsia"/>
+        </w:rPr>
+        <w:t xml:space="preserve">  {</w:t>
+      </w:r>
+    </w:p>
+    <w:p>
+      <w:pPr>
+        <w:pStyle w:val="HTMLPreformatted"/>
+        <w:rPr>
+          <w:rStyle w:val="HTMLCode"/>
+          <w:rFonts w:eastAsiaTheme="majorEastAsia"/>
+        </w:rPr>
+      </w:pPr>
+      <w:r>
+        <w:rPr>
+          <w:rStyle w:val="HTMLCode"/>
+          <w:rFonts w:eastAsiaTheme="majorEastAsia"/>
+        </w:rPr>
+        <w:t xml:space="preserve">    "_id": "665f4b...",</w:t>
+      </w:r>
+    </w:p>
+    <w:p>
+      <w:pPr>
+        <w:pStyle w:val="HTMLPreformatted"/>
+        <w:rPr>
+          <w:rStyle w:val="HTMLCode"/>
+          <w:rFonts w:eastAsiaTheme="majorEastAsia"/>
+        </w:rPr>
+      </w:pPr>
+      <w:r>
+        <w:rPr>
+          <w:rStyle w:val="HTMLCode"/>
+          <w:rFonts w:eastAsiaTheme="majorEastAsia"/>
+        </w:rPr>
+        <w:t xml:space="preserve">    "</w:t>
+      </w:r>
+      <w:proofErr w:type="spellStart"/>
+      <w:r>
+        <w:rPr>
+          <w:rStyle w:val="HTMLCode"/>
+          <w:rFonts w:eastAsiaTheme="majorEastAsia"/>
+        </w:rPr>
+        <w:t>lessonName</w:t>
+      </w:r>
+      <w:proofErr w:type="spellEnd"/>
+      <w:r>
+        <w:rPr>
+          <w:rStyle w:val="HTMLCode"/>
+          <w:rFonts w:eastAsiaTheme="majorEastAsia"/>
+        </w:rPr>
+        <w:t>": "Safety Check",</w:t>
+      </w:r>
+    </w:p>
+    <w:p>
+      <w:pPr>
+        <w:pStyle w:val="HTMLPreformatted"/>
+        <w:rPr>
+          <w:rStyle w:val="HTMLCode"/>
+          <w:rFonts w:eastAsiaTheme="majorEastAsia"/>
+        </w:rPr>
+      </w:pPr>
+      <w:r>
+        <w:rPr>
+          <w:rStyle w:val="HTMLCode"/>
+          <w:rFonts w:eastAsiaTheme="majorEastAsia"/>
+        </w:rPr>
+        <w:t xml:space="preserve">    "</w:t>
+      </w:r>
+      <w:proofErr w:type="spellStart"/>
+      <w:r>
+        <w:rPr>
+          <w:rStyle w:val="HTMLCode"/>
+          <w:rFonts w:eastAsiaTheme="majorEastAsia"/>
+        </w:rPr>
+        <w:t>machineCode</w:t>
+      </w:r>
+      <w:proofErr w:type="spellEnd"/>
+      <w:r>
+        <w:rPr>
+          <w:rStyle w:val="HTMLCode"/>
+          <w:rFonts w:eastAsiaTheme="majorEastAsia"/>
+        </w:rPr>
+        <w:t>": "MAC123",</w:t>
+      </w:r>
+    </w:p>
+    <w:p>
+      <w:pPr>
+        <w:pStyle w:val="HTMLPreformatted"/>
+        <w:rPr>
+          <w:rStyle w:val="HTMLCode"/>
+          <w:rFonts w:eastAsiaTheme="majorEastAsia"/>
+        </w:rPr>
+      </w:pPr>
+      <w:r>
+        <w:rPr>
+          <w:rStyle w:val="HTMLCode"/>
+          <w:rFonts w:eastAsiaTheme="majorEastAsia"/>
+        </w:rPr>
+        <w:t xml:space="preserve">    "</w:t>
+      </w:r>
+      <w:proofErr w:type="spellStart"/>
+      <w:r>
+        <w:rPr>
+          <w:rStyle w:val="HTMLCode"/>
+          <w:rFonts w:eastAsiaTheme="majorEastAsia"/>
+        </w:rPr>
+        <w:t>stepNumber</w:t>
+      </w:r>
+      <w:proofErr w:type="spellEnd"/>
+      <w:r>
+        <w:rPr>
+          <w:rStyle w:val="HTMLCode"/>
+          <w:rFonts w:eastAsiaTheme="majorEastAsia"/>
+        </w:rPr>
+        <w:t>": 1,</w:t>
+      </w:r>
+    </w:p>
+    <w:p>
+      <w:pPr>
+        <w:pStyle w:val="HTMLPreformatted"/>
+        <w:rPr>
+          <w:rStyle w:val="HTMLCode"/>
+          <w:rFonts w:eastAsiaTheme="majorEastAsia"/>
+        </w:rPr>
+      </w:pPr>
+      <w:r>
+        <w:rPr>
+          <w:rStyle w:val="HTMLCode"/>
+          <w:rFonts w:eastAsiaTheme="majorEastAsia"/>
+        </w:rPr>
+        <w:t xml:space="preserve">    "description": "Turn off the switch",</w:t>
+      </w:r>
+    </w:p>
+    <w:p>
+      <w:pPr>
+        <w:pStyle w:val="HTMLPreformatted"/>
+        <w:rPr>
+          <w:rStyle w:val="HTMLCode"/>
+          <w:rFonts w:eastAsiaTheme="majorEastAsia"/>
+        </w:rPr>
+      </w:pPr>
+      <w:r>
+        <w:rPr>
+          <w:rStyle w:val="HTMLCode"/>
+          <w:rFonts w:eastAsiaTheme="majorEastAsia"/>
+        </w:rPr>
+        <w:t xml:space="preserve">    "</w:t>
+      </w:r>
+      <w:proofErr w:type="spellStart"/>
+      <w:r>
+        <w:rPr>
+          <w:rStyle w:val="HTMLCode"/>
+          <w:rFonts w:eastAsiaTheme="majorEastAsia"/>
         </w:rPr>
         <w:t>imagePath</w:t>
       </w:r>
       <w:proofErr w:type="spellEnd"/>
       <w:r>
-        <w:t xml:space="preserve"> field to display lesson step images in the frontend.</w:t>
+        <w:rPr>
+          <w:rStyle w:val="HTMLCode"/>
+          <w:rFonts w:eastAsiaTheme="majorEastAsia"/>
+        </w:rPr>
+        <w:t>": "uploads/onepointlesson2p0/...",</w:t>
+      </w:r>
+    </w:p>
+    <w:p>
+      <w:pPr>
+        <w:pStyle w:val="HTMLPreformatted"/>
+        <w:rPr>
+          <w:rStyle w:val="HTMLCode"/>
+          <w:rFonts w:eastAsiaTheme="majorEastAsia"/>
+        </w:rPr>
+      </w:pPr>
+      <w:r>
+        <w:rPr>
+          <w:rStyle w:val="HTMLCode"/>
+          <w:rFonts w:eastAsiaTheme="majorEastAsia"/>
+        </w:rPr>
+        <w:t xml:space="preserve">    ...</w:t>
+      </w:r>
+    </w:p>
+    <w:p>
+      <w:pPr>
+        <w:pStyle w:val="HTMLPreformatted"/>
+        <w:rPr>
+          <w:rStyle w:val="HTMLCode"/>
+          <w:rFonts w:eastAsiaTheme="majorEastAsia"/>
+        </w:rPr>
+      </w:pPr>
+      <w:r>
+        <w:rPr>
+          <w:rStyle w:val="HTMLCode"/>
+          <w:rFonts w:eastAsiaTheme="majorEastAsia"/>
+        </w:rPr>
+        <w:t xml:space="preserve">  },</w:t>
+      </w:r>
+    </w:p>
+    <w:p>
+      <w:pPr>
+        <w:pStyle w:val="HTMLPreformatted"/>
+        <w:rPr>
+          <w:rStyle w:val="HTMLCode"/>
+          <w:rFonts w:eastAsiaTheme="majorEastAsia"/>
+        </w:rPr>
+      </w:pPr>
+      <w:r>
+        <w:rPr>
+          <w:rStyle w:val="HTMLCode"/>
+          <w:rFonts w:eastAsiaTheme="majorEastAsia"/>
+        </w:rPr>
+        <w:t xml:space="preserve">  ...</w:t>
+      </w:r>
+    </w:p>
+    <w:p>
+      <w:pPr>
+        <w:pStyle w:val="HTMLPreformatted"/>
+        <w:rPr>
+          <w:rStyle w:val="HTMLCode"/>
+          <w:rFonts w:eastAsiaTheme="majorEastAsia"/>
+        </w:rPr>
+      </w:pPr>
+      <w:r>
+        <w:rPr>
+          <w:rStyle w:val="HTMLCode"/>
+          <w:rFonts w:eastAsiaTheme="majorEastAsia"/>
+        </w:rPr>
+        <w:t>]</w:t>
+      </w:r>
+    </w:p>
+    <w:p>
+      <w:r>
+        <w:pict w14:anchorId="5789CC98">
+          <v:rect id="_x0000_i1044" style="width:0;height:1.5pt" o:hralign="center" o:hrstd="t" o:hr="t" fillcolor="#a0a0a0" stroked="f"/>
+        </w:pict>
+      </w:r>
+    </w:p>
+    <w:p>
+      <w:pPr>
+        <w:pStyle w:val="Heading3"/>
+      </w:pPr>
+      <w:r>
+        <w:rPr>
+          <w:rFonts w:ascii="Segoe UI Emoji" w:hAnsi="Segoe UI Emoji" w:cs="Segoe UI Emoji"/>
+        </w:rPr>
+        <w:t>🗑️</w:t>
+      </w:r>
+      <w:r>
+        <w:t xml:space="preserve"> 3. Delete a Step by ID</w:t>
+      </w:r>
+    </w:p>
+    <w:p>
+      <w:pPr>
+        <w:pStyle w:val="NormalWeb"/>
+      </w:pPr>
+      <w:r>
+        <w:rPr>
+          <w:rStyle w:val="Strong"/>
+        </w:rPr>
+        <w:t>DELETE</w:t>
+      </w:r>
+      <w:r>
+        <w:t xml:space="preserve"> </w:t>
+      </w:r>
+      <w:r>
+        <w:rPr>
+          <w:rStyle w:val="HTMLCode"/>
+          <w:rFonts w:eastAsiaTheme="majorEastAsia"/>
+        </w:rPr>
+        <w:t>/step/:id</w:t>
+      </w:r>
+      <w:r>
+        <w:br/>
+        <w:t xml:space="preserve">Deletes a single step based on its MongoDB </w:t>
+      </w:r>
+      <w:r>
+        <w:rPr>
+          <w:rStyle w:val="HTMLCode"/>
+          <w:rFonts w:eastAsiaTheme="majorEastAsia"/>
+        </w:rPr>
+        <w:t>_id</w:t>
+      </w:r>
+      <w:r>
+        <w:t>.</w:t>
+      </w:r>
+    </w:p>
+    <w:p>
+      <w:pPr>
+        <w:pStyle w:val="Heading4"/>
+      </w:pPr>
+      <w:r>
+        <w:t>Example:</w:t>
+      </w:r>
+    </w:p>
+    <w:p>
+      <w:pPr>
+        <w:pStyle w:val="HTMLPreformatted"/>
+        <w:rPr>
+          <w:rStyle w:val="HTMLCode"/>
+          <w:rFonts w:eastAsiaTheme="majorEastAsia"/>
+        </w:rPr>
+      </w:pPr>
+      <w:r>
+        <w:rPr>
+          <w:rStyle w:val="HTMLCode"/>
+          <w:rFonts w:eastAsiaTheme="majorEastAsia"/>
+        </w:rPr>
+        <w:t>DELETE /</w:t>
+      </w:r>
+      <w:proofErr w:type="spellStart"/>
+      <w:r>
+        <w:rPr>
+          <w:rStyle w:val="HTMLCode"/>
+          <w:rFonts w:eastAsiaTheme="majorEastAsia"/>
+        </w:rPr>
+        <w:t>api</w:t>
+      </w:r>
+      <w:proofErr w:type="spellEnd"/>
+      <w:r>
+        <w:rPr>
+          <w:rStyle w:val="HTMLCode"/>
+          <w:rFonts w:eastAsiaTheme="majorEastAsia"/>
+        </w:rPr>
+        <w:t>/onepointlesson2p0/step/665f4b10e1...</w:t>
+      </w:r>
+    </w:p>
+    <w:p>
+      <w:pPr>
+        <w:pStyle w:val="Heading4"/>
+      </w:pPr>
+      <w:r>
+        <w:t>Response:</w:t>
+      </w:r>
+    </w:p>
+    <w:p>
+      <w:pPr>
+        <w:pStyle w:val="HTMLPreformatted"/>
+        <w:rPr>
+          <w:rStyle w:val="HTMLCode"/>
+          <w:rFonts w:eastAsiaTheme="majorEastAsia"/>
+        </w:rPr>
+      </w:pPr>
+      <w:r>
+        <w:rPr>
+          <w:rStyle w:val="HTMLCode"/>
+          <w:rFonts w:eastAsiaTheme="majorEastAsia"/>
+        </w:rPr>
+        <w:t>{</w:t>
+      </w:r>
+    </w:p>
+    <w:p>
+      <w:pPr>
+        <w:pStyle w:val="HTMLPreformatted"/>
+        <w:rPr>
+          <w:rStyle w:val="HTMLCode"/>
+          <w:rFonts w:eastAsiaTheme="majorEastAsia"/>
+        </w:rPr>
+      </w:pPr>
+      <w:r>
+        <w:rPr>
+          <w:rStyle w:val="HTMLCode"/>
+          <w:rFonts w:eastAsiaTheme="majorEastAsia"/>
+        </w:rPr>
+        <w:t xml:space="preserve">  "message": "</w:t>
+      </w:r>
+      <w:r>
+        <w:rPr>
+          <w:rStyle w:val="HTMLCode"/>
+          <w:rFonts w:ascii="Segoe UI Emoji" w:eastAsiaTheme="majorEastAsia" w:hAnsi="Segoe UI Emoji" w:cs="Segoe UI Emoji"/>
+        </w:rPr>
+        <w:t>✅</w:t>
+      </w:r>
+      <w:r>
+        <w:rPr>
+          <w:rStyle w:val="HTMLCode"/>
+          <w:rFonts w:eastAsiaTheme="majorEastAsia"/>
+        </w:rPr>
+        <w:t xml:space="preserve"> Step deleted",</w:t>
+      </w:r>
+    </w:p>
+    <w:p>
+      <w:pPr>
+        <w:pStyle w:val="HTMLPreformatted"/>
+        <w:rPr>
+          <w:rStyle w:val="HTMLCode"/>
+          <w:rFonts w:eastAsiaTheme="majorEastAsia"/>
+        </w:rPr>
+      </w:pPr>
+      <w:r>
+        <w:rPr>
+          <w:rStyle w:val="HTMLCode"/>
+          <w:rFonts w:eastAsiaTheme="majorEastAsia"/>
+        </w:rPr>
+        <w:t xml:space="preserve">  "step": </w:t>
+      </w:r>
+      <w:proofErr w:type="gramStart"/>
+      <w:r>
+        <w:rPr>
+          <w:rStyle w:val="HTMLCode"/>
+          <w:rFonts w:eastAsiaTheme="majorEastAsia"/>
+        </w:rPr>
+        <w:t>{ ...</w:t>
+      </w:r>
+      <w:proofErr w:type="spellStart"/>
+      <w:proofErr w:type="gramEnd"/>
+      <w:r>
+        <w:rPr>
+          <w:rStyle w:val="HTMLCode"/>
+          <w:rFonts w:eastAsiaTheme="majorEastAsia"/>
+        </w:rPr>
+        <w:t>deletedStep</w:t>
+      </w:r>
+      <w:proofErr w:type="spellEnd"/>
+      <w:r>
+        <w:rPr>
+          <w:rStyle w:val="HTMLCode"/>
+          <w:rFonts w:eastAsiaTheme="majorEastAsia"/>
+        </w:rPr>
+        <w:t xml:space="preserve"> }</w:t>
+      </w:r>
+    </w:p>
+    <w:p>
+      <w:pPr>
+        <w:pStyle w:val="HTMLPreformatted"/>
+        <w:rPr>
+          <w:rStyle w:val="HTMLCode"/>
+          <w:rFonts w:eastAsiaTheme="majorEastAsia"/>
+        </w:rPr>
+      </w:pPr>
+      <w:r>
+        <w:rPr>
+          <w:rStyle w:val="HTMLCode"/>
+          <w:rFonts w:eastAsiaTheme="majorEastAsia"/>
+        </w:rPr>
+        <w:t>}</w:t>
+      </w:r>
+    </w:p>
+    <w:p>
+      <w:r>
+        <w:pict w14:anchorId="5C7AD2A3">
+          <v:rect id="_x0000_i1045" style="width:0;height:1.5pt" o:hralign="center" o:hrstd="t" o:hr="t" fillcolor="#a0a0a0" stroked="f"/>
+        </w:pict>
+      </w:r>
+    </w:p>
+    <w:p>
+      <w:pPr>
+        <w:pStyle w:val="Heading3"/>
+      </w:pPr>
+      <w:r>
+        <w:rPr>
+          <w:rFonts w:ascii="Segoe UI Emoji" w:hAnsi="Segoe UI Emoji" w:cs="Segoe UI Emoji"/>
+        </w:rPr>
+        <w:t>🗑️</w:t>
+      </w:r>
+      <w:r>
+        <w:t xml:space="preserve"> 4. Delete All Steps for a Machine</w:t>
+      </w:r>
+    </w:p>
+    <w:p>
+      <w:pPr>
+        <w:pStyle w:val="NormalWeb"/>
+      </w:pPr>
+      <w:r>
+        <w:rPr>
+          <w:rStyle w:val="Strong"/>
+        </w:rPr>
+        <w:t>DELETE</w:t>
+      </w:r>
+      <w:r>
+        <w:t xml:space="preserve"> </w:t>
+      </w:r>
+      <w:r>
+        <w:rPr>
+          <w:rStyle w:val="HTMLCode"/>
+          <w:rFonts w:eastAsiaTheme="majorEastAsia"/>
+        </w:rPr>
+        <w:t>/all</w:t>
+      </w:r>
+      <w:proofErr w:type="gramStart"/>
+      <w:r>
+        <w:rPr>
+          <w:rStyle w:val="HTMLCode"/>
+          <w:rFonts w:eastAsiaTheme="majorEastAsia"/>
+        </w:rPr>
+        <w:t>/:</w:t>
+      </w:r>
+      <w:proofErr w:type="spellStart"/>
+      <w:r>
+        <w:rPr>
+          <w:rStyle w:val="HTMLCode"/>
+          <w:rFonts w:eastAsiaTheme="majorEastAsia"/>
+        </w:rPr>
+        <w:t>machineCode</w:t>
+      </w:r>
+      <w:proofErr w:type="spellEnd"/>
+      <w:proofErr w:type="gramEnd"/>
+      <w:r>
+        <w:br/>
+        <w:t xml:space="preserve">Delete </w:t>
+      </w:r>
+      <w:r>
+        <w:rPr>
+          <w:rStyle w:val="Strong"/>
+        </w:rPr>
+        <w:t>all steps</w:t>
+      </w:r>
+      <w:r>
+        <w:t xml:space="preserve"> for a particular machine.</w:t>
+      </w:r>
+    </w:p>
+    <w:p>
+      <w:pPr>
+        <w:pStyle w:val="Heading4"/>
+      </w:pPr>
+      <w:r>
+        <w:t>Example:</w:t>
+      </w:r>
+    </w:p>
+    <w:p>
+      <w:pPr>
+        <w:pStyle w:val="HTMLPreformatted"/>
+        <w:rPr>
+          <w:rStyle w:val="HTMLCode"/>
+          <w:rFonts w:eastAsiaTheme="majorEastAsia"/>
+        </w:rPr>
+      </w:pPr>
+      <w:r>
+        <w:rPr>
+          <w:rStyle w:val="HTMLCode"/>
+          <w:rFonts w:eastAsiaTheme="majorEastAsia"/>
+        </w:rPr>
+        <w:t>DELETE /</w:t>
+      </w:r>
+      <w:proofErr w:type="spellStart"/>
+      <w:r>
+        <w:rPr>
+          <w:rStyle w:val="HTMLCode"/>
+          <w:rFonts w:eastAsiaTheme="majorEastAsia"/>
+        </w:rPr>
+        <w:t>api</w:t>
+      </w:r>
+      <w:proofErr w:type="spellEnd"/>
+      <w:r>
+        <w:rPr>
+          <w:rStyle w:val="HTMLCode"/>
+          <w:rFonts w:eastAsiaTheme="majorEastAsia"/>
+        </w:rPr>
+        <w:t>/onepointlesson2p0/all/MAC123</w:t>
+      </w:r>
+    </w:p>
+    <w:p>
+      <w:pPr>
+        <w:pStyle w:val="Heading4"/>
+      </w:pPr>
+      <w:r>
+        <w:t>Response:</w:t>
+      </w:r>
+    </w:p>
+    <w:p>
+      <w:pPr>
+        <w:pStyle w:val="HTMLPreformatted"/>
+        <w:rPr>
+          <w:rStyle w:val="HTMLCode"/>
+          <w:rFonts w:eastAsiaTheme="majorEastAsia"/>
+        </w:rPr>
+      </w:pPr>
+      <w:r>
+        <w:rPr>
+          <w:rStyle w:val="HTMLCode"/>
+          <w:rFonts w:eastAsiaTheme="majorEastAsia"/>
+        </w:rPr>
+        <w:t>{</w:t>
+      </w:r>
+    </w:p>
+    <w:p>
+      <w:pPr>
+        <w:pStyle w:val="HTMLPreformatted"/>
+        <w:rPr>
+          <w:rStyle w:val="HTMLCode"/>
+          <w:rFonts w:eastAsiaTheme="majorEastAsia"/>
+        </w:rPr>
+      </w:pPr>
+      <w:r>
+        <w:rPr>
+          <w:rStyle w:val="HTMLCode"/>
+          <w:rFonts w:eastAsiaTheme="majorEastAsia"/>
+        </w:rPr>
+        <w:t xml:space="preserve">  "message": "</w:t>
+      </w:r>
+      <w:r>
+        <w:rPr>
+          <w:rStyle w:val="HTMLCode"/>
+          <w:rFonts w:ascii="Segoe UI Emoji" w:eastAsiaTheme="majorEastAsia" w:hAnsi="Segoe UI Emoji" w:cs="Segoe UI Emoji"/>
+        </w:rPr>
+        <w:t>✅</w:t>
+      </w:r>
+      <w:r>
+        <w:rPr>
+          <w:rStyle w:val="HTMLCode"/>
+          <w:rFonts w:eastAsiaTheme="majorEastAsia"/>
+        </w:rPr>
+        <w:t xml:space="preserve"> Deleted 6 steps for </w:t>
+      </w:r>
+      <w:proofErr w:type="spellStart"/>
+      <w:r>
+        <w:rPr>
+          <w:rStyle w:val="HTMLCode"/>
+          <w:rFonts w:eastAsiaTheme="majorEastAsia"/>
+        </w:rPr>
+        <w:t>machineCode</w:t>
+      </w:r>
+      <w:proofErr w:type="spellEnd"/>
+      <w:r>
+        <w:rPr>
+          <w:rStyle w:val="HTMLCode"/>
+          <w:rFonts w:eastAsiaTheme="majorEastAsia"/>
+        </w:rPr>
+        <w:t xml:space="preserve"> MAC123"</w:t>
+      </w:r>
+    </w:p>
+    <w:p>
+      <w:pPr>
+        <w:pStyle w:val="HTMLPreformatted"/>
+        <w:rPr>
+          <w:rStyle w:val="HTMLCode"/>
+          <w:rFonts w:eastAsiaTheme="majorEastAsia"/>
+        </w:rPr>
+      </w:pPr>
+      <w:r>
+        <w:rPr>
+          <w:rStyle w:val="HTMLCode"/>
+          <w:rFonts w:eastAsiaTheme="majorEastAsia"/>
+        </w:rPr>
+        <w:t>}</w:t>
+      </w:r>
+    </w:p>
+    <w:p>
+      <w:r>
+        <w:pict w14:anchorId="6EEF94DF">
+          <v:rect id="_x0000_i1046" style="width:0;height:1.5pt" o:hralign="center" o:hrstd="t" o:hr="t" fillcolor="#a0a0a0" stroked="f"/>
+        </w:pict>
+      </w:r>
+    </w:p>
+    <w:p>
+      <w:pPr>
+        <w:pStyle w:val="Heading2"/>
+      </w:pPr>
+      <w:r>
+        <w:rPr>
+          <w:rFonts w:ascii="Segoe UI Emoji" w:hAnsi="Segoe UI Emoji" w:cs="Segoe UI Emoji"/>
+        </w:rPr>
+        <w:t>📝</w:t>
+      </w:r>
+      <w:r>
+        <w:t xml:space="preserve"> Notes:</w:t>
       </w:r>
     </w:p>
     <w:p>
@@ -1953,75 +1576,123 @@
         <w:pStyle w:val="NormalWeb"/>
         <w:numPr>
           <w:ilvl w:val="0"/>
-          <w:numId w:val="11"/>
+          <w:numId w:val="16"/>
         </w:numPr>
       </w:pPr>
       <w:r>
-        <w:t xml:space="preserve">Each lesson has an array of </w:t>
-      </w:r>
-      <w:r>
-        <w:rPr>
-          <w:rStyle w:val="HTMLCode"/>
-        </w:rPr>
-        <w:t>steps</w:t>
-      </w:r>
-      <w:r>
-        <w:t xml:space="preserve"> that include:</w:t>
+        <w:t xml:space="preserve">All uploads must be </w:t>
+      </w:r>
+      <w:r>
+        <w:rPr>
+          <w:rStyle w:val="Strong"/>
+        </w:rPr>
+        <w:t>image files</w:t>
+      </w:r>
+      <w:r>
+        <w:t xml:space="preserve"> (</w:t>
+      </w:r>
+      <w:r>
+        <w:rPr>
+          <w:rStyle w:val="HTMLCode"/>
+          <w:rFonts w:eastAsiaTheme="majorEastAsia"/>
+        </w:rPr>
+        <w:t>jpg</w:t>
+      </w:r>
+      <w:r>
+        <w:t xml:space="preserve">, </w:t>
+      </w:r>
+      <w:r>
+        <w:rPr>
+          <w:rStyle w:val="HTMLCode"/>
+          <w:rFonts w:eastAsiaTheme="majorEastAsia"/>
+        </w:rPr>
+        <w:t>jpeg</w:t>
+      </w:r>
+      <w:r>
+        <w:t xml:space="preserve">, </w:t>
+      </w:r>
+      <w:proofErr w:type="spellStart"/>
+      <w:r>
+        <w:rPr>
+          <w:rStyle w:val="HTMLCode"/>
+          <w:rFonts w:eastAsiaTheme="majorEastAsia"/>
+        </w:rPr>
+        <w:t>png</w:t>
+      </w:r>
+      <w:proofErr w:type="spellEnd"/>
+      <w:r>
+        <w:t>)</w:t>
       </w:r>
     </w:p>
     <w:p>
       <w:pPr>
         <w:pStyle w:val="NormalWeb"/>
         <w:numPr>
-          <w:ilvl w:val="1"/>
-          <w:numId w:val="11"/>
+          <w:ilvl w:val="0"/>
+          <w:numId w:val="16"/>
         </w:numPr>
       </w:pPr>
+      <w:r>
+        <w:t>Arrays (</w:t>
+      </w:r>
       <w:proofErr w:type="spellStart"/>
       <w:r>
         <w:rPr>
           <w:rStyle w:val="HTMLCode"/>
-        </w:rPr>
-        <w:t>stepNumber</w:t>
+          <w:rFonts w:eastAsiaTheme="majorEastAsia"/>
+        </w:rPr>
+        <w:t>stepNumbers</w:t>
       </w:r>
       <w:proofErr w:type="spellEnd"/>
+      <w:r>
+        <w:t xml:space="preserve">, </w:t>
+      </w:r>
+      <w:r>
+        <w:rPr>
+          <w:rStyle w:val="HTMLCode"/>
+          <w:rFonts w:eastAsiaTheme="majorEastAsia"/>
+        </w:rPr>
+        <w:t>descriptions</w:t>
+      </w:r>
+      <w:r>
+        <w:t>) must be sent as valid JSON strings</w:t>
+      </w:r>
     </w:p>
     <w:p>
       <w:pPr>
         <w:pStyle w:val="NormalWeb"/>
         <w:numPr>
-          <w:ilvl w:val="1"/>
-          <w:numId w:val="11"/>
+          <w:ilvl w:val="0"/>
+          <w:numId w:val="16"/>
         </w:numPr>
       </w:pPr>
       <w:r>
-        <w:rPr>
-          <w:rStyle w:val="HTMLCode"/>
-        </w:rPr>
-        <w:t>description</w:t>
+        <w:t xml:space="preserve">Maximum: </w:t>
+      </w:r>
+      <w:r>
+        <w:rPr>
+          <w:rStyle w:val="Strong"/>
+        </w:rPr>
+        <w:t>20 steps per request</w:t>
       </w:r>
     </w:p>
     <w:p>
       <w:pPr>
         <w:pStyle w:val="NormalWeb"/>
         <w:numPr>
-          <w:ilvl w:val="1"/>
-          <w:numId w:val="11"/>
+          <w:ilvl w:val="0"/>
+          <w:numId w:val="16"/>
         </w:numPr>
       </w:pPr>
-      <w:proofErr w:type="spellStart"/>
-      <w:r>
-        <w:rPr>
-          <w:rStyle w:val="HTMLCode"/>
-        </w:rPr>
-        <w:t>imagePath</w:t>
-      </w:r>
-      <w:proofErr w:type="spellEnd"/>
-    </w:p>
-    <w:p>
-      <w:r>
-        <w:pict w14:anchorId="697AED54">
-          <v:rect id="_x0000_i1070" style="width:0;height:1.5pt" o:hralign="center" o:hrstd="t" o:hr="t" fillcolor="#a0a0a0" stroked="f"/>
+      <w:r>
+        <w:t>Each step requires an image, step number, and description</w:t>
+      </w:r>
+    </w:p>
+    <w:p>
+      <w:r>
+        <w:lastRenderedPageBreak/>
+        <w:pict w14:anchorId="782F3129">
+          <v:rect id="_x0000_i1047" style="width:0;height:1.5pt" o:hralign="center" o:hrstd="t" o:hr="t" fillcolor="#a0a0a0" stroked="f"/>
         </w:pict>
       </w:r>
     </w:p>
@@ -2030,48 +1701,7 @@
         <w:pStyle w:val="NormalWeb"/>
       </w:pPr>
       <w:r>
-        <w:t xml:space="preserve">Would you like a </w:t>
-      </w:r>
-      <w:r>
-        <w:rPr>
-          <w:rStyle w:val="Strong"/>
-        </w:rPr>
-        <w:t>Postman collection</w:t>
-      </w:r>
-      <w:r>
-        <w:t xml:space="preserve">, </w:t>
-      </w:r>
-      <w:r>
-        <w:rPr>
-          <w:rStyle w:val="Strong"/>
-        </w:rPr>
-        <w:t>Swagger/</w:t>
-      </w:r>
-      <w:proofErr w:type="spellStart"/>
-      <w:r>
-        <w:rPr>
-          <w:rStyle w:val="Strong"/>
-        </w:rPr>
-        <w:t>OpenAPI</w:t>
-      </w:r>
-      <w:proofErr w:type="spellEnd"/>
-      <w:r>
-        <w:rPr>
-          <w:rStyle w:val="Strong"/>
-        </w:rPr>
-        <w:t xml:space="preserve"> spec</w:t>
-      </w:r>
-      <w:r>
-        <w:t xml:space="preserve">, or example React </w:t>
-      </w:r>
-      <w:r>
-        <w:rPr>
-          <w:rStyle w:val="HTMLCode"/>
-        </w:rPr>
-        <w:t>fetch</w:t>
-      </w:r>
-      <w:r>
-        <w:t>/Axios usage for this too?</w:t>
+        <w:t>Let me know if you want this exported to PDF or markdown format.</w:t>
       </w:r>
     </w:p>
     <w:p/>
@@ -2725,6 +2355,602 @@
     </w:lvl>
   </w:abstractNum>
   <w:abstractNum w:abstractNumId="5" w15:restartNumberingAfterBreak="0">
+    <w:nsid w:val="350417C3"/>
+    <w:multiLevelType w:val="multilevel"/>
+    <w:tmpl w:val="B1D82DBC"/>
+    <w:lvl w:ilvl="0">
+      <w:start w:val="1"/>
+      <w:numFmt w:val="bullet"/>
+      <w:lvlText w:val=""/>
+      <w:lvlJc w:val="left"/>
+      <w:pPr>
+        <w:tabs>
+          <w:tab w:val="num" w:pos="720"/>
+        </w:tabs>
+        <w:ind w:left="720" w:hanging="360"/>
+      </w:pPr>
+      <w:rPr>
+        <w:rFonts w:ascii="Symbol" w:hAnsi="Symbol" w:hint="default"/>
+        <w:sz w:val="20"/>
+      </w:rPr>
+    </w:lvl>
+    <w:lvl w:ilvl="1" w:tentative="1">
+      <w:start w:val="1"/>
+      <w:numFmt w:val="bullet"/>
+      <w:lvlText w:val="o"/>
+      <w:lvlJc w:val="left"/>
+      <w:pPr>
+        <w:tabs>
+          <w:tab w:val="num" w:pos="1440"/>
+        </w:tabs>
+        <w:ind w:left="1440" w:hanging="360"/>
+      </w:pPr>
+      <w:rPr>
+        <w:rFonts w:ascii="Courier New" w:hAnsi="Courier New" w:hint="default"/>
+        <w:sz w:val="20"/>
+      </w:rPr>
+    </w:lvl>
+    <w:lvl w:ilvl="2" w:tentative="1">
+      <w:start w:val="1"/>
+      <w:numFmt w:val="bullet"/>
+      <w:lvlText w:val=""/>
+      <w:lvlJc w:val="left"/>
+      <w:pPr>
+        <w:tabs>
+          <w:tab w:val="num" w:pos="2160"/>
+        </w:tabs>
+        <w:ind w:left="2160" w:hanging="360"/>
+      </w:pPr>
+      <w:rPr>
+        <w:rFonts w:ascii="Wingdings" w:hAnsi="Wingdings" w:hint="default"/>
+        <w:sz w:val="20"/>
+      </w:rPr>
+    </w:lvl>
+    <w:lvl w:ilvl="3" w:tentative="1">
+      <w:start w:val="1"/>
+      <w:numFmt w:val="bullet"/>
+      <w:lvlText w:val=""/>
+      <w:lvlJc w:val="left"/>
+      <w:pPr>
+        <w:tabs>
+          <w:tab w:val="num" w:pos="2880"/>
+        </w:tabs>
+        <w:ind w:left="2880" w:hanging="360"/>
+      </w:pPr>
+      <w:rPr>
+        <w:rFonts w:ascii="Wingdings" w:hAnsi="Wingdings" w:hint="default"/>
+        <w:sz w:val="20"/>
+      </w:rPr>
+    </w:lvl>
+    <w:lvl w:ilvl="4" w:tentative="1">
+      <w:start w:val="1"/>
+      <w:numFmt w:val="bullet"/>
+      <w:lvlText w:val=""/>
+      <w:lvlJc w:val="left"/>
+      <w:pPr>
+        <w:tabs>
+          <w:tab w:val="num" w:pos="3600"/>
+        </w:tabs>
+        <w:ind w:left="3600" w:hanging="360"/>
+      </w:pPr>
+      <w:rPr>
+        <w:rFonts w:ascii="Wingdings" w:hAnsi="Wingdings" w:hint="default"/>
+        <w:sz w:val="20"/>
+      </w:rPr>
+    </w:lvl>
+    <w:lvl w:ilvl="5" w:tentative="1">
+      <w:start w:val="1"/>
+      <w:numFmt w:val="bullet"/>
+      <w:lvlText w:val=""/>
+      <w:lvlJc w:val="left"/>
+      <w:pPr>
+        <w:tabs>
+          <w:tab w:val="num" w:pos="4320"/>
+        </w:tabs>
+        <w:ind w:left="4320" w:hanging="360"/>
+      </w:pPr>
+      <w:rPr>
+        <w:rFonts w:ascii="Wingdings" w:hAnsi="Wingdings" w:hint="default"/>
+        <w:sz w:val="20"/>
+      </w:rPr>
+    </w:lvl>
+    <w:lvl w:ilvl="6" w:tentative="1">
+      <w:start w:val="1"/>
+      <w:numFmt w:val="bullet"/>
+      <w:lvlText w:val=""/>
+      <w:lvlJc w:val="left"/>
+      <w:pPr>
+        <w:tabs>
+          <w:tab w:val="num" w:pos="5040"/>
+        </w:tabs>
+        <w:ind w:left="5040" w:hanging="360"/>
+      </w:pPr>
+      <w:rPr>
+        <w:rFonts w:ascii="Wingdings" w:hAnsi="Wingdings" w:hint="default"/>
+        <w:sz w:val="20"/>
+      </w:rPr>
+    </w:lvl>
+    <w:lvl w:ilvl="7" w:tentative="1">
+      <w:start w:val="1"/>
+      <w:numFmt w:val="bullet"/>
+      <w:lvlText w:val=""/>
+      <w:lvlJc w:val="left"/>
+      <w:pPr>
+        <w:tabs>
+          <w:tab w:val="num" w:pos="5760"/>
+        </w:tabs>
+        <w:ind w:left="5760" w:hanging="360"/>
+      </w:pPr>
+      <w:rPr>
+        <w:rFonts w:ascii="Wingdings" w:hAnsi="Wingdings" w:hint="default"/>
+        <w:sz w:val="20"/>
+      </w:rPr>
+    </w:lvl>
+    <w:lvl w:ilvl="8" w:tentative="1">
+      <w:start w:val="1"/>
+      <w:numFmt w:val="bullet"/>
+      <w:lvlText w:val=""/>
+      <w:lvlJc w:val="left"/>
+      <w:pPr>
+        <w:tabs>
+          <w:tab w:val="num" w:pos="6480"/>
+        </w:tabs>
+        <w:ind w:left="6480" w:hanging="360"/>
+      </w:pPr>
+      <w:rPr>
+        <w:rFonts w:ascii="Wingdings" w:hAnsi="Wingdings" w:hint="default"/>
+        <w:sz w:val="20"/>
+      </w:rPr>
+    </w:lvl>
+  </w:abstractNum>
+  <w:abstractNum w:abstractNumId="6" w15:restartNumberingAfterBreak="0">
+    <w:nsid w:val="35955D2F"/>
+    <w:multiLevelType w:val="multilevel"/>
+    <w:tmpl w:val="423A0188"/>
+    <w:lvl w:ilvl="0">
+      <w:start w:val="1"/>
+      <w:numFmt w:val="bullet"/>
+      <w:lvlText w:val=""/>
+      <w:lvlJc w:val="left"/>
+      <w:pPr>
+        <w:tabs>
+          <w:tab w:val="num" w:pos="720"/>
+        </w:tabs>
+        <w:ind w:left="720" w:hanging="360"/>
+      </w:pPr>
+      <w:rPr>
+        <w:rFonts w:ascii="Symbol" w:hAnsi="Symbol" w:hint="default"/>
+        <w:sz w:val="20"/>
+      </w:rPr>
+    </w:lvl>
+    <w:lvl w:ilvl="1" w:tentative="1">
+      <w:start w:val="1"/>
+      <w:numFmt w:val="bullet"/>
+      <w:lvlText w:val="o"/>
+      <w:lvlJc w:val="left"/>
+      <w:pPr>
+        <w:tabs>
+          <w:tab w:val="num" w:pos="1440"/>
+        </w:tabs>
+        <w:ind w:left="1440" w:hanging="360"/>
+      </w:pPr>
+      <w:rPr>
+        <w:rFonts w:ascii="Courier New" w:hAnsi="Courier New" w:hint="default"/>
+        <w:sz w:val="20"/>
+      </w:rPr>
+    </w:lvl>
+    <w:lvl w:ilvl="2" w:tentative="1">
+      <w:start w:val="1"/>
+      <w:numFmt w:val="bullet"/>
+      <w:lvlText w:val=""/>
+      <w:lvlJc w:val="left"/>
+      <w:pPr>
+        <w:tabs>
+          <w:tab w:val="num" w:pos="2160"/>
+        </w:tabs>
+        <w:ind w:left="2160" w:hanging="360"/>
+      </w:pPr>
+      <w:rPr>
+        <w:rFonts w:ascii="Wingdings" w:hAnsi="Wingdings" w:hint="default"/>
+        <w:sz w:val="20"/>
+      </w:rPr>
+    </w:lvl>
+    <w:lvl w:ilvl="3" w:tentative="1">
+      <w:start w:val="1"/>
+      <w:numFmt w:val="bullet"/>
+      <w:lvlText w:val=""/>
+      <w:lvlJc w:val="left"/>
+      <w:pPr>
+        <w:tabs>
+          <w:tab w:val="num" w:pos="2880"/>
+        </w:tabs>
+        <w:ind w:left="2880" w:hanging="360"/>
+      </w:pPr>
+      <w:rPr>
+        <w:rFonts w:ascii="Wingdings" w:hAnsi="Wingdings" w:hint="default"/>
+        <w:sz w:val="20"/>
+      </w:rPr>
+    </w:lvl>
+    <w:lvl w:ilvl="4" w:tentative="1">
+      <w:start w:val="1"/>
+      <w:numFmt w:val="bullet"/>
+      <w:lvlText w:val=""/>
+      <w:lvlJc w:val="left"/>
+      <w:pPr>
+        <w:tabs>
+          <w:tab w:val="num" w:pos="3600"/>
+        </w:tabs>
+        <w:ind w:left="3600" w:hanging="360"/>
+      </w:pPr>
+      <w:rPr>
+        <w:rFonts w:ascii="Wingdings" w:hAnsi="Wingdings" w:hint="default"/>
+        <w:sz w:val="20"/>
+      </w:rPr>
+    </w:lvl>
+    <w:lvl w:ilvl="5" w:tentative="1">
+      <w:start w:val="1"/>
+      <w:numFmt w:val="bullet"/>
+      <w:lvlText w:val=""/>
+      <w:lvlJc w:val="left"/>
+      <w:pPr>
+        <w:tabs>
+          <w:tab w:val="num" w:pos="4320"/>
+        </w:tabs>
+        <w:ind w:left="4320" w:hanging="360"/>
+      </w:pPr>
+      <w:rPr>
+        <w:rFonts w:ascii="Wingdings" w:hAnsi="Wingdings" w:hint="default"/>
+        <w:sz w:val="20"/>
+      </w:rPr>
+    </w:lvl>
+    <w:lvl w:ilvl="6" w:tentative="1">
+      <w:start w:val="1"/>
+      <w:numFmt w:val="bullet"/>
+      <w:lvlText w:val=""/>
+      <w:lvlJc w:val="left"/>
+      <w:pPr>
+        <w:tabs>
+          <w:tab w:val="num" w:pos="5040"/>
+        </w:tabs>
+        <w:ind w:left="5040" w:hanging="360"/>
+      </w:pPr>
+      <w:rPr>
+        <w:rFonts w:ascii="Wingdings" w:hAnsi="Wingdings" w:hint="default"/>
+        <w:sz w:val="20"/>
+      </w:rPr>
+    </w:lvl>
+    <w:lvl w:ilvl="7" w:tentative="1">
+      <w:start w:val="1"/>
+      <w:numFmt w:val="bullet"/>
+      <w:lvlText w:val=""/>
+      <w:lvlJc w:val="left"/>
+      <w:pPr>
+        <w:tabs>
+          <w:tab w:val="num" w:pos="5760"/>
+        </w:tabs>
+        <w:ind w:left="5760" w:hanging="360"/>
+      </w:pPr>
+      <w:rPr>
+        <w:rFonts w:ascii="Wingdings" w:hAnsi="Wingdings" w:hint="default"/>
+        <w:sz w:val="20"/>
+      </w:rPr>
+    </w:lvl>
+    <w:lvl w:ilvl="8" w:tentative="1">
+      <w:start w:val="1"/>
+      <w:numFmt w:val="bullet"/>
+      <w:lvlText w:val=""/>
+      <w:lvlJc w:val="left"/>
+      <w:pPr>
+        <w:tabs>
+          <w:tab w:val="num" w:pos="6480"/>
+        </w:tabs>
+        <w:ind w:left="6480" w:hanging="360"/>
+      </w:pPr>
+      <w:rPr>
+        <w:rFonts w:ascii="Wingdings" w:hAnsi="Wingdings" w:hint="default"/>
+        <w:sz w:val="20"/>
+      </w:rPr>
+    </w:lvl>
+  </w:abstractNum>
+  <w:abstractNum w:abstractNumId="7" w15:restartNumberingAfterBreak="0">
+    <w:nsid w:val="35B53179"/>
+    <w:multiLevelType w:val="multilevel"/>
+    <w:tmpl w:val="3C946974"/>
+    <w:lvl w:ilvl="0">
+      <w:start w:val="1"/>
+      <w:numFmt w:val="bullet"/>
+      <w:lvlText w:val=""/>
+      <w:lvlJc w:val="left"/>
+      <w:pPr>
+        <w:tabs>
+          <w:tab w:val="num" w:pos="720"/>
+        </w:tabs>
+        <w:ind w:left="720" w:hanging="360"/>
+      </w:pPr>
+      <w:rPr>
+        <w:rFonts w:ascii="Symbol" w:hAnsi="Symbol" w:hint="default"/>
+        <w:sz w:val="20"/>
+      </w:rPr>
+    </w:lvl>
+    <w:lvl w:ilvl="1" w:tentative="1">
+      <w:start w:val="1"/>
+      <w:numFmt w:val="bullet"/>
+      <w:lvlText w:val="o"/>
+      <w:lvlJc w:val="left"/>
+      <w:pPr>
+        <w:tabs>
+          <w:tab w:val="num" w:pos="1440"/>
+        </w:tabs>
+        <w:ind w:left="1440" w:hanging="360"/>
+      </w:pPr>
+      <w:rPr>
+        <w:rFonts w:ascii="Courier New" w:hAnsi="Courier New" w:hint="default"/>
+        <w:sz w:val="20"/>
+      </w:rPr>
+    </w:lvl>
+    <w:lvl w:ilvl="2" w:tentative="1">
+      <w:start w:val="1"/>
+      <w:numFmt w:val="bullet"/>
+      <w:lvlText w:val=""/>
+      <w:lvlJc w:val="left"/>
+      <w:pPr>
+        <w:tabs>
+          <w:tab w:val="num" w:pos="2160"/>
+        </w:tabs>
+        <w:ind w:left="2160" w:hanging="360"/>
+      </w:pPr>
+      <w:rPr>
+        <w:rFonts w:ascii="Wingdings" w:hAnsi="Wingdings" w:hint="default"/>
+        <w:sz w:val="20"/>
+      </w:rPr>
+    </w:lvl>
+    <w:lvl w:ilvl="3" w:tentative="1">
+      <w:start w:val="1"/>
+      <w:numFmt w:val="bullet"/>
+      <w:lvlText w:val=""/>
+      <w:lvlJc w:val="left"/>
+      <w:pPr>
+        <w:tabs>
+          <w:tab w:val="num" w:pos="2880"/>
+        </w:tabs>
+        <w:ind w:left="2880" w:hanging="360"/>
+      </w:pPr>
+      <w:rPr>
+        <w:rFonts w:ascii="Wingdings" w:hAnsi="Wingdings" w:hint="default"/>
+        <w:sz w:val="20"/>
+      </w:rPr>
+    </w:lvl>
+    <w:lvl w:ilvl="4" w:tentative="1">
+      <w:start w:val="1"/>
+      <w:numFmt w:val="bullet"/>
+      <w:lvlText w:val=""/>
+      <w:lvlJc w:val="left"/>
+      <w:pPr>
+        <w:tabs>
+          <w:tab w:val="num" w:pos="3600"/>
+        </w:tabs>
+        <w:ind w:left="3600" w:hanging="360"/>
+      </w:pPr>
+      <w:rPr>
+        <w:rFonts w:ascii="Wingdings" w:hAnsi="Wingdings" w:hint="default"/>
+        <w:sz w:val="20"/>
+      </w:rPr>
+    </w:lvl>
+    <w:lvl w:ilvl="5" w:tentative="1">
+      <w:start w:val="1"/>
+      <w:numFmt w:val="bullet"/>
+      <w:lvlText w:val=""/>
+      <w:lvlJc w:val="left"/>
+      <w:pPr>
+        <w:tabs>
+          <w:tab w:val="num" w:pos="4320"/>
+        </w:tabs>
+        <w:ind w:left="4320" w:hanging="360"/>
+      </w:pPr>
+      <w:rPr>
+        <w:rFonts w:ascii="Wingdings" w:hAnsi="Wingdings" w:hint="default"/>
+        <w:sz w:val="20"/>
+      </w:rPr>
+    </w:lvl>
+    <w:lvl w:ilvl="6" w:tentative="1">
+      <w:start w:val="1"/>
+      <w:numFmt w:val="bullet"/>
+      <w:lvlText w:val=""/>
+      <w:lvlJc w:val="left"/>
+      <w:pPr>
+        <w:tabs>
+          <w:tab w:val="num" w:pos="5040"/>
+        </w:tabs>
+        <w:ind w:left="5040" w:hanging="360"/>
+      </w:pPr>
+      <w:rPr>
+        <w:rFonts w:ascii="Wingdings" w:hAnsi="Wingdings" w:hint="default"/>
+        <w:sz w:val="20"/>
+      </w:rPr>
+    </w:lvl>
+    <w:lvl w:ilvl="7" w:tentative="1">
+      <w:start w:val="1"/>
+      <w:numFmt w:val="bullet"/>
+      <w:lvlText w:val=""/>
+      <w:lvlJc w:val="left"/>
+      <w:pPr>
+        <w:tabs>
+          <w:tab w:val="num" w:pos="5760"/>
+        </w:tabs>
+        <w:ind w:left="5760" w:hanging="360"/>
+      </w:pPr>
+      <w:rPr>
+        <w:rFonts w:ascii="Wingdings" w:hAnsi="Wingdings" w:hint="default"/>
+        <w:sz w:val="20"/>
+      </w:rPr>
+    </w:lvl>
+    <w:lvl w:ilvl="8" w:tentative="1">
+      <w:start w:val="1"/>
+      <w:numFmt w:val="bullet"/>
+      <w:lvlText w:val=""/>
+      <w:lvlJc w:val="left"/>
+      <w:pPr>
+        <w:tabs>
+          <w:tab w:val="num" w:pos="6480"/>
+        </w:tabs>
+        <w:ind w:left="6480" w:hanging="360"/>
+      </w:pPr>
+      <w:rPr>
+        <w:rFonts w:ascii="Wingdings" w:hAnsi="Wingdings" w:hint="default"/>
+        <w:sz w:val="20"/>
+      </w:rPr>
+    </w:lvl>
+  </w:abstractNum>
+  <w:abstractNum w:abstractNumId="8" w15:restartNumberingAfterBreak="0">
+    <w:nsid w:val="41396A45"/>
+    <w:multiLevelType w:val="multilevel"/>
+    <w:tmpl w:val="30DCC72C"/>
+    <w:lvl w:ilvl="0">
+      <w:start w:val="1"/>
+      <w:numFmt w:val="bullet"/>
+      <w:lvlText w:val=""/>
+      <w:lvlJc w:val="left"/>
+      <w:pPr>
+        <w:tabs>
+          <w:tab w:val="num" w:pos="720"/>
+        </w:tabs>
+        <w:ind w:left="720" w:hanging="360"/>
+      </w:pPr>
+      <w:rPr>
+        <w:rFonts w:ascii="Symbol" w:hAnsi="Symbol" w:hint="default"/>
+        <w:sz w:val="20"/>
+      </w:rPr>
+    </w:lvl>
+    <w:lvl w:ilvl="1" w:tentative="1">
+      <w:start w:val="1"/>
+      <w:numFmt w:val="bullet"/>
+      <w:lvlText w:val="o"/>
+      <w:lvlJc w:val="left"/>
+      <w:pPr>
+        <w:tabs>
+          <w:tab w:val="num" w:pos="1440"/>
+        </w:tabs>
+        <w:ind w:left="1440" w:hanging="360"/>
+      </w:pPr>
+      <w:rPr>
+        <w:rFonts w:ascii="Courier New" w:hAnsi="Courier New" w:hint="default"/>
+        <w:sz w:val="20"/>
+      </w:rPr>
+    </w:lvl>
+    <w:lvl w:ilvl="2" w:tentative="1">
+      <w:start w:val="1"/>
+      <w:numFmt w:val="bullet"/>
+      <w:lvlText w:val=""/>
+      <w:lvlJc w:val="left"/>
+      <w:pPr>
+        <w:tabs>
+          <w:tab w:val="num" w:pos="2160"/>
+        </w:tabs>
+        <w:ind w:left="2160" w:hanging="360"/>
+      </w:pPr>
+      <w:rPr>
+        <w:rFonts w:ascii="Wingdings" w:hAnsi="Wingdings" w:hint="default"/>
+        <w:sz w:val="20"/>
+      </w:rPr>
+    </w:lvl>
+    <w:lvl w:ilvl="3" w:tentative="1">
+      <w:start w:val="1"/>
+      <w:numFmt w:val="bullet"/>
+      <w:lvlText w:val=""/>
+      <w:lvlJc w:val="left"/>
+      <w:pPr>
+        <w:tabs>
+          <w:tab w:val="num" w:pos="2880"/>
+        </w:tabs>
+        <w:ind w:left="2880" w:hanging="360"/>
+      </w:pPr>
+      <w:rPr>
+        <w:rFonts w:ascii="Wingdings" w:hAnsi="Wingdings" w:hint="default"/>
+        <w:sz w:val="20"/>
+      </w:rPr>
+    </w:lvl>
+    <w:lvl w:ilvl="4" w:tentative="1">
+      <w:start w:val="1"/>
+      <w:numFmt w:val="bullet"/>
+      <w:lvlText w:val=""/>
+      <w:lvlJc w:val="left"/>
+      <w:pPr>
+        <w:tabs>
+          <w:tab w:val="num" w:pos="3600"/>
+        </w:tabs>
+        <w:ind w:left="3600" w:hanging="360"/>
+      </w:pPr>
+      <w:rPr>
+        <w:rFonts w:ascii="Wingdings" w:hAnsi="Wingdings" w:hint="default"/>
+        <w:sz w:val="20"/>
+      </w:rPr>
+    </w:lvl>
+    <w:lvl w:ilvl="5" w:tentative="1">
+      <w:start w:val="1"/>
+      <w:numFmt w:val="bullet"/>
+      <w:lvlText w:val=""/>
+      <w:lvlJc w:val="left"/>
+      <w:pPr>
+        <w:tabs>
+          <w:tab w:val="num" w:pos="4320"/>
+        </w:tabs>
+        <w:ind w:left="4320" w:hanging="360"/>
+      </w:pPr>
+      <w:rPr>
+        <w:rFonts w:ascii="Wingdings" w:hAnsi="Wingdings" w:hint="default"/>
+        <w:sz w:val="20"/>
+      </w:rPr>
+    </w:lvl>
+    <w:lvl w:ilvl="6" w:tentative="1">
+      <w:start w:val="1"/>
+      <w:numFmt w:val="bullet"/>
+      <w:lvlText w:val=""/>
+      <w:lvlJc w:val="left"/>
+      <w:pPr>
+        <w:tabs>
+          <w:tab w:val="num" w:pos="5040"/>
+        </w:tabs>
+        <w:ind w:left="5040" w:hanging="360"/>
+      </w:pPr>
+      <w:rPr>
+        <w:rFonts w:ascii="Wingdings" w:hAnsi="Wingdings" w:hint="default"/>
+        <w:sz w:val="20"/>
+      </w:rPr>
+    </w:lvl>
+    <w:lvl w:ilvl="7" w:tentative="1">
+      <w:start w:val="1"/>
+      <w:numFmt w:val="bullet"/>
+      <w:lvlText w:val=""/>
+      <w:lvlJc w:val="left"/>
+      <w:pPr>
+        <w:tabs>
+          <w:tab w:val="num" w:pos="5760"/>
+        </w:tabs>
+        <w:ind w:left="5760" w:hanging="360"/>
+      </w:pPr>
+      <w:rPr>
+        <w:rFonts w:ascii="Wingdings" w:hAnsi="Wingdings" w:hint="default"/>
+        <w:sz w:val="20"/>
+      </w:rPr>
+    </w:lvl>
+    <w:lvl w:ilvl="8" w:tentative="1">
+      <w:start w:val="1"/>
+      <w:numFmt w:val="bullet"/>
+      <w:lvlText w:val=""/>
+      <w:lvlJc w:val="left"/>
+      <w:pPr>
+        <w:tabs>
+          <w:tab w:val="num" w:pos="6480"/>
+        </w:tabs>
+        <w:ind w:left="6480" w:hanging="360"/>
+      </w:pPr>
+      <w:rPr>
+        <w:rFonts w:ascii="Wingdings" w:hAnsi="Wingdings" w:hint="default"/>
+        <w:sz w:val="20"/>
+      </w:rPr>
+    </w:lvl>
+  </w:abstractNum>
+  <w:abstractNum w:abstractNumId="9" w15:restartNumberingAfterBreak="0">
     <w:nsid w:val="46A435A2"/>
     <w:multiLevelType w:val="multilevel"/>
     <w:tmpl w:val="6CF0A3B4"/>
@@ -2837,7 +3063,7 @@
       </w:pPr>
     </w:lvl>
   </w:abstractNum>
-  <w:abstractNum w:abstractNumId="6" w15:restartNumberingAfterBreak="0">
+  <w:abstractNum w:abstractNumId="10" w15:restartNumberingAfterBreak="0">
     <w:nsid w:val="495B5ADA"/>
     <w:multiLevelType w:val="multilevel"/>
     <w:tmpl w:val="3C6202B8"/>
@@ -2986,7 +3212,156 @@
       </w:rPr>
     </w:lvl>
   </w:abstractNum>
-  <w:abstractNum w:abstractNumId="7" w15:restartNumberingAfterBreak="0">
+  <w:abstractNum w:abstractNumId="11" w15:restartNumberingAfterBreak="0">
+    <w:nsid w:val="49724C7A"/>
+    <w:multiLevelType w:val="multilevel"/>
+    <w:tmpl w:val="47C4A3F0"/>
+    <w:lvl w:ilvl="0">
+      <w:start w:val="1"/>
+      <w:numFmt w:val="bullet"/>
+      <w:lvlText w:val=""/>
+      <w:lvlJc w:val="left"/>
+      <w:pPr>
+        <w:tabs>
+          <w:tab w:val="num" w:pos="720"/>
+        </w:tabs>
+        <w:ind w:left="720" w:hanging="360"/>
+      </w:pPr>
+      <w:rPr>
+        <w:rFonts w:ascii="Symbol" w:hAnsi="Symbol" w:hint="default"/>
+        <w:sz w:val="20"/>
+      </w:rPr>
+    </w:lvl>
+    <w:lvl w:ilvl="1">
+      <w:start w:val="1"/>
+      <w:numFmt w:val="bullet"/>
+      <w:lvlText w:val="o"/>
+      <w:lvlJc w:val="left"/>
+      <w:pPr>
+        <w:tabs>
+          <w:tab w:val="num" w:pos="1440"/>
+        </w:tabs>
+        <w:ind w:left="1440" w:hanging="360"/>
+      </w:pPr>
+      <w:rPr>
+        <w:rFonts w:ascii="Courier New" w:hAnsi="Courier New" w:hint="default"/>
+        <w:sz w:val="20"/>
+      </w:rPr>
+    </w:lvl>
+    <w:lvl w:ilvl="2" w:tentative="1">
+      <w:start w:val="1"/>
+      <w:numFmt w:val="bullet"/>
+      <w:lvlText w:val=""/>
+      <w:lvlJc w:val="left"/>
+      <w:pPr>
+        <w:tabs>
+          <w:tab w:val="num" w:pos="2160"/>
+        </w:tabs>
+        <w:ind w:left="2160" w:hanging="360"/>
+      </w:pPr>
+      <w:rPr>
+        <w:rFonts w:ascii="Wingdings" w:hAnsi="Wingdings" w:hint="default"/>
+        <w:sz w:val="20"/>
+      </w:rPr>
+    </w:lvl>
+    <w:lvl w:ilvl="3" w:tentative="1">
+      <w:start w:val="1"/>
+      <w:numFmt w:val="bullet"/>
+      <w:lvlText w:val=""/>
+      <w:lvlJc w:val="left"/>
+      <w:pPr>
+        <w:tabs>
+          <w:tab w:val="num" w:pos="2880"/>
+        </w:tabs>
+        <w:ind w:left="2880" w:hanging="360"/>
+      </w:pPr>
+      <w:rPr>
+        <w:rFonts w:ascii="Wingdings" w:hAnsi="Wingdings" w:hint="default"/>
+        <w:sz w:val="20"/>
+      </w:rPr>
+    </w:lvl>
+    <w:lvl w:ilvl="4" w:tentative="1">
+      <w:start w:val="1"/>
+      <w:numFmt w:val="bullet"/>
+      <w:lvlText w:val=""/>
+      <w:lvlJc w:val="left"/>
+      <w:pPr>
+        <w:tabs>
+          <w:tab w:val="num" w:pos="3600"/>
+        </w:tabs>
+        <w:ind w:left="3600" w:hanging="360"/>
+      </w:pPr>
+      <w:rPr>
+        <w:rFonts w:ascii="Wingdings" w:hAnsi="Wingdings" w:hint="default"/>
+        <w:sz w:val="20"/>
+      </w:rPr>
+    </w:lvl>
+    <w:lvl w:ilvl="5" w:tentative="1">
+      <w:start w:val="1"/>
+      <w:numFmt w:val="bullet"/>
+      <w:lvlText w:val=""/>
+      <w:lvlJc w:val="left"/>
+      <w:pPr>
+        <w:tabs>
+          <w:tab w:val="num" w:pos="4320"/>
+        </w:tabs>
+        <w:ind w:left="4320" w:hanging="360"/>
+      </w:pPr>
+      <w:rPr>
+        <w:rFonts w:ascii="Wingdings" w:hAnsi="Wingdings" w:hint="default"/>
+        <w:sz w:val="20"/>
+      </w:rPr>
+    </w:lvl>
+    <w:lvl w:ilvl="6" w:tentative="1">
+      <w:start w:val="1"/>
+      <w:numFmt w:val="bullet"/>
+      <w:lvlText w:val=""/>
+      <w:lvlJc w:val="left"/>
+      <w:pPr>
+        <w:tabs>
+          <w:tab w:val="num" w:pos="5040"/>
+        </w:tabs>
+        <w:ind w:left="5040" w:hanging="360"/>
+      </w:pPr>
+      <w:rPr>
+        <w:rFonts w:ascii="Wingdings" w:hAnsi="Wingdings" w:hint="default"/>
+        <w:sz w:val="20"/>
+      </w:rPr>
+    </w:lvl>
+    <w:lvl w:ilvl="7" w:tentative="1">
+      <w:start w:val="1"/>
+      <w:numFmt w:val="bullet"/>
+      <w:lvlText w:val=""/>
+      <w:lvlJc w:val="left"/>
+      <w:pPr>
+        <w:tabs>
+          <w:tab w:val="num" w:pos="5760"/>
+        </w:tabs>
+        <w:ind w:left="5760" w:hanging="360"/>
+      </w:pPr>
+      <w:rPr>
+        <w:rFonts w:ascii="Wingdings" w:hAnsi="Wingdings" w:hint="default"/>
+        <w:sz w:val="20"/>
+      </w:rPr>
+    </w:lvl>
+    <w:lvl w:ilvl="8" w:tentative="1">
+      <w:start w:val="1"/>
+      <w:numFmt w:val="bullet"/>
+      <w:lvlText w:val=""/>
+      <w:lvlJc w:val="left"/>
+      <w:pPr>
+        <w:tabs>
+          <w:tab w:val="num" w:pos="6480"/>
+        </w:tabs>
+        <w:ind w:left="6480" w:hanging="360"/>
+      </w:pPr>
+      <w:rPr>
+        <w:rFonts w:ascii="Wingdings" w:hAnsi="Wingdings" w:hint="default"/>
+        <w:sz w:val="20"/>
+      </w:rPr>
+    </w:lvl>
+  </w:abstractNum>
+  <w:abstractNum w:abstractNumId="12" w15:restartNumberingAfterBreak="0">
     <w:nsid w:val="49F210BA"/>
     <w:multiLevelType w:val="multilevel"/>
     <w:tmpl w:val="C860902A"/>
@@ -3135,7 +3510,7 @@
       </w:rPr>
     </w:lvl>
   </w:abstractNum>
-  <w:abstractNum w:abstractNumId="8" w15:restartNumberingAfterBreak="0">
+  <w:abstractNum w:abstractNumId="13" w15:restartNumberingAfterBreak="0">
     <w:nsid w:val="506A42F7"/>
     <w:multiLevelType w:val="multilevel"/>
     <w:tmpl w:val="5EF658D0"/>
@@ -3284,7 +3659,7 @@
       </w:rPr>
     </w:lvl>
   </w:abstractNum>
-  <w:abstractNum w:abstractNumId="9" w15:restartNumberingAfterBreak="0">
+  <w:abstractNum w:abstractNumId="14" w15:restartNumberingAfterBreak="0">
     <w:nsid w:val="56D73A89"/>
     <w:multiLevelType w:val="multilevel"/>
     <w:tmpl w:val="993E84C0"/>
@@ -3401,7 +3776,7 @@
       </w:pPr>
     </w:lvl>
   </w:abstractNum>
-  <w:abstractNum w:abstractNumId="10" w15:restartNumberingAfterBreak="0">
+  <w:abstractNum w:abstractNumId="15" w15:restartNumberingAfterBreak="0">
     <w:nsid w:val="653602D5"/>
     <w:multiLevelType w:val="multilevel"/>
     <w:tmpl w:val="8B2A317C"/>
@@ -3551,10 +3926,10 @@
     </w:lvl>
   </w:abstractNum>
   <w:num w:numId="1" w16cid:durableId="839276068">
-    <w:abstractNumId w:val="7"/>
+    <w:abstractNumId w:val="12"/>
   </w:num>
   <w:num w:numId="2" w16cid:durableId="1735664746">
-    <w:abstractNumId w:val="9"/>
+    <w:abstractNumId w:val="14"/>
   </w:num>
   <w:num w:numId="3" w16cid:durableId="680007925">
     <w:abstractNumId w:val="3"/>
@@ -3563,25 +3938,40 @@
     <w:abstractNumId w:val="0"/>
   </w:num>
   <w:num w:numId="5" w16cid:durableId="839006999">
-    <w:abstractNumId w:val="5"/>
+    <w:abstractNumId w:val="9"/>
   </w:num>
   <w:num w:numId="6" w16cid:durableId="824202453">
     <w:abstractNumId w:val="4"/>
   </w:num>
   <w:num w:numId="7" w16cid:durableId="878393020">
-    <w:abstractNumId w:val="8"/>
+    <w:abstractNumId w:val="13"/>
   </w:num>
   <w:num w:numId="8" w16cid:durableId="27881528">
     <w:abstractNumId w:val="1"/>
   </w:num>
   <w:num w:numId="9" w16cid:durableId="1402827477">
-    <w:abstractNumId w:val="6"/>
+    <w:abstractNumId w:val="10"/>
   </w:num>
   <w:num w:numId="10" w16cid:durableId="1543248788">
     <w:abstractNumId w:val="2"/>
   </w:num>
   <w:num w:numId="11" w16cid:durableId="755174473">
-    <w:abstractNumId w:val="10"/>
+    <w:abstractNumId w:val="15"/>
+  </w:num>
+  <w:num w:numId="12" w16cid:durableId="1836414701">
+    <w:abstractNumId w:val="5"/>
+  </w:num>
+  <w:num w:numId="13" w16cid:durableId="743261496">
+    <w:abstractNumId w:val="7"/>
+  </w:num>
+  <w:num w:numId="14" w16cid:durableId="915477322">
+    <w:abstractNumId w:val="11"/>
+  </w:num>
+  <w:num w:numId="15" w16cid:durableId="725761127">
+    <w:abstractNumId w:val="8"/>
+  </w:num>
+  <w:num w:numId="16" w16cid:durableId="1809937003">
+    <w:abstractNumId w:val="6"/>
   </w:num>
 </w:numbering>
 </file>
@@ -4260,6 +4650,17 @@
       <w:color w:val="2F5496" w:themeColor="accent1" w:themeShade="BF"/>
     </w:rPr>
   </w:style>
+  <w:style w:type="character" w:styleId="Emphasis">
+    <w:name w:val="Emphasis"/>
+    <w:basedOn w:val="DefaultParagraphFont"/>
+    <w:uiPriority w:val="20"/>
+    <w:qFormat/>
+    <w:rsid w:val="00CE1991"/>
+    <w:rPr>
+      <w:i/>
+      <w:iCs/>
+    </w:rPr>
+  </w:style>
 </w:styles>
 </file>
 

</xml_diff>

<commit_message>
OPL delete function tested
</commit_message>
<xml_diff>
--- a/Documentation/APIs Docs 2.0/One Point Lesson 2.0.docx
+++ b/Documentation/APIs Docs 2.0/One Point Lesson 2.0.docx
@@ -13,16 +13,16 @@
         <w:rPr>
           <w:rStyle w:val="Strong"/>
         </w:rPr>
-        <w:t>API documentation for One Point Lesson 2.0 (OPL 2.0)</w:t>
-      </w:r>
-      <w:r>
-        <w:t xml:space="preserve"> in a format ready to be shared with your frontend developer team:</w:t>
-      </w:r>
-    </w:p>
-    <w:p>
-      <w:r>
-        <w:pict w14:anchorId="733594B9">
-          <v:rect id="_x0000_i1041" style="width:0;height:1.5pt" o:hralign="center" o:hrstd="t" o:hr="t" fillcolor="#a0a0a0" stroked="f"/>
+        <w:t>updated API documentation for the One Point Lesson 2.0 (OPL)</w:t>
+      </w:r>
+      <w:r>
+        <w:t xml:space="preserve"> module based on the latest implementation (mirroring Work Instructions logic), suitable for your frontend developer.</w:t>
+      </w:r>
+    </w:p>
+    <w:p>
+      <w:r>
+        <w:pict w14:anchorId="67C281E1">
+          <v:rect id="_x0000_i1039" style="width:0;height:1.5pt" o:hralign="center" o:hrstd="t" o:hr="t" fillcolor="#a0a0a0" stroked="f"/>
         </w:pict>
       </w:r>
     </w:p>
@@ -37,7 +37,7 @@
         <w:t>📘</w:t>
       </w:r>
       <w:r>
-        <w:t xml:space="preserve"> One Point Lesson 2.0 – API Documentation</w:t>
+        <w:t xml:space="preserve"> One Point Lesson 2.0 (OPL) - API Documentation</w:t>
       </w:r>
     </w:p>
     <w:p>
@@ -45,7 +45,13 @@
         <w:pStyle w:val="Heading3"/>
       </w:pPr>
       <w:r>
-        <w:t>Base URL:</w:t>
+        <w:rPr>
+          <w:rFonts w:ascii="Segoe UI Emoji" w:hAnsi="Segoe UI Emoji" w:cs="Segoe UI Emoji"/>
+        </w:rPr>
+        <w:t>📂</w:t>
+      </w:r>
+      <w:r>
+        <w:t xml:space="preserve"> Base URL</w:t>
       </w:r>
     </w:p>
     <w:p>
@@ -66,23 +72,97 @@
     </w:p>
     <w:p>
       <w:r>
-        <w:pict w14:anchorId="69976EA5">
-          <v:rect id="_x0000_i1042" style="width:0;height:1.5pt" o:hralign="center" o:hrstd="t" o:hr="t" fillcolor="#a0a0a0" stroked="f"/>
+        <w:pict w14:anchorId="2BFD8E80">
+          <v:rect id="_x0000_i1040" style="width:0;height:1.5pt" o:hralign="center" o:hrstd="t" o:hr="t" fillcolor="#a0a0a0" stroked="f"/>
         </w:pict>
       </w:r>
     </w:p>
     <w:p>
       <w:pPr>
+        <w:pStyle w:val="Heading2"/>
+      </w:pPr>
+      <w:r>
+        <w:rPr>
+          <w:rFonts w:ascii="Segoe UI Emoji" w:hAnsi="Segoe UI Emoji" w:cs="Segoe UI Emoji"/>
+        </w:rPr>
+        <w:t>🟢</w:t>
+      </w:r>
+      <w:r>
+        <w:t xml:space="preserve"> 1. Upload Multiple OPL Steps</w:t>
+      </w:r>
+    </w:p>
+    <w:p>
+      <w:pPr>
         <w:pStyle w:val="Heading3"/>
       </w:pPr>
       <w:r>
         <w:rPr>
+          <w:rStyle w:val="HTMLCode"/>
+          <w:rFonts w:eastAsiaTheme="majorEastAsia"/>
+        </w:rPr>
+        <w:t>POST /uploadMultiple</w:t>
+      </w:r>
+    </w:p>
+    <w:p>
+      <w:pPr>
+        <w:pStyle w:val="NormalWeb"/>
+      </w:pPr>
+      <w:r>
+        <w:t xml:space="preserve">Upload multiple OPL steps with </w:t>
+      </w:r>
+      <w:r>
+        <w:rPr>
+          <w:rStyle w:val="HTMLCode"/>
+          <w:rFonts w:eastAsiaTheme="majorEastAsia"/>
+        </w:rPr>
+        <w:t>lessonName</w:t>
+      </w:r>
+      <w:r>
+        <w:t xml:space="preserve">, </w:t>
+      </w:r>
+      <w:r>
+        <w:rPr>
+          <w:rStyle w:val="HTMLCode"/>
+          <w:rFonts w:eastAsiaTheme="majorEastAsia"/>
+        </w:rPr>
+        <w:t>machineCode</w:t>
+      </w:r>
+      <w:r>
+        <w:t xml:space="preserve">, </w:t>
+      </w:r>
+      <w:r>
+        <w:rPr>
+          <w:rStyle w:val="HTMLCode"/>
+          <w:rFonts w:eastAsiaTheme="majorEastAsia"/>
+        </w:rPr>
+        <w:t>stepNumber</w:t>
+      </w:r>
+      <w:r>
+        <w:t xml:space="preserve">, </w:t>
+      </w:r>
+      <w:r>
+        <w:rPr>
+          <w:rStyle w:val="HTMLCode"/>
+          <w:rFonts w:eastAsiaTheme="majorEastAsia"/>
+        </w:rPr>
+        <w:t>description</w:t>
+      </w:r>
+      <w:r>
+        <w:t>, and image files.</w:t>
+      </w:r>
+    </w:p>
+    <w:p>
+      <w:pPr>
+        <w:pStyle w:val="Heading4"/>
+      </w:pPr>
+      <w:r>
+        <w:rPr>
           <w:rFonts w:ascii="Segoe UI Emoji" w:hAnsi="Segoe UI Emoji" w:cs="Segoe UI Emoji"/>
         </w:rPr>
-        <w:t>📤</w:t>
-      </w:r>
-      <w:r>
-        <w:t xml:space="preserve"> 1. Upload Multiple OPL Steps</w:t>
+        <w:t>🔧</w:t>
+      </w:r>
+      <w:r>
+        <w:t xml:space="preserve"> Request</w:t>
       </w:r>
     </w:p>
     <w:p>
@@ -93,38 +173,7 @@
         <w:rPr>
           <w:rStyle w:val="Strong"/>
         </w:rPr>
-        <w:t>POST</w:t>
-      </w:r>
-      <w:r>
-        <w:t xml:space="preserve"> </w:t>
-      </w:r>
-      <w:r>
-        <w:rPr>
-          <w:rStyle w:val="HTMLCode"/>
-          <w:rFonts w:eastAsiaTheme="majorEastAsia"/>
-        </w:rPr>
-        <w:t>/</w:t>
-      </w:r>
-      <w:proofErr w:type="spellStart"/>
-      <w:r>
-        <w:rPr>
-          <w:rStyle w:val="HTMLCode"/>
-          <w:rFonts w:eastAsiaTheme="majorEastAsia"/>
-        </w:rPr>
-        <w:t>uploadMultiple</w:t>
-      </w:r>
-      <w:proofErr w:type="spellEnd"/>
-      <w:r>
-        <w:br/>
-        <w:t>Upload multiple steps under one lesson.</w:t>
-      </w:r>
-    </w:p>
-    <w:p>
-      <w:pPr>
-        <w:pStyle w:val="Heading4"/>
-      </w:pPr>
-      <w:r>
-        <w:t>Form Data (Multipart):</w:t>
+        <w:t>Form Data (multipart/form-data):</w:t>
       </w:r>
     </w:p>
     <w:tbl>
@@ -140,10 +189,9 @@
         <w:tblLook w:val="04A0" w:firstRow="1" w:lastRow="0" w:firstColumn="1" w:lastColumn="0" w:noHBand="0" w:noVBand="1"/>
       </w:tblPr>
       <w:tblGrid>
-        <w:gridCol w:w="1516"/>
+        <w:gridCol w:w="1299"/>
         <w:gridCol w:w="564"/>
-        <w:gridCol w:w="887"/>
-        <w:gridCol w:w="5416"/>
+        <w:gridCol w:w="4696"/>
       </w:tblGrid>
       <w:tr>
         <w:trPr>
@@ -215,29 +263,6 @@
                 <w:b/>
                 <w:bCs/>
               </w:rPr>
-              <w:t>Required</w:t>
-            </w:r>
-          </w:p>
-        </w:tc>
-        <w:tc>
-          <w:tcPr>
-            <w:tcW w:w="0" w:type="auto"/>
-            <w:vAlign w:val="center"/>
-            <w:hideMark/>
-          </w:tcPr>
-          <w:p>
-            <w:pPr>
-              <w:jc w:val="center"/>
-              <w:rPr>
-                <w:b/>
-                <w:bCs/>
-              </w:rPr>
-            </w:pPr>
-            <w:r>
-              <w:rPr>
-                <w:b/>
-                <w:bCs/>
-              </w:rPr>
               <w:t>Description</w:t>
             </w:r>
           </w:p>
@@ -254,15 +279,9 @@
             <w:hideMark/>
           </w:tcPr>
           <w:p>
-            <w:proofErr w:type="spellStart"/>
             <w:r>
-              <w:rPr>
-                <w:rStyle w:val="HTMLCode"/>
-                <w:rFonts w:eastAsiaTheme="majorEastAsia"/>
-              </w:rPr>
               <w:t>lessonName</w:t>
             </w:r>
-            <w:proofErr w:type="spellEnd"/>
           </w:p>
         </w:tc>
         <w:tc>
@@ -274,21 +293,6 @@
           <w:p>
             <w:r>
               <w:t>string</w:t>
-            </w:r>
-          </w:p>
-        </w:tc>
-        <w:tc>
-          <w:tcPr>
-            <w:tcW w:w="0" w:type="auto"/>
-            <w:vAlign w:val="center"/>
-            <w:hideMark/>
-          </w:tcPr>
-          <w:p>
-            <w:r>
-              <w:rPr>
-                <w:rFonts w:ascii="Segoe UI Emoji" w:hAnsi="Segoe UI Emoji" w:cs="Segoe UI Emoji"/>
-              </w:rPr>
-              <w:t>✅</w:t>
             </w:r>
           </w:p>
         </w:tc>
@@ -316,15 +320,9 @@
             <w:hideMark/>
           </w:tcPr>
           <w:p>
-            <w:proofErr w:type="spellStart"/>
             <w:r>
-              <w:rPr>
-                <w:rStyle w:val="HTMLCode"/>
-                <w:rFonts w:eastAsiaTheme="majorEastAsia"/>
-              </w:rPr>
               <w:t>machineCode</w:t>
             </w:r>
-            <w:proofErr w:type="spellEnd"/>
           </w:p>
         </w:tc>
         <w:tc>
@@ -347,22 +345,7 @@
           </w:tcPr>
           <w:p>
             <w:r>
-              <w:rPr>
-                <w:rFonts w:ascii="Segoe UI Emoji" w:hAnsi="Segoe UI Emoji" w:cs="Segoe UI Emoji"/>
-              </w:rPr>
-              <w:t>✅</w:t>
-            </w:r>
-          </w:p>
-        </w:tc>
-        <w:tc>
-          <w:tcPr>
-            <w:tcW w:w="0" w:type="auto"/>
-            <w:vAlign w:val="center"/>
-            <w:hideMark/>
-          </w:tcPr>
-          <w:p>
-            <w:r>
-              <w:t>Code of the machine</w:t>
+              <w:t>Machine code</w:t>
             </w:r>
           </w:p>
         </w:tc>
@@ -378,26 +361,8 @@
             <w:hideMark/>
           </w:tcPr>
           <w:p>
-            <w:proofErr w:type="spellStart"/>
             <w:r>
-              <w:rPr>
-                <w:rStyle w:val="HTMLCode"/>
-                <w:rFonts w:eastAsiaTheme="majorEastAsia"/>
-              </w:rPr>
               <w:t>stepNumbers</w:t>
-            </w:r>
-            <w:proofErr w:type="spellEnd"/>
-          </w:p>
-        </w:tc>
-        <w:tc>
-          <w:tcPr>
-            <w:tcW w:w="0" w:type="auto"/>
-            <w:vAlign w:val="center"/>
-            <w:hideMark/>
-          </w:tcPr>
-          <w:p>
-            <w:r>
-              <w:t>array</w:t>
             </w:r>
           </w:p>
         </w:tc>
@@ -409,10 +374,7 @@
           </w:tcPr>
           <w:p>
             <w:r>
-              <w:rPr>
-                <w:rFonts w:ascii="Segoe UI Emoji" w:hAnsi="Segoe UI Emoji" w:cs="Segoe UI Emoji"/>
-              </w:rPr>
-              <w:t>✅</w:t>
+              <w:t>JSON</w:t>
             </w:r>
           </w:p>
         </w:tc>
@@ -424,14 +386,14 @@
           </w:tcPr>
           <w:p>
             <w:r>
-              <w:t xml:space="preserve">JSON string of step numbers (e.g. </w:t>
+              <w:t xml:space="preserve">Array of step numbers (e.g., </w:t>
             </w:r>
             <w:r>
               <w:rPr>
                 <w:rStyle w:val="HTMLCode"/>
                 <w:rFonts w:eastAsiaTheme="majorEastAsia"/>
               </w:rPr>
-              <w:t>[1, 2]</w:t>
+              <w:t>[1,2]</w:t>
             </w:r>
             <w:r>
               <w:t>)</w:t>
@@ -451,10 +413,6 @@
           </w:tcPr>
           <w:p>
             <w:r>
-              <w:rPr>
-                <w:rStyle w:val="HTMLCode"/>
-                <w:rFonts w:eastAsiaTheme="majorEastAsia"/>
-              </w:rPr>
               <w:t>descriptions</w:t>
             </w:r>
           </w:p>
@@ -467,7 +425,7 @@
           </w:tcPr>
           <w:p>
             <w:r>
-              <w:t>array</w:t>
+              <w:t>JSON</w:t>
             </w:r>
           </w:p>
         </w:tc>
@@ -479,29 +437,14 @@
           </w:tcPr>
           <w:p>
             <w:r>
-              <w:rPr>
-                <w:rFonts w:ascii="Segoe UI Emoji" w:hAnsi="Segoe UI Emoji" w:cs="Segoe UI Emoji"/>
-              </w:rPr>
-              <w:t>✅</w:t>
-            </w:r>
-          </w:p>
-        </w:tc>
-        <w:tc>
-          <w:tcPr>
-            <w:tcW w:w="0" w:type="auto"/>
-            <w:vAlign w:val="center"/>
-            <w:hideMark/>
-          </w:tcPr>
-          <w:p>
-            <w:r>
-              <w:t xml:space="preserve">JSON string of descriptions (e.g. </w:t>
+              <w:t xml:space="preserve">Array of descriptions (e.g., </w:t>
             </w:r>
             <w:r>
               <w:rPr>
                 <w:rStyle w:val="HTMLCode"/>
                 <w:rFonts w:eastAsiaTheme="majorEastAsia"/>
               </w:rPr>
-              <w:t>["Step 1", "Step 2"]</w:t>
+              <w:t>["desc1", "desc2"]</w:t>
             </w:r>
             <w:r>
               <w:t>)</w:t>
@@ -521,10 +464,6 @@
           </w:tcPr>
           <w:p>
             <w:r>
-              <w:rPr>
-                <w:rStyle w:val="HTMLCode"/>
-                <w:rFonts w:eastAsiaTheme="majorEastAsia"/>
-              </w:rPr>
               <w:t>images</w:t>
             </w:r>
           </w:p>
@@ -536,13 +475,178 @@
             <w:hideMark/>
           </w:tcPr>
           <w:p>
-            <w:proofErr w:type="gramStart"/>
             <w:r>
-              <w:t>file[</w:t>
+              <w:t>file[]</w:t>
             </w:r>
-            <w:proofErr w:type="gramEnd"/>
+          </w:p>
+        </w:tc>
+        <w:tc>
+          <w:tcPr>
+            <w:tcW w:w="0" w:type="auto"/>
+            <w:vAlign w:val="center"/>
+            <w:hideMark/>
+          </w:tcPr>
+          <w:p>
             <w:r>
-              <w:t>]</w:t>
+              <w:t>Multiple image files (jpg, jpeg, png)</w:t>
+            </w:r>
+          </w:p>
+        </w:tc>
+      </w:tr>
+    </w:tbl>
+    <w:p>
+      <w:pPr>
+        <w:pStyle w:val="Heading4"/>
+      </w:pPr>
+      <w:r>
+        <w:rPr>
+          <w:rFonts w:ascii="Segoe UI Emoji" w:hAnsi="Segoe UI Emoji" w:cs="Segoe UI Emoji"/>
+        </w:rPr>
+        <w:t>🧪</w:t>
+      </w:r>
+      <w:r>
+        <w:t xml:space="preserve"> Example (Postman):</w:t>
+      </w:r>
+    </w:p>
+    <w:tbl>
+      <w:tblPr>
+        <w:tblW w:w="0" w:type="auto"/>
+        <w:tblCellSpacing w:w="15" w:type="dxa"/>
+        <w:tblCellMar>
+          <w:top w:w="15" w:type="dxa"/>
+          <w:left w:w="15" w:type="dxa"/>
+          <w:bottom w:w="15" w:type="dxa"/>
+          <w:right w:w="15" w:type="dxa"/>
+        </w:tblCellMar>
+        <w:tblLook w:val="04A0" w:firstRow="1" w:lastRow="0" w:firstColumn="1" w:lastColumn="0" w:noHBand="0" w:noVBand="1"/>
+      </w:tblPr>
+      <w:tblGrid>
+        <w:gridCol w:w="1299"/>
+        <w:gridCol w:w="3676"/>
+      </w:tblGrid>
+      <w:tr>
+        <w:trPr>
+          <w:tblHeader/>
+          <w:tblCellSpacing w:w="15" w:type="dxa"/>
+        </w:trPr>
+        <w:tc>
+          <w:tcPr>
+            <w:tcW w:w="0" w:type="auto"/>
+            <w:vAlign w:val="center"/>
+            <w:hideMark/>
+          </w:tcPr>
+          <w:p>
+            <w:pPr>
+              <w:jc w:val="center"/>
+              <w:rPr>
+                <w:b/>
+                <w:bCs/>
+              </w:rPr>
+            </w:pPr>
+            <w:r>
+              <w:rPr>
+                <w:b/>
+                <w:bCs/>
+              </w:rPr>
+              <w:t>Key</w:t>
+            </w:r>
+          </w:p>
+        </w:tc>
+        <w:tc>
+          <w:tcPr>
+            <w:tcW w:w="0" w:type="auto"/>
+            <w:vAlign w:val="center"/>
+            <w:hideMark/>
+          </w:tcPr>
+          <w:p>
+            <w:pPr>
+              <w:jc w:val="center"/>
+              <w:rPr>
+                <w:b/>
+                <w:bCs/>
+              </w:rPr>
+            </w:pPr>
+            <w:r>
+              <w:rPr>
+                <w:b/>
+                <w:bCs/>
+              </w:rPr>
+              <w:t>Value</w:t>
+            </w:r>
+          </w:p>
+        </w:tc>
+      </w:tr>
+      <w:tr>
+        <w:trPr>
+          <w:tblCellSpacing w:w="15" w:type="dxa"/>
+        </w:trPr>
+        <w:tc>
+          <w:tcPr>
+            <w:tcW w:w="0" w:type="auto"/>
+            <w:vAlign w:val="center"/>
+            <w:hideMark/>
+          </w:tcPr>
+          <w:p>
+            <w:r>
+              <w:t>lessonName</w:t>
+            </w:r>
+          </w:p>
+        </w:tc>
+        <w:tc>
+          <w:tcPr>
+            <w:tcW w:w="0" w:type="auto"/>
+            <w:vAlign w:val="center"/>
+            <w:hideMark/>
+          </w:tcPr>
+          <w:p>
+            <w:r>
+              <w:t>Safety Tips</w:t>
+            </w:r>
+          </w:p>
+        </w:tc>
+      </w:tr>
+      <w:tr>
+        <w:trPr>
+          <w:tblCellSpacing w:w="15" w:type="dxa"/>
+        </w:trPr>
+        <w:tc>
+          <w:tcPr>
+            <w:tcW w:w="0" w:type="auto"/>
+            <w:vAlign w:val="center"/>
+            <w:hideMark/>
+          </w:tcPr>
+          <w:p>
+            <w:r>
+              <w:t>machineCode</w:t>
+            </w:r>
+          </w:p>
+        </w:tc>
+        <w:tc>
+          <w:tcPr>
+            <w:tcW w:w="0" w:type="auto"/>
+            <w:vAlign w:val="center"/>
+            <w:hideMark/>
+          </w:tcPr>
+          <w:p>
+            <w:r>
+              <w:t>M001</w:t>
+            </w:r>
+          </w:p>
+        </w:tc>
+      </w:tr>
+      <w:tr>
+        <w:trPr>
+          <w:tblCellSpacing w:w="15" w:type="dxa"/>
+        </w:trPr>
+        <w:tc>
+          <w:tcPr>
+            <w:tcW w:w="0" w:type="auto"/>
+            <w:vAlign w:val="center"/>
+            <w:hideMark/>
+          </w:tcPr>
+          <w:p>
+            <w:r>
+              <w:t>stepNumbers</w:t>
             </w:r>
           </w:p>
         </w:tc>
@@ -555,9 +659,27 @@
           <w:p>
             <w:r>
               <w:rPr>
-                <w:rFonts w:ascii="Segoe UI Emoji" w:hAnsi="Segoe UI Emoji" w:cs="Segoe UI Emoji"/>
+                <w:rStyle w:val="HTMLCode"/>
+                <w:rFonts w:eastAsiaTheme="majorEastAsia"/>
               </w:rPr>
-              <w:t>✅</w:t>
+              <w:t>[1,2]</w:t>
+            </w:r>
+          </w:p>
+        </w:tc>
+      </w:tr>
+      <w:tr>
+        <w:trPr>
+          <w:tblCellSpacing w:w="15" w:type="dxa"/>
+        </w:trPr>
+        <w:tc>
+          <w:tcPr>
+            <w:tcW w:w="0" w:type="auto"/>
+            <w:vAlign w:val="center"/>
+            <w:hideMark/>
+          </w:tcPr>
+          <w:p>
+            <w:r>
+              <w:t>descriptions</w:t>
             </w:r>
           </w:p>
         </w:tc>
@@ -569,15 +691,40 @@
           </w:tcPr>
           <w:p>
             <w:r>
-              <w:t>Array of image files (jpg/</w:t>
+              <w:rPr>
+                <w:rStyle w:val="HTMLCode"/>
+                <w:rFonts w:eastAsiaTheme="majorEastAsia"/>
+              </w:rPr>
+              <w:t>["Wear helmet", "Wear gloves"]</w:t>
             </w:r>
-            <w:proofErr w:type="spellStart"/>
+          </w:p>
+        </w:tc>
+      </w:tr>
+      <w:tr>
+        <w:trPr>
+          <w:tblCellSpacing w:w="15" w:type="dxa"/>
+        </w:trPr>
+        <w:tc>
+          <w:tcPr>
+            <w:tcW w:w="0" w:type="auto"/>
+            <w:vAlign w:val="center"/>
+            <w:hideMark/>
+          </w:tcPr>
+          <w:p>
             <w:r>
-              <w:t>png</w:t>
+              <w:t>images</w:t>
             </w:r>
-            <w:proofErr w:type="spellEnd"/>
+          </w:p>
+        </w:tc>
+        <w:tc>
+          <w:tcPr>
+            <w:tcW w:w="0" w:type="auto"/>
+            <w:vAlign w:val="center"/>
+            <w:hideMark/>
+          </w:tcPr>
+          <w:p>
             <w:r>
-              <w:t>/jpeg)</w:t>
+              <w:t>(select 2 image files)</w:t>
             </w:r>
           </w:p>
         </w:tc>
@@ -588,7 +735,882 @@
         <w:pStyle w:val="Heading4"/>
       </w:pPr>
       <w:r>
-        <w:t>Example using Postman:</w:t>
+        <w:rPr>
+          <w:rFonts w:ascii="Segoe UI Emoji" w:hAnsi="Segoe UI Emoji" w:cs="Segoe UI Emoji"/>
+        </w:rPr>
+        <w:lastRenderedPageBreak/>
+        <w:t>✅</w:t>
+      </w:r>
+      <w:r>
+        <w:t xml:space="preserve"> Response</w:t>
+      </w:r>
+    </w:p>
+    <w:p>
+      <w:pPr>
+        <w:pStyle w:val="HTMLPreformatted"/>
+        <w:rPr>
+          <w:rStyle w:val="HTMLCode"/>
+          <w:rFonts w:eastAsiaTheme="majorEastAsia"/>
+        </w:rPr>
+      </w:pPr>
+      <w:r>
+        <w:rPr>
+          <w:rStyle w:val="HTMLCode"/>
+          <w:rFonts w:eastAsiaTheme="majorEastAsia"/>
+        </w:rPr>
+        <w:t>{</w:t>
+      </w:r>
+    </w:p>
+    <w:p>
+      <w:pPr>
+        <w:pStyle w:val="HTMLPreformatted"/>
+        <w:rPr>
+          <w:rStyle w:val="HTMLCode"/>
+          <w:rFonts w:eastAsiaTheme="majorEastAsia"/>
+        </w:rPr>
+      </w:pPr>
+      <w:r>
+        <w:rPr>
+          <w:rStyle w:val="HTMLCode"/>
+          <w:rFonts w:eastAsiaTheme="majorEastAsia"/>
+        </w:rPr>
+        <w:t xml:space="preserve">  "message": "</w:t>
+      </w:r>
+      <w:r>
+        <w:rPr>
+          <w:rStyle w:val="HTMLCode"/>
+          <w:rFonts w:ascii="Segoe UI Emoji" w:eastAsiaTheme="majorEastAsia" w:hAnsi="Segoe UI Emoji" w:cs="Segoe UI Emoji"/>
+        </w:rPr>
+        <w:t>✅</w:t>
+      </w:r>
+      <w:r>
+        <w:rPr>
+          <w:rStyle w:val="HTMLCode"/>
+          <w:rFonts w:eastAsiaTheme="majorEastAsia"/>
+        </w:rPr>
+        <w:t xml:space="preserve"> Steps uploaded successfully",</w:t>
+      </w:r>
+    </w:p>
+    <w:p>
+      <w:pPr>
+        <w:pStyle w:val="HTMLPreformatted"/>
+        <w:rPr>
+          <w:rStyle w:val="HTMLCode"/>
+          <w:rFonts w:eastAsiaTheme="majorEastAsia"/>
+        </w:rPr>
+      </w:pPr>
+      <w:r>
+        <w:rPr>
+          <w:rStyle w:val="HTMLCode"/>
+          <w:rFonts w:eastAsiaTheme="majorEastAsia"/>
+        </w:rPr>
+        <w:t xml:space="preserve">  "steps": [</w:t>
+      </w:r>
+    </w:p>
+    <w:p>
+      <w:pPr>
+        <w:pStyle w:val="HTMLPreformatted"/>
+        <w:rPr>
+          <w:rStyle w:val="HTMLCode"/>
+          <w:rFonts w:eastAsiaTheme="majorEastAsia"/>
+        </w:rPr>
+      </w:pPr>
+      <w:r>
+        <w:rPr>
+          <w:rStyle w:val="HTMLCode"/>
+          <w:rFonts w:eastAsiaTheme="majorEastAsia"/>
+        </w:rPr>
+        <w:t xml:space="preserve">    {</w:t>
+      </w:r>
+    </w:p>
+    <w:p>
+      <w:pPr>
+        <w:pStyle w:val="HTMLPreformatted"/>
+        <w:rPr>
+          <w:rStyle w:val="HTMLCode"/>
+          <w:rFonts w:eastAsiaTheme="majorEastAsia"/>
+        </w:rPr>
+      </w:pPr>
+      <w:r>
+        <w:rPr>
+          <w:rStyle w:val="HTMLCode"/>
+          <w:rFonts w:eastAsiaTheme="majorEastAsia"/>
+        </w:rPr>
+        <w:t xml:space="preserve">      "_id": "665e...",</w:t>
+      </w:r>
+    </w:p>
+    <w:p>
+      <w:pPr>
+        <w:pStyle w:val="HTMLPreformatted"/>
+        <w:rPr>
+          <w:rStyle w:val="HTMLCode"/>
+          <w:rFonts w:eastAsiaTheme="majorEastAsia"/>
+        </w:rPr>
+      </w:pPr>
+      <w:r>
+        <w:rPr>
+          <w:rStyle w:val="HTMLCode"/>
+          <w:rFonts w:eastAsiaTheme="majorEastAsia"/>
+        </w:rPr>
+        <w:t xml:space="preserve">      "lessonName": "Safety Tips",</w:t>
+      </w:r>
+    </w:p>
+    <w:p>
+      <w:pPr>
+        <w:pStyle w:val="HTMLPreformatted"/>
+        <w:rPr>
+          <w:rStyle w:val="HTMLCode"/>
+          <w:rFonts w:eastAsiaTheme="majorEastAsia"/>
+        </w:rPr>
+      </w:pPr>
+      <w:r>
+        <w:rPr>
+          <w:rStyle w:val="HTMLCode"/>
+          <w:rFonts w:eastAsiaTheme="majorEastAsia"/>
+        </w:rPr>
+        <w:t xml:space="preserve">      "machineCode": "M001",</w:t>
+      </w:r>
+    </w:p>
+    <w:p>
+      <w:pPr>
+        <w:pStyle w:val="HTMLPreformatted"/>
+        <w:rPr>
+          <w:rStyle w:val="HTMLCode"/>
+          <w:rFonts w:eastAsiaTheme="majorEastAsia"/>
+        </w:rPr>
+      </w:pPr>
+      <w:r>
+        <w:rPr>
+          <w:rStyle w:val="HTMLCode"/>
+          <w:rFonts w:eastAsiaTheme="majorEastAsia"/>
+        </w:rPr>
+        <w:t xml:space="preserve">      "stepNumber": 1,</w:t>
+      </w:r>
+    </w:p>
+    <w:p>
+      <w:pPr>
+        <w:pStyle w:val="HTMLPreformatted"/>
+        <w:rPr>
+          <w:rStyle w:val="HTMLCode"/>
+          <w:rFonts w:eastAsiaTheme="majorEastAsia"/>
+        </w:rPr>
+      </w:pPr>
+      <w:r>
+        <w:rPr>
+          <w:rStyle w:val="HTMLCode"/>
+          <w:rFonts w:eastAsiaTheme="majorEastAsia"/>
+        </w:rPr>
+        <w:t xml:space="preserve">      "description": "Wear helmet",</w:t>
+      </w:r>
+    </w:p>
+    <w:p>
+      <w:pPr>
+        <w:pStyle w:val="HTMLPreformatted"/>
+        <w:rPr>
+          <w:rStyle w:val="HTMLCode"/>
+          <w:rFonts w:eastAsiaTheme="majorEastAsia"/>
+        </w:rPr>
+      </w:pPr>
+      <w:r>
+        <w:rPr>
+          <w:rStyle w:val="HTMLCode"/>
+          <w:rFonts w:eastAsiaTheme="majorEastAsia"/>
+        </w:rPr>
+        <w:t xml:space="preserve">      "imagePath": "uploads/onepointlesson2p0/...",</w:t>
+      </w:r>
+    </w:p>
+    <w:p>
+      <w:pPr>
+        <w:pStyle w:val="HTMLPreformatted"/>
+        <w:rPr>
+          <w:rStyle w:val="HTMLCode"/>
+          <w:rFonts w:eastAsiaTheme="majorEastAsia"/>
+        </w:rPr>
+      </w:pPr>
+      <w:r>
+        <w:rPr>
+          <w:rStyle w:val="HTMLCode"/>
+          <w:rFonts w:eastAsiaTheme="majorEastAsia"/>
+        </w:rPr>
+        <w:t xml:space="preserve">    }</w:t>
+      </w:r>
+    </w:p>
+    <w:p>
+      <w:pPr>
+        <w:pStyle w:val="HTMLPreformatted"/>
+        <w:rPr>
+          <w:rStyle w:val="HTMLCode"/>
+          <w:rFonts w:eastAsiaTheme="majorEastAsia"/>
+        </w:rPr>
+      </w:pPr>
+      <w:r>
+        <w:rPr>
+          <w:rStyle w:val="HTMLCode"/>
+          <w:rFonts w:eastAsiaTheme="majorEastAsia"/>
+        </w:rPr>
+        <w:t xml:space="preserve">  ]</w:t>
+      </w:r>
+    </w:p>
+    <w:p>
+      <w:pPr>
+        <w:pStyle w:val="HTMLPreformatted"/>
+        <w:rPr>
+          <w:rStyle w:val="HTMLCode"/>
+          <w:rFonts w:eastAsiaTheme="majorEastAsia"/>
+        </w:rPr>
+      </w:pPr>
+      <w:r>
+        <w:rPr>
+          <w:rStyle w:val="HTMLCode"/>
+          <w:rFonts w:eastAsiaTheme="majorEastAsia"/>
+        </w:rPr>
+        <w:t>}</w:t>
+      </w:r>
+    </w:p>
+    <w:p>
+      <w:r>
+        <w:pict w14:anchorId="39507E58">
+          <v:rect id="_x0000_i1041" style="width:0;height:1.5pt" o:hralign="center" o:hrstd="t" o:hr="t" fillcolor="#a0a0a0" stroked="f"/>
+        </w:pict>
+      </w:r>
+    </w:p>
+    <w:p>
+      <w:pPr>
+        <w:pStyle w:val="Heading2"/>
+      </w:pPr>
+      <w:r>
+        <w:rPr>
+          <w:rFonts w:ascii="Segoe UI Emoji" w:hAnsi="Segoe UI Emoji" w:cs="Segoe UI Emoji"/>
+        </w:rPr>
+        <w:t>🔍</w:t>
+      </w:r>
+      <w:r>
+        <w:t xml:space="preserve"> 2. Get All Steps by Machine Code</w:t>
+      </w:r>
+    </w:p>
+    <w:p>
+      <w:pPr>
+        <w:pStyle w:val="Heading3"/>
+      </w:pPr>
+      <w:r>
+        <w:rPr>
+          <w:rStyle w:val="HTMLCode"/>
+          <w:rFonts w:eastAsiaTheme="majorEastAsia"/>
+        </w:rPr>
+        <w:t>GET /:machineCode</w:t>
+      </w:r>
+    </w:p>
+    <w:p>
+      <w:pPr>
+        <w:pStyle w:val="Heading4"/>
+      </w:pPr>
+      <w:r>
+        <w:rPr>
+          <w:rFonts w:ascii="Segoe UI Emoji" w:hAnsi="Segoe UI Emoji" w:cs="Segoe UI Emoji"/>
+        </w:rPr>
+        <w:t>✅</w:t>
+      </w:r>
+      <w:r>
+        <w:t xml:space="preserve"> Example</w:t>
+      </w:r>
+    </w:p>
+    <w:p>
+      <w:pPr>
+        <w:pStyle w:val="HTMLPreformatted"/>
+        <w:rPr>
+          <w:rStyle w:val="HTMLCode"/>
+          <w:rFonts w:eastAsiaTheme="majorEastAsia"/>
+        </w:rPr>
+      </w:pPr>
+      <w:r>
+        <w:rPr>
+          <w:rStyle w:val="HTMLCode"/>
+          <w:rFonts w:eastAsiaTheme="majorEastAsia"/>
+        </w:rPr>
+        <w:t>GET /api/onepointlesson2p0/M001</w:t>
+      </w:r>
+    </w:p>
+    <w:p>
+      <w:pPr>
+        <w:pStyle w:val="Heading4"/>
+      </w:pPr>
+      <w:r>
+        <w:rPr>
+          <w:rFonts w:ascii="Segoe UI Emoji" w:hAnsi="Segoe UI Emoji" w:cs="Segoe UI Emoji"/>
+        </w:rPr>
+        <w:t>🔁</w:t>
+      </w:r>
+      <w:r>
+        <w:t xml:space="preserve"> Response</w:t>
+      </w:r>
+    </w:p>
+    <w:p>
+      <w:pPr>
+        <w:pStyle w:val="HTMLPreformatted"/>
+        <w:rPr>
+          <w:rStyle w:val="HTMLCode"/>
+          <w:rFonts w:eastAsiaTheme="majorEastAsia"/>
+        </w:rPr>
+      </w:pPr>
+      <w:r>
+        <w:rPr>
+          <w:rStyle w:val="HTMLCode"/>
+          <w:rFonts w:eastAsiaTheme="majorEastAsia"/>
+        </w:rPr>
+        <w:t>[</w:t>
+      </w:r>
+    </w:p>
+    <w:p>
+      <w:pPr>
+        <w:pStyle w:val="HTMLPreformatted"/>
+        <w:rPr>
+          <w:rStyle w:val="HTMLCode"/>
+          <w:rFonts w:eastAsiaTheme="majorEastAsia"/>
+        </w:rPr>
+      </w:pPr>
+      <w:r>
+        <w:rPr>
+          <w:rStyle w:val="HTMLCode"/>
+          <w:rFonts w:eastAsiaTheme="majorEastAsia"/>
+        </w:rPr>
+        <w:t xml:space="preserve">  {</w:t>
+      </w:r>
+    </w:p>
+    <w:p>
+      <w:pPr>
+        <w:pStyle w:val="HTMLPreformatted"/>
+        <w:rPr>
+          <w:rStyle w:val="HTMLCode"/>
+          <w:rFonts w:eastAsiaTheme="majorEastAsia"/>
+        </w:rPr>
+      </w:pPr>
+      <w:r>
+        <w:rPr>
+          <w:rStyle w:val="HTMLCode"/>
+          <w:rFonts w:eastAsiaTheme="majorEastAsia"/>
+        </w:rPr>
+        <w:t xml:space="preserve">    "_id": "665e...",</w:t>
+      </w:r>
+    </w:p>
+    <w:p>
+      <w:pPr>
+        <w:pStyle w:val="HTMLPreformatted"/>
+        <w:rPr>
+          <w:rStyle w:val="HTMLCode"/>
+          <w:rFonts w:eastAsiaTheme="majorEastAsia"/>
+        </w:rPr>
+      </w:pPr>
+      <w:r>
+        <w:rPr>
+          <w:rStyle w:val="HTMLCode"/>
+          <w:rFonts w:eastAsiaTheme="majorEastAsia"/>
+        </w:rPr>
+        <w:t xml:space="preserve">    "lessonName": "Safety Tips",</w:t>
+      </w:r>
+    </w:p>
+    <w:p>
+      <w:pPr>
+        <w:pStyle w:val="HTMLPreformatted"/>
+        <w:rPr>
+          <w:rStyle w:val="HTMLCode"/>
+          <w:rFonts w:eastAsiaTheme="majorEastAsia"/>
+        </w:rPr>
+      </w:pPr>
+      <w:r>
+        <w:rPr>
+          <w:rStyle w:val="HTMLCode"/>
+          <w:rFonts w:eastAsiaTheme="majorEastAsia"/>
+        </w:rPr>
+        <w:t xml:space="preserve">    "machineCode": "M001",</w:t>
+      </w:r>
+    </w:p>
+    <w:p>
+      <w:pPr>
+        <w:pStyle w:val="HTMLPreformatted"/>
+        <w:rPr>
+          <w:rStyle w:val="HTMLCode"/>
+          <w:rFonts w:eastAsiaTheme="majorEastAsia"/>
+        </w:rPr>
+      </w:pPr>
+      <w:r>
+        <w:rPr>
+          <w:rStyle w:val="HTMLCode"/>
+          <w:rFonts w:eastAsiaTheme="majorEastAsia"/>
+        </w:rPr>
+        <w:t xml:space="preserve">    "stepNumber": 1,</w:t>
+      </w:r>
+    </w:p>
+    <w:p>
+      <w:pPr>
+        <w:pStyle w:val="HTMLPreformatted"/>
+        <w:rPr>
+          <w:rStyle w:val="HTMLCode"/>
+          <w:rFonts w:eastAsiaTheme="majorEastAsia"/>
+        </w:rPr>
+      </w:pPr>
+      <w:r>
+        <w:rPr>
+          <w:rStyle w:val="HTMLCode"/>
+          <w:rFonts w:eastAsiaTheme="majorEastAsia"/>
+        </w:rPr>
+        <w:t xml:space="preserve">    "description": "Wear helmet",</w:t>
+      </w:r>
+    </w:p>
+    <w:p>
+      <w:pPr>
+        <w:pStyle w:val="HTMLPreformatted"/>
+        <w:rPr>
+          <w:rStyle w:val="HTMLCode"/>
+          <w:rFonts w:eastAsiaTheme="majorEastAsia"/>
+        </w:rPr>
+      </w:pPr>
+      <w:r>
+        <w:rPr>
+          <w:rStyle w:val="HTMLCode"/>
+          <w:rFonts w:eastAsiaTheme="majorEastAsia"/>
+        </w:rPr>
+        <w:t xml:space="preserve">    "imagePath": "uploads/onepointlesson2p0/...",</w:t>
+      </w:r>
+    </w:p>
+    <w:p>
+      <w:pPr>
+        <w:pStyle w:val="HTMLPreformatted"/>
+        <w:rPr>
+          <w:rStyle w:val="HTMLCode"/>
+          <w:rFonts w:eastAsiaTheme="majorEastAsia"/>
+        </w:rPr>
+      </w:pPr>
+      <w:r>
+        <w:rPr>
+          <w:rStyle w:val="HTMLCode"/>
+          <w:rFonts w:eastAsiaTheme="majorEastAsia"/>
+        </w:rPr>
+        <w:t xml:space="preserve">  }</w:t>
+      </w:r>
+    </w:p>
+    <w:p>
+      <w:pPr>
+        <w:pStyle w:val="HTMLPreformatted"/>
+        <w:rPr>
+          <w:rStyle w:val="HTMLCode"/>
+          <w:rFonts w:eastAsiaTheme="majorEastAsia"/>
+        </w:rPr>
+      </w:pPr>
+      <w:r>
+        <w:rPr>
+          <w:rStyle w:val="HTMLCode"/>
+          <w:rFonts w:eastAsiaTheme="majorEastAsia"/>
+        </w:rPr>
+        <w:t>]</w:t>
+      </w:r>
+    </w:p>
+    <w:p>
+      <w:r>
+        <w:pict w14:anchorId="600BD87F">
+          <v:rect id="_x0000_i1042" style="width:0;height:1.5pt" o:hralign="center" o:hrstd="t" o:hr="t" fillcolor="#a0a0a0" stroked="f"/>
+        </w:pict>
+      </w:r>
+    </w:p>
+    <w:p>
+      <w:pPr>
+        <w:pStyle w:val="Heading2"/>
+      </w:pPr>
+      <w:r>
+        <w:rPr>
+          <w:rFonts w:ascii="Segoe UI Emoji" w:hAnsi="Segoe UI Emoji" w:cs="Segoe UI Emoji"/>
+        </w:rPr>
+        <w:t>🗑️</w:t>
+      </w:r>
+      <w:r>
+        <w:t xml:space="preserve"> 3. Delete Step by ID</w:t>
+      </w:r>
+    </w:p>
+    <w:p>
+      <w:pPr>
+        <w:pStyle w:val="Heading3"/>
+      </w:pPr>
+      <w:r>
+        <w:rPr>
+          <w:rStyle w:val="HTMLCode"/>
+          <w:rFonts w:eastAsiaTheme="majorEastAsia"/>
+        </w:rPr>
+        <w:t>DELETE /step/:id</w:t>
+      </w:r>
+    </w:p>
+    <w:p>
+      <w:pPr>
+        <w:pStyle w:val="NormalWeb"/>
+      </w:pPr>
+      <w:r>
+        <w:t xml:space="preserve">Deletes a specific step by its MongoDB </w:t>
+      </w:r>
+      <w:r>
+        <w:rPr>
+          <w:rStyle w:val="HTMLCode"/>
+          <w:rFonts w:eastAsiaTheme="majorEastAsia"/>
+        </w:rPr>
+        <w:t>_id</w:t>
+      </w:r>
+      <w:r>
+        <w:t>.</w:t>
+      </w:r>
+    </w:p>
+    <w:p>
+      <w:pPr>
+        <w:pStyle w:val="Heading4"/>
+      </w:pPr>
+      <w:r>
+        <w:rPr>
+          <w:rFonts w:ascii="Segoe UI Emoji" w:hAnsi="Segoe UI Emoji" w:cs="Segoe UI Emoji"/>
+        </w:rPr>
+        <w:t>✅</w:t>
+      </w:r>
+      <w:r>
+        <w:t xml:space="preserve"> Example</w:t>
+      </w:r>
+    </w:p>
+    <w:p>
+      <w:pPr>
+        <w:pStyle w:val="HTMLPreformatted"/>
+        <w:rPr>
+          <w:rStyle w:val="HTMLCode"/>
+          <w:rFonts w:eastAsiaTheme="majorEastAsia"/>
+        </w:rPr>
+      </w:pPr>
+      <w:r>
+        <w:rPr>
+          <w:rStyle w:val="HTMLCode"/>
+          <w:rFonts w:eastAsiaTheme="majorEastAsia"/>
+        </w:rPr>
+        <w:t>DELETE /api/onepointlesson2p0/step/665e8a58fa9015dbdc424939</w:t>
+      </w:r>
+    </w:p>
+    <w:p>
+      <w:pPr>
+        <w:pStyle w:val="Heading4"/>
+      </w:pPr>
+      <w:r>
+        <w:rPr>
+          <w:rFonts w:ascii="Segoe UI Emoji" w:hAnsi="Segoe UI Emoji" w:cs="Segoe UI Emoji"/>
+        </w:rPr>
+        <w:t>🔁</w:t>
+      </w:r>
+      <w:r>
+        <w:t xml:space="preserve"> Response</w:t>
+      </w:r>
+    </w:p>
+    <w:p>
+      <w:pPr>
+        <w:pStyle w:val="HTMLPreformatted"/>
+        <w:rPr>
+          <w:rStyle w:val="HTMLCode"/>
+          <w:rFonts w:eastAsiaTheme="majorEastAsia"/>
+        </w:rPr>
+      </w:pPr>
+      <w:r>
+        <w:rPr>
+          <w:rStyle w:val="HTMLCode"/>
+          <w:rFonts w:eastAsiaTheme="majorEastAsia"/>
+        </w:rPr>
+        <w:t>{</w:t>
+      </w:r>
+    </w:p>
+    <w:p>
+      <w:pPr>
+        <w:pStyle w:val="HTMLPreformatted"/>
+        <w:rPr>
+          <w:rStyle w:val="HTMLCode"/>
+          <w:rFonts w:eastAsiaTheme="majorEastAsia"/>
+        </w:rPr>
+      </w:pPr>
+      <w:r>
+        <w:rPr>
+          <w:rStyle w:val="HTMLCode"/>
+          <w:rFonts w:eastAsiaTheme="majorEastAsia"/>
+        </w:rPr>
+        <w:t xml:space="preserve">  "message": "</w:t>
+      </w:r>
+      <w:r>
+        <w:rPr>
+          <w:rStyle w:val="HTMLCode"/>
+          <w:rFonts w:ascii="Segoe UI Emoji" w:eastAsiaTheme="majorEastAsia" w:hAnsi="Segoe UI Emoji" w:cs="Segoe UI Emoji"/>
+        </w:rPr>
+        <w:t>✅</w:t>
+      </w:r>
+      <w:r>
+        <w:rPr>
+          <w:rStyle w:val="HTMLCode"/>
+          <w:rFonts w:eastAsiaTheme="majorEastAsia"/>
+        </w:rPr>
+        <w:t xml:space="preserve"> Step deleted successfully",</w:t>
+      </w:r>
+    </w:p>
+    <w:p>
+      <w:pPr>
+        <w:pStyle w:val="HTMLPreformatted"/>
+        <w:rPr>
+          <w:rStyle w:val="HTMLCode"/>
+          <w:rFonts w:eastAsiaTheme="majorEastAsia"/>
+        </w:rPr>
+      </w:pPr>
+      <w:r>
+        <w:rPr>
+          <w:rStyle w:val="HTMLCode"/>
+          <w:rFonts w:eastAsiaTheme="majorEastAsia"/>
+        </w:rPr>
+        <w:t xml:space="preserve">  "step": {</w:t>
+      </w:r>
+    </w:p>
+    <w:p>
+      <w:pPr>
+        <w:pStyle w:val="HTMLPreformatted"/>
+        <w:rPr>
+          <w:rStyle w:val="HTMLCode"/>
+          <w:rFonts w:eastAsiaTheme="majorEastAsia"/>
+        </w:rPr>
+      </w:pPr>
+      <w:r>
+        <w:rPr>
+          <w:rStyle w:val="HTMLCode"/>
+          <w:rFonts w:eastAsiaTheme="majorEastAsia"/>
+        </w:rPr>
+        <w:t xml:space="preserve">    "_id": "665e...",</w:t>
+      </w:r>
+    </w:p>
+    <w:p>
+      <w:pPr>
+        <w:pStyle w:val="HTMLPreformatted"/>
+        <w:rPr>
+          <w:rStyle w:val="HTMLCode"/>
+          <w:rFonts w:eastAsiaTheme="majorEastAsia"/>
+        </w:rPr>
+      </w:pPr>
+      <w:r>
+        <w:rPr>
+          <w:rStyle w:val="HTMLCode"/>
+          <w:rFonts w:eastAsiaTheme="majorEastAsia"/>
+        </w:rPr>
+        <w:t xml:space="preserve">    ...</w:t>
+      </w:r>
+    </w:p>
+    <w:p>
+      <w:pPr>
+        <w:pStyle w:val="HTMLPreformatted"/>
+        <w:rPr>
+          <w:rStyle w:val="HTMLCode"/>
+          <w:rFonts w:eastAsiaTheme="majorEastAsia"/>
+        </w:rPr>
+      </w:pPr>
+      <w:r>
+        <w:rPr>
+          <w:rStyle w:val="HTMLCode"/>
+          <w:rFonts w:eastAsiaTheme="majorEastAsia"/>
+        </w:rPr>
+        <w:t xml:space="preserve">  }</w:t>
+      </w:r>
+    </w:p>
+    <w:p>
+      <w:pPr>
+        <w:pStyle w:val="HTMLPreformatted"/>
+        <w:rPr>
+          <w:rStyle w:val="HTMLCode"/>
+          <w:rFonts w:eastAsiaTheme="majorEastAsia"/>
+        </w:rPr>
+      </w:pPr>
+      <w:r>
+        <w:rPr>
+          <w:rStyle w:val="HTMLCode"/>
+          <w:rFonts w:eastAsiaTheme="majorEastAsia"/>
+        </w:rPr>
+        <w:t>}</w:t>
+      </w:r>
+    </w:p>
+    <w:p>
+      <w:r>
+        <w:pict w14:anchorId="417D7ADF">
+          <v:rect id="_x0000_i1043" style="width:0;height:1.5pt" o:hralign="center" o:hrstd="t" o:hr="t" fillcolor="#a0a0a0" stroked="f"/>
+        </w:pict>
+      </w:r>
+    </w:p>
+    <w:p>
+      <w:pPr>
+        <w:pStyle w:val="Heading2"/>
+      </w:pPr>
+      <w:r>
+        <w:rPr>
+          <w:rFonts w:ascii="Segoe UI Emoji" w:hAnsi="Segoe UI Emoji" w:cs="Segoe UI Emoji"/>
+        </w:rPr>
+        <w:lastRenderedPageBreak/>
+        <w:t>🗑️</w:t>
+      </w:r>
+      <w:r>
+        <w:t xml:space="preserve"> 4. Delete All Steps by Machine Code</w:t>
+      </w:r>
+    </w:p>
+    <w:p>
+      <w:pPr>
+        <w:pStyle w:val="Heading3"/>
+      </w:pPr>
+      <w:r>
+        <w:rPr>
+          <w:rStyle w:val="HTMLCode"/>
+          <w:rFonts w:eastAsiaTheme="majorEastAsia"/>
+        </w:rPr>
+        <w:t>DELETE /all/:machineCode</w:t>
+      </w:r>
+    </w:p>
+    <w:p>
+      <w:pPr>
+        <w:pStyle w:val="NormalWeb"/>
+      </w:pPr>
+      <w:r>
+        <w:t xml:space="preserve">Deletes </w:t>
+      </w:r>
+      <w:r>
+        <w:rPr>
+          <w:rStyle w:val="Strong"/>
+        </w:rPr>
+        <w:t>all steps</w:t>
+      </w:r>
+      <w:r>
+        <w:t xml:space="preserve"> associated with a particular </w:t>
+      </w:r>
+      <w:r>
+        <w:rPr>
+          <w:rStyle w:val="HTMLCode"/>
+          <w:rFonts w:eastAsiaTheme="majorEastAsia"/>
+        </w:rPr>
+        <w:t>machineCode</w:t>
+      </w:r>
+      <w:r>
+        <w:t>.</w:t>
+      </w:r>
+    </w:p>
+    <w:p>
+      <w:pPr>
+        <w:pStyle w:val="Heading4"/>
+      </w:pPr>
+      <w:r>
+        <w:rPr>
+          <w:rFonts w:ascii="Segoe UI Emoji" w:hAnsi="Segoe UI Emoji" w:cs="Segoe UI Emoji"/>
+        </w:rPr>
+        <w:t>✅</w:t>
+      </w:r>
+      <w:r>
+        <w:t xml:space="preserve"> Example</w:t>
+      </w:r>
+    </w:p>
+    <w:p>
+      <w:pPr>
+        <w:pStyle w:val="HTMLPreformatted"/>
+        <w:rPr>
+          <w:rStyle w:val="HTMLCode"/>
+          <w:rFonts w:eastAsiaTheme="majorEastAsia"/>
+        </w:rPr>
+      </w:pPr>
+      <w:r>
+        <w:rPr>
+          <w:rStyle w:val="HTMLCode"/>
+          <w:rFonts w:eastAsiaTheme="majorEastAsia"/>
+        </w:rPr>
+        <w:t>DELETE /api/onepointlesson2p0/all/M001</w:t>
+      </w:r>
+    </w:p>
+    <w:p>
+      <w:pPr>
+        <w:pStyle w:val="Heading4"/>
+      </w:pPr>
+      <w:r>
+        <w:rPr>
+          <w:rFonts w:ascii="Segoe UI Emoji" w:hAnsi="Segoe UI Emoji" w:cs="Segoe UI Emoji"/>
+        </w:rPr>
+        <w:t>🔁</w:t>
+      </w:r>
+      <w:r>
+        <w:t xml:space="preserve"> Response</w:t>
+      </w:r>
+    </w:p>
+    <w:p>
+      <w:pPr>
+        <w:pStyle w:val="HTMLPreformatted"/>
+        <w:rPr>
+          <w:rStyle w:val="HTMLCode"/>
+          <w:rFonts w:eastAsiaTheme="majorEastAsia"/>
+        </w:rPr>
+      </w:pPr>
+      <w:r>
+        <w:rPr>
+          <w:rStyle w:val="HTMLCode"/>
+          <w:rFonts w:eastAsiaTheme="majorEastAsia"/>
+        </w:rPr>
+        <w:t>{</w:t>
+      </w:r>
+    </w:p>
+    <w:p>
+      <w:pPr>
+        <w:pStyle w:val="HTMLPreformatted"/>
+        <w:rPr>
+          <w:rStyle w:val="HTMLCode"/>
+          <w:rFonts w:eastAsiaTheme="majorEastAsia"/>
+        </w:rPr>
+      </w:pPr>
+      <w:r>
+        <w:rPr>
+          <w:rStyle w:val="HTMLCode"/>
+          <w:rFonts w:eastAsiaTheme="majorEastAsia"/>
+        </w:rPr>
+        <w:t xml:space="preserve">  "message": "</w:t>
+      </w:r>
+      <w:r>
+        <w:rPr>
+          <w:rStyle w:val="HTMLCode"/>
+          <w:rFonts w:ascii="Segoe UI Emoji" w:eastAsiaTheme="majorEastAsia" w:hAnsi="Segoe UI Emoji" w:cs="Segoe UI Emoji"/>
+        </w:rPr>
+        <w:t>✅</w:t>
+      </w:r>
+      <w:r>
+        <w:rPr>
+          <w:rStyle w:val="HTMLCode"/>
+          <w:rFonts w:eastAsiaTheme="majorEastAsia"/>
+        </w:rPr>
+        <w:t xml:space="preserve"> Deleted 5 steps for machineCode M001"</w:t>
+      </w:r>
+    </w:p>
+    <w:p>
+      <w:pPr>
+        <w:pStyle w:val="HTMLPreformatted"/>
+        <w:rPr>
+          <w:rStyle w:val="HTMLCode"/>
+          <w:rFonts w:eastAsiaTheme="majorEastAsia"/>
+        </w:rPr>
+      </w:pPr>
+      <w:r>
+        <w:rPr>
+          <w:rStyle w:val="HTMLCode"/>
+          <w:rFonts w:eastAsiaTheme="majorEastAsia"/>
+        </w:rPr>
+        <w:t>}</w:t>
+      </w:r>
+    </w:p>
+    <w:p>
+      <w:r>
+        <w:pict w14:anchorId="05DF84B9">
+          <v:rect id="_x0000_i1044" style="width:0;height:1.5pt" o:hralign="center" o:hrstd="t" o:hr="t" fillcolor="#a0a0a0" stroked="f"/>
+        </w:pict>
+      </w:r>
+    </w:p>
+    <w:p>
+      <w:pPr>
+        <w:pStyle w:val="Heading2"/>
+      </w:pPr>
+      <w:r>
+        <w:rPr>
+          <w:rFonts w:ascii="Segoe UI Emoji" w:hAnsi="Segoe UI Emoji" w:cs="Segoe UI Emoji"/>
+        </w:rPr>
+        <w:t>✅</w:t>
+      </w:r>
+      <w:r>
+        <w:t xml:space="preserve"> Notes for Frontend</w:t>
       </w:r>
     </w:p>
     <w:p>
@@ -596,27 +1618,11 @@
         <w:pStyle w:val="NormalWeb"/>
         <w:numPr>
           <w:ilvl w:val="0"/>
-          <w:numId w:val="15"/>
+          <w:numId w:val="17"/>
         </w:numPr>
       </w:pPr>
-      <w:proofErr w:type="spellStart"/>
-      <w:r>
-        <w:rPr>
-          <w:rStyle w:val="HTMLCode"/>
-          <w:rFonts w:eastAsiaTheme="majorEastAsia"/>
-        </w:rPr>
-        <w:t>stepNumbers</w:t>
-      </w:r>
-      <w:proofErr w:type="spellEnd"/>
-      <w:r>
-        <w:t xml:space="preserve">: </w:t>
-      </w:r>
-      <w:r>
-        <w:rPr>
-          <w:rStyle w:val="HTMLCode"/>
-          <w:rFonts w:eastAsiaTheme="majorEastAsia"/>
-        </w:rPr>
-        <w:t>["1","2"]</w:t>
+      <w:r>
+        <w:t>All form-data keys must match exactly (especially for upload).</w:t>
       </w:r>
     </w:p>
     <w:p>
@@ -624,7 +1630,7 @@
         <w:pStyle w:val="NormalWeb"/>
         <w:numPr>
           <w:ilvl w:val="0"/>
-          <w:numId w:val="15"/>
+          <w:numId w:val="17"/>
         </w:numPr>
       </w:pPr>
       <w:r>
@@ -632,33 +1638,40 @@
           <w:rStyle w:val="HTMLCode"/>
           <w:rFonts w:eastAsiaTheme="majorEastAsia"/>
         </w:rPr>
+        <w:t>stepNumbers</w:t>
+      </w:r>
+      <w:r>
+        <w:t xml:space="preserve"> and </w:t>
+      </w:r>
+      <w:r>
+        <w:rPr>
+          <w:rStyle w:val="HTMLCode"/>
+          <w:rFonts w:eastAsiaTheme="majorEastAsia"/>
+        </w:rPr>
         <w:t>descriptions</w:t>
       </w:r>
       <w:r>
-        <w:t xml:space="preserve">: </w:t>
-      </w:r>
-      <w:r>
-        <w:rPr>
-          <w:rStyle w:val="HTMLCode"/>
-          <w:rFonts w:eastAsiaTheme="majorEastAsia"/>
-        </w:rPr>
-        <w:t xml:space="preserve">["Turn off </w:t>
-      </w:r>
-      <w:proofErr w:type="spellStart"/>
-      <w:r>
-        <w:rPr>
-          <w:rStyle w:val="HTMLCode"/>
-          <w:rFonts w:eastAsiaTheme="majorEastAsia"/>
-        </w:rPr>
-        <w:t>power","Check</w:t>
-      </w:r>
-      <w:proofErr w:type="spellEnd"/>
-      <w:r>
-        <w:rPr>
-          <w:rStyle w:val="HTMLCode"/>
-          <w:rFonts w:eastAsiaTheme="majorEastAsia"/>
-        </w:rPr>
-        <w:t xml:space="preserve"> screw"]</w:t>
+        <w:t xml:space="preserve"> must be JSON strings (</w:t>
+      </w:r>
+      <w:r>
+        <w:rPr>
+          <w:rStyle w:val="HTMLCode"/>
+          <w:rFonts w:eastAsiaTheme="majorEastAsia"/>
+        </w:rPr>
+        <w:t>["1","2"]</w:t>
+      </w:r>
+      <w:r>
+        <w:t xml:space="preserve">, not </w:t>
+      </w:r>
+      <w:r>
+        <w:rPr>
+          <w:rStyle w:val="HTMLCode"/>
+          <w:rFonts w:eastAsiaTheme="majorEastAsia"/>
+        </w:rPr>
+        <w:t>1,2</w:t>
+      </w:r>
+      <w:r>
+        <w:t>).</w:t>
       </w:r>
     </w:p>
     <w:p>
@@ -666,528 +1679,11 @@
         <w:pStyle w:val="NormalWeb"/>
         <w:numPr>
           <w:ilvl w:val="0"/>
-          <w:numId w:val="15"/>
+          <w:numId w:val="17"/>
         </w:numPr>
       </w:pPr>
       <w:r>
-        <w:rPr>
-          <w:rStyle w:val="HTMLCode"/>
-          <w:rFonts w:eastAsiaTheme="majorEastAsia"/>
-        </w:rPr>
-        <w:t>images</w:t>
-      </w:r>
-      <w:r>
-        <w:t>: Upload 2 image files (same order as steps)</w:t>
-      </w:r>
-    </w:p>
-    <w:p>
-      <w:pPr>
-        <w:pStyle w:val="Heading4"/>
-      </w:pPr>
-      <w:r>
-        <w:t>Response:</w:t>
-      </w:r>
-    </w:p>
-    <w:p>
-      <w:pPr>
-        <w:pStyle w:val="HTMLPreformatted"/>
-        <w:rPr>
-          <w:rStyle w:val="HTMLCode"/>
-          <w:rFonts w:eastAsiaTheme="majorEastAsia"/>
-        </w:rPr>
-      </w:pPr>
-      <w:r>
-        <w:rPr>
-          <w:rStyle w:val="HTMLCode"/>
-          <w:rFonts w:eastAsiaTheme="majorEastAsia"/>
-        </w:rPr>
-        <w:t>{</w:t>
-      </w:r>
-    </w:p>
-    <w:p>
-      <w:pPr>
-        <w:pStyle w:val="HTMLPreformatted"/>
-        <w:rPr>
-          <w:rStyle w:val="HTMLCode"/>
-          <w:rFonts w:eastAsiaTheme="majorEastAsia"/>
-        </w:rPr>
-      </w:pPr>
-      <w:r>
-        <w:rPr>
-          <w:rStyle w:val="HTMLCode"/>
-          <w:rFonts w:eastAsiaTheme="majorEastAsia"/>
-        </w:rPr>
-        <w:t xml:space="preserve">  "message": "</w:t>
-      </w:r>
-      <w:r>
-        <w:rPr>
-          <w:rStyle w:val="HTMLCode"/>
-          <w:rFonts w:ascii="Segoe UI Emoji" w:eastAsiaTheme="majorEastAsia" w:hAnsi="Segoe UI Emoji" w:cs="Segoe UI Emoji"/>
-        </w:rPr>
-        <w:t>✅</w:t>
-      </w:r>
-      <w:r>
-        <w:rPr>
-          <w:rStyle w:val="HTMLCode"/>
-          <w:rFonts w:eastAsiaTheme="majorEastAsia"/>
-        </w:rPr>
-        <w:t xml:space="preserve"> Steps uploaded successfully",</w:t>
-      </w:r>
-    </w:p>
-    <w:p>
-      <w:pPr>
-        <w:pStyle w:val="HTMLPreformatted"/>
-        <w:rPr>
-          <w:rStyle w:val="HTMLCode"/>
-          <w:rFonts w:eastAsiaTheme="majorEastAsia"/>
-        </w:rPr>
-      </w:pPr>
-      <w:r>
-        <w:rPr>
-          <w:rStyle w:val="HTMLCode"/>
-          <w:rFonts w:eastAsiaTheme="majorEastAsia"/>
-        </w:rPr>
-        <w:t xml:space="preserve">  "steps": [ </w:t>
-      </w:r>
-      <w:proofErr w:type="gramStart"/>
-      <w:r>
-        <w:rPr>
-          <w:rStyle w:val="HTMLCode"/>
-          <w:rFonts w:eastAsiaTheme="majorEastAsia"/>
-        </w:rPr>
-        <w:t>{ ...</w:t>
-      </w:r>
-      <w:proofErr w:type="gramEnd"/>
-      <w:r>
-        <w:rPr>
-          <w:rStyle w:val="HTMLCode"/>
-          <w:rFonts w:eastAsiaTheme="majorEastAsia"/>
-        </w:rPr>
-        <w:t>stepObj1 }, { ...stepObj2 } ]</w:t>
-      </w:r>
-    </w:p>
-    <w:p>
-      <w:pPr>
-        <w:pStyle w:val="HTMLPreformatted"/>
-        <w:rPr>
-          <w:rStyle w:val="HTMLCode"/>
-          <w:rFonts w:eastAsiaTheme="majorEastAsia"/>
-        </w:rPr>
-      </w:pPr>
-      <w:r>
-        <w:rPr>
-          <w:rStyle w:val="HTMLCode"/>
-          <w:rFonts w:eastAsiaTheme="majorEastAsia"/>
-        </w:rPr>
-        <w:t>}</w:t>
-      </w:r>
-    </w:p>
-    <w:p>
-      <w:r>
-        <w:pict w14:anchorId="717CB071">
-          <v:rect id="_x0000_i1043" style="width:0;height:1.5pt" o:hralign="center" o:hrstd="t" o:hr="t" fillcolor="#a0a0a0" stroked="f"/>
-        </w:pict>
-      </w:r>
-    </w:p>
-    <w:p>
-      <w:pPr>
-        <w:pStyle w:val="Heading3"/>
-      </w:pPr>
-      <w:r>
-        <w:rPr>
-          <w:rFonts w:ascii="Segoe UI Emoji" w:hAnsi="Segoe UI Emoji" w:cs="Segoe UI Emoji"/>
-        </w:rPr>
-        <w:t>📥</w:t>
-      </w:r>
-      <w:r>
-        <w:t xml:space="preserve"> 2. Get All Steps for a Machine</w:t>
-      </w:r>
-    </w:p>
-    <w:p>
-      <w:pPr>
-        <w:pStyle w:val="NormalWeb"/>
-      </w:pPr>
-      <w:r>
-        <w:rPr>
-          <w:rStyle w:val="Strong"/>
-        </w:rPr>
-        <w:t>GET</w:t>
-      </w:r>
-      <w:r>
-        <w:t xml:space="preserve"> </w:t>
-      </w:r>
-      <w:proofErr w:type="gramStart"/>
-      <w:r>
-        <w:rPr>
-          <w:rStyle w:val="HTMLCode"/>
-          <w:rFonts w:eastAsiaTheme="majorEastAsia"/>
-        </w:rPr>
-        <w:t>/:</w:t>
-      </w:r>
-      <w:proofErr w:type="spellStart"/>
-      <w:r>
-        <w:rPr>
-          <w:rStyle w:val="HTMLCode"/>
-          <w:rFonts w:eastAsiaTheme="majorEastAsia"/>
-        </w:rPr>
-        <w:t>machineCode</w:t>
-      </w:r>
-      <w:proofErr w:type="spellEnd"/>
-      <w:proofErr w:type="gramEnd"/>
-      <w:r>
-        <w:br/>
-        <w:t>Fetch all OPL steps for a given machine code.</w:t>
-      </w:r>
-    </w:p>
-    <w:p>
-      <w:pPr>
-        <w:pStyle w:val="Heading4"/>
-      </w:pPr>
-      <w:r>
-        <w:lastRenderedPageBreak/>
-        <w:t>Example:</w:t>
-      </w:r>
-    </w:p>
-    <w:p>
-      <w:pPr>
-        <w:pStyle w:val="HTMLPreformatted"/>
-        <w:rPr>
-          <w:rStyle w:val="HTMLCode"/>
-          <w:rFonts w:eastAsiaTheme="majorEastAsia"/>
-        </w:rPr>
-      </w:pPr>
-      <w:r>
-        <w:rPr>
-          <w:rStyle w:val="HTMLCode"/>
-          <w:rFonts w:eastAsiaTheme="majorEastAsia"/>
-        </w:rPr>
-        <w:t>GET /</w:t>
-      </w:r>
-      <w:proofErr w:type="spellStart"/>
-      <w:r>
-        <w:rPr>
-          <w:rStyle w:val="HTMLCode"/>
-          <w:rFonts w:eastAsiaTheme="majorEastAsia"/>
-        </w:rPr>
-        <w:t>api</w:t>
-      </w:r>
-      <w:proofErr w:type="spellEnd"/>
-      <w:r>
-        <w:rPr>
-          <w:rStyle w:val="HTMLCode"/>
-          <w:rFonts w:eastAsiaTheme="majorEastAsia"/>
-        </w:rPr>
-        <w:t>/onepointlesson2p0/MAC123</w:t>
-      </w:r>
-    </w:p>
-    <w:p>
-      <w:pPr>
-        <w:pStyle w:val="Heading4"/>
-      </w:pPr>
-      <w:r>
-        <w:t>Response:</w:t>
-      </w:r>
-    </w:p>
-    <w:p>
-      <w:pPr>
-        <w:pStyle w:val="HTMLPreformatted"/>
-        <w:rPr>
-          <w:rStyle w:val="HTMLCode"/>
-          <w:rFonts w:eastAsiaTheme="majorEastAsia"/>
-        </w:rPr>
-      </w:pPr>
-      <w:r>
-        <w:rPr>
-          <w:rStyle w:val="HTMLCode"/>
-          <w:rFonts w:eastAsiaTheme="majorEastAsia"/>
-        </w:rPr>
-        <w:t>[</w:t>
-      </w:r>
-    </w:p>
-    <w:p>
-      <w:pPr>
-        <w:pStyle w:val="HTMLPreformatted"/>
-        <w:rPr>
-          <w:rStyle w:val="HTMLCode"/>
-          <w:rFonts w:eastAsiaTheme="majorEastAsia"/>
-        </w:rPr>
-      </w:pPr>
-      <w:r>
-        <w:rPr>
-          <w:rStyle w:val="HTMLCode"/>
-          <w:rFonts w:eastAsiaTheme="majorEastAsia"/>
-        </w:rPr>
-        <w:t xml:space="preserve">  {</w:t>
-      </w:r>
-    </w:p>
-    <w:p>
-      <w:pPr>
-        <w:pStyle w:val="HTMLPreformatted"/>
-        <w:rPr>
-          <w:rStyle w:val="HTMLCode"/>
-          <w:rFonts w:eastAsiaTheme="majorEastAsia"/>
-        </w:rPr>
-      </w:pPr>
-      <w:r>
-        <w:rPr>
-          <w:rStyle w:val="HTMLCode"/>
-          <w:rFonts w:eastAsiaTheme="majorEastAsia"/>
-        </w:rPr>
-        <w:t xml:space="preserve">    "_id": "665f4b...",</w:t>
-      </w:r>
-    </w:p>
-    <w:p>
-      <w:pPr>
-        <w:pStyle w:val="HTMLPreformatted"/>
-        <w:rPr>
-          <w:rStyle w:val="HTMLCode"/>
-          <w:rFonts w:eastAsiaTheme="majorEastAsia"/>
-        </w:rPr>
-      </w:pPr>
-      <w:r>
-        <w:rPr>
-          <w:rStyle w:val="HTMLCode"/>
-          <w:rFonts w:eastAsiaTheme="majorEastAsia"/>
-        </w:rPr>
-        <w:t xml:space="preserve">    "</w:t>
-      </w:r>
-      <w:proofErr w:type="spellStart"/>
-      <w:r>
-        <w:rPr>
-          <w:rStyle w:val="HTMLCode"/>
-          <w:rFonts w:eastAsiaTheme="majorEastAsia"/>
-        </w:rPr>
-        <w:t>lessonName</w:t>
-      </w:r>
-      <w:proofErr w:type="spellEnd"/>
-      <w:r>
-        <w:rPr>
-          <w:rStyle w:val="HTMLCode"/>
-          <w:rFonts w:eastAsiaTheme="majorEastAsia"/>
-        </w:rPr>
-        <w:t>": "Safety Check",</w:t>
-      </w:r>
-    </w:p>
-    <w:p>
-      <w:pPr>
-        <w:pStyle w:val="HTMLPreformatted"/>
-        <w:rPr>
-          <w:rStyle w:val="HTMLCode"/>
-          <w:rFonts w:eastAsiaTheme="majorEastAsia"/>
-        </w:rPr>
-      </w:pPr>
-      <w:r>
-        <w:rPr>
-          <w:rStyle w:val="HTMLCode"/>
-          <w:rFonts w:eastAsiaTheme="majorEastAsia"/>
-        </w:rPr>
-        <w:t xml:space="preserve">    "</w:t>
-      </w:r>
-      <w:proofErr w:type="spellStart"/>
-      <w:r>
-        <w:rPr>
-          <w:rStyle w:val="HTMLCode"/>
-          <w:rFonts w:eastAsiaTheme="majorEastAsia"/>
-        </w:rPr>
-        <w:t>machineCode</w:t>
-      </w:r>
-      <w:proofErr w:type="spellEnd"/>
-      <w:r>
-        <w:rPr>
-          <w:rStyle w:val="HTMLCode"/>
-          <w:rFonts w:eastAsiaTheme="majorEastAsia"/>
-        </w:rPr>
-        <w:t>": "MAC123",</w:t>
-      </w:r>
-    </w:p>
-    <w:p>
-      <w:pPr>
-        <w:pStyle w:val="HTMLPreformatted"/>
-        <w:rPr>
-          <w:rStyle w:val="HTMLCode"/>
-          <w:rFonts w:eastAsiaTheme="majorEastAsia"/>
-        </w:rPr>
-      </w:pPr>
-      <w:r>
-        <w:rPr>
-          <w:rStyle w:val="HTMLCode"/>
-          <w:rFonts w:eastAsiaTheme="majorEastAsia"/>
-        </w:rPr>
-        <w:t xml:space="preserve">    "</w:t>
-      </w:r>
-      <w:proofErr w:type="spellStart"/>
-      <w:r>
-        <w:rPr>
-          <w:rStyle w:val="HTMLCode"/>
-          <w:rFonts w:eastAsiaTheme="majorEastAsia"/>
-        </w:rPr>
-        <w:t>stepNumber</w:t>
-      </w:r>
-      <w:proofErr w:type="spellEnd"/>
-      <w:r>
-        <w:rPr>
-          <w:rStyle w:val="HTMLCode"/>
-          <w:rFonts w:eastAsiaTheme="majorEastAsia"/>
-        </w:rPr>
-        <w:t>": 1,</w:t>
-      </w:r>
-    </w:p>
-    <w:p>
-      <w:pPr>
-        <w:pStyle w:val="HTMLPreformatted"/>
-        <w:rPr>
-          <w:rStyle w:val="HTMLCode"/>
-          <w:rFonts w:eastAsiaTheme="majorEastAsia"/>
-        </w:rPr>
-      </w:pPr>
-      <w:r>
-        <w:rPr>
-          <w:rStyle w:val="HTMLCode"/>
-          <w:rFonts w:eastAsiaTheme="majorEastAsia"/>
-        </w:rPr>
-        <w:t xml:space="preserve">    "description": "Turn off the switch",</w:t>
-      </w:r>
-    </w:p>
-    <w:p>
-      <w:pPr>
-        <w:pStyle w:val="HTMLPreformatted"/>
-        <w:rPr>
-          <w:rStyle w:val="HTMLCode"/>
-          <w:rFonts w:eastAsiaTheme="majorEastAsia"/>
-        </w:rPr>
-      </w:pPr>
-      <w:r>
-        <w:rPr>
-          <w:rStyle w:val="HTMLCode"/>
-          <w:rFonts w:eastAsiaTheme="majorEastAsia"/>
-        </w:rPr>
-        <w:t xml:space="preserve">    "</w:t>
-      </w:r>
-      <w:proofErr w:type="spellStart"/>
-      <w:r>
-        <w:rPr>
-          <w:rStyle w:val="HTMLCode"/>
-          <w:rFonts w:eastAsiaTheme="majorEastAsia"/>
-        </w:rPr>
-        <w:t>imagePath</w:t>
-      </w:r>
-      <w:proofErr w:type="spellEnd"/>
-      <w:r>
-        <w:rPr>
-          <w:rStyle w:val="HTMLCode"/>
-          <w:rFonts w:eastAsiaTheme="majorEastAsia"/>
-        </w:rPr>
-        <w:t>": "uploads/onepointlesson2p0/...",</w:t>
-      </w:r>
-    </w:p>
-    <w:p>
-      <w:pPr>
-        <w:pStyle w:val="HTMLPreformatted"/>
-        <w:rPr>
-          <w:rStyle w:val="HTMLCode"/>
-          <w:rFonts w:eastAsiaTheme="majorEastAsia"/>
-        </w:rPr>
-      </w:pPr>
-      <w:r>
-        <w:rPr>
-          <w:rStyle w:val="HTMLCode"/>
-          <w:rFonts w:eastAsiaTheme="majorEastAsia"/>
-        </w:rPr>
-        <w:t xml:space="preserve">    ...</w:t>
-      </w:r>
-    </w:p>
-    <w:p>
-      <w:pPr>
-        <w:pStyle w:val="HTMLPreformatted"/>
-        <w:rPr>
-          <w:rStyle w:val="HTMLCode"/>
-          <w:rFonts w:eastAsiaTheme="majorEastAsia"/>
-        </w:rPr>
-      </w:pPr>
-      <w:r>
-        <w:rPr>
-          <w:rStyle w:val="HTMLCode"/>
-          <w:rFonts w:eastAsiaTheme="majorEastAsia"/>
-        </w:rPr>
-        <w:t xml:space="preserve">  },</w:t>
-      </w:r>
-    </w:p>
-    <w:p>
-      <w:pPr>
-        <w:pStyle w:val="HTMLPreformatted"/>
-        <w:rPr>
-          <w:rStyle w:val="HTMLCode"/>
-          <w:rFonts w:eastAsiaTheme="majorEastAsia"/>
-        </w:rPr>
-      </w:pPr>
-      <w:r>
-        <w:rPr>
-          <w:rStyle w:val="HTMLCode"/>
-          <w:rFonts w:eastAsiaTheme="majorEastAsia"/>
-        </w:rPr>
-        <w:t xml:space="preserve">  ...</w:t>
-      </w:r>
-    </w:p>
-    <w:p>
-      <w:pPr>
-        <w:pStyle w:val="HTMLPreformatted"/>
-        <w:rPr>
-          <w:rStyle w:val="HTMLCode"/>
-          <w:rFonts w:eastAsiaTheme="majorEastAsia"/>
-        </w:rPr>
-      </w:pPr>
-      <w:r>
-        <w:rPr>
-          <w:rStyle w:val="HTMLCode"/>
-          <w:rFonts w:eastAsiaTheme="majorEastAsia"/>
-        </w:rPr>
-        <w:t>]</w:t>
-      </w:r>
-    </w:p>
-    <w:p>
-      <w:r>
-        <w:pict w14:anchorId="5789CC98">
-          <v:rect id="_x0000_i1044" style="width:0;height:1.5pt" o:hralign="center" o:hrstd="t" o:hr="t" fillcolor="#a0a0a0" stroked="f"/>
-        </w:pict>
-      </w:r>
-    </w:p>
-    <w:p>
-      <w:pPr>
-        <w:pStyle w:val="Heading3"/>
-      </w:pPr>
-      <w:r>
-        <w:rPr>
-          <w:rFonts w:ascii="Segoe UI Emoji" w:hAnsi="Segoe UI Emoji" w:cs="Segoe UI Emoji"/>
-        </w:rPr>
-        <w:t>🗑️</w:t>
-      </w:r>
-      <w:r>
-        <w:t xml:space="preserve"> 3. Delete a Step by ID</w:t>
-      </w:r>
-    </w:p>
-    <w:p>
-      <w:pPr>
-        <w:pStyle w:val="NormalWeb"/>
-      </w:pPr>
-      <w:r>
-        <w:rPr>
-          <w:rStyle w:val="Strong"/>
-        </w:rPr>
-        <w:t>DELETE</w:t>
-      </w:r>
-      <w:r>
-        <w:t xml:space="preserve"> </w:t>
-      </w:r>
-      <w:r>
-        <w:rPr>
-          <w:rStyle w:val="HTMLCode"/>
-          <w:rFonts w:eastAsiaTheme="majorEastAsia"/>
-        </w:rPr>
-        <w:t>/step/:id</w:t>
-      </w:r>
-      <w:r>
-        <w:br/>
-        <w:t xml:space="preserve">Deletes a single step based on its MongoDB </w:t>
+        <w:t xml:space="preserve">Use the </w:t>
       </w:r>
       <w:r>
         <w:rPr>
@@ -1197,378 +1693,7 @@
         <w:t>_id</w:t>
       </w:r>
       <w:r>
-        <w:t>.</w:t>
-      </w:r>
-    </w:p>
-    <w:p>
-      <w:pPr>
-        <w:pStyle w:val="Heading4"/>
-      </w:pPr>
-      <w:r>
-        <w:t>Example:</w:t>
-      </w:r>
-    </w:p>
-    <w:p>
-      <w:pPr>
-        <w:pStyle w:val="HTMLPreformatted"/>
-        <w:rPr>
-          <w:rStyle w:val="HTMLCode"/>
-          <w:rFonts w:eastAsiaTheme="majorEastAsia"/>
-        </w:rPr>
-      </w:pPr>
-      <w:r>
-        <w:rPr>
-          <w:rStyle w:val="HTMLCode"/>
-          <w:rFonts w:eastAsiaTheme="majorEastAsia"/>
-        </w:rPr>
-        <w:t>DELETE /</w:t>
-      </w:r>
-      <w:proofErr w:type="spellStart"/>
-      <w:r>
-        <w:rPr>
-          <w:rStyle w:val="HTMLCode"/>
-          <w:rFonts w:eastAsiaTheme="majorEastAsia"/>
-        </w:rPr>
-        <w:t>api</w:t>
-      </w:r>
-      <w:proofErr w:type="spellEnd"/>
-      <w:r>
-        <w:rPr>
-          <w:rStyle w:val="HTMLCode"/>
-          <w:rFonts w:eastAsiaTheme="majorEastAsia"/>
-        </w:rPr>
-        <w:t>/onepointlesson2p0/step/665f4b10e1...</w:t>
-      </w:r>
-    </w:p>
-    <w:p>
-      <w:pPr>
-        <w:pStyle w:val="Heading4"/>
-      </w:pPr>
-      <w:r>
-        <w:t>Response:</w:t>
-      </w:r>
-    </w:p>
-    <w:p>
-      <w:pPr>
-        <w:pStyle w:val="HTMLPreformatted"/>
-        <w:rPr>
-          <w:rStyle w:val="HTMLCode"/>
-          <w:rFonts w:eastAsiaTheme="majorEastAsia"/>
-        </w:rPr>
-      </w:pPr>
-      <w:r>
-        <w:rPr>
-          <w:rStyle w:val="HTMLCode"/>
-          <w:rFonts w:eastAsiaTheme="majorEastAsia"/>
-        </w:rPr>
-        <w:t>{</w:t>
-      </w:r>
-    </w:p>
-    <w:p>
-      <w:pPr>
-        <w:pStyle w:val="HTMLPreformatted"/>
-        <w:rPr>
-          <w:rStyle w:val="HTMLCode"/>
-          <w:rFonts w:eastAsiaTheme="majorEastAsia"/>
-        </w:rPr>
-      </w:pPr>
-      <w:r>
-        <w:rPr>
-          <w:rStyle w:val="HTMLCode"/>
-          <w:rFonts w:eastAsiaTheme="majorEastAsia"/>
-        </w:rPr>
-        <w:t xml:space="preserve">  "message": "</w:t>
-      </w:r>
-      <w:r>
-        <w:rPr>
-          <w:rStyle w:val="HTMLCode"/>
-          <w:rFonts w:ascii="Segoe UI Emoji" w:eastAsiaTheme="majorEastAsia" w:hAnsi="Segoe UI Emoji" w:cs="Segoe UI Emoji"/>
-        </w:rPr>
-        <w:t>✅</w:t>
-      </w:r>
-      <w:r>
-        <w:rPr>
-          <w:rStyle w:val="HTMLCode"/>
-          <w:rFonts w:eastAsiaTheme="majorEastAsia"/>
-        </w:rPr>
-        <w:t xml:space="preserve"> Step deleted",</w:t>
-      </w:r>
-    </w:p>
-    <w:p>
-      <w:pPr>
-        <w:pStyle w:val="HTMLPreformatted"/>
-        <w:rPr>
-          <w:rStyle w:val="HTMLCode"/>
-          <w:rFonts w:eastAsiaTheme="majorEastAsia"/>
-        </w:rPr>
-      </w:pPr>
-      <w:r>
-        <w:rPr>
-          <w:rStyle w:val="HTMLCode"/>
-          <w:rFonts w:eastAsiaTheme="majorEastAsia"/>
-        </w:rPr>
-        <w:t xml:space="preserve">  "step": </w:t>
-      </w:r>
-      <w:proofErr w:type="gramStart"/>
-      <w:r>
-        <w:rPr>
-          <w:rStyle w:val="HTMLCode"/>
-          <w:rFonts w:eastAsiaTheme="majorEastAsia"/>
-        </w:rPr>
-        <w:t>{ ...</w:t>
-      </w:r>
-      <w:proofErr w:type="spellStart"/>
-      <w:proofErr w:type="gramEnd"/>
-      <w:r>
-        <w:rPr>
-          <w:rStyle w:val="HTMLCode"/>
-          <w:rFonts w:eastAsiaTheme="majorEastAsia"/>
-        </w:rPr>
-        <w:t>deletedStep</w:t>
-      </w:r>
-      <w:proofErr w:type="spellEnd"/>
-      <w:r>
-        <w:rPr>
-          <w:rStyle w:val="HTMLCode"/>
-          <w:rFonts w:eastAsiaTheme="majorEastAsia"/>
-        </w:rPr>
-        <w:t xml:space="preserve"> }</w:t>
-      </w:r>
-    </w:p>
-    <w:p>
-      <w:pPr>
-        <w:pStyle w:val="HTMLPreformatted"/>
-        <w:rPr>
-          <w:rStyle w:val="HTMLCode"/>
-          <w:rFonts w:eastAsiaTheme="majorEastAsia"/>
-        </w:rPr>
-      </w:pPr>
-      <w:r>
-        <w:rPr>
-          <w:rStyle w:val="HTMLCode"/>
-          <w:rFonts w:eastAsiaTheme="majorEastAsia"/>
-        </w:rPr>
-        <w:t>}</w:t>
-      </w:r>
-    </w:p>
-    <w:p>
-      <w:r>
-        <w:pict w14:anchorId="5C7AD2A3">
-          <v:rect id="_x0000_i1045" style="width:0;height:1.5pt" o:hralign="center" o:hrstd="t" o:hr="t" fillcolor="#a0a0a0" stroked="f"/>
-        </w:pict>
-      </w:r>
-    </w:p>
-    <w:p>
-      <w:pPr>
-        <w:pStyle w:val="Heading3"/>
-      </w:pPr>
-      <w:r>
-        <w:rPr>
-          <w:rFonts w:ascii="Segoe UI Emoji" w:hAnsi="Segoe UI Emoji" w:cs="Segoe UI Emoji"/>
-        </w:rPr>
-        <w:t>🗑️</w:t>
-      </w:r>
-      <w:r>
-        <w:t xml:space="preserve"> 4. Delete All Steps for a Machine</w:t>
-      </w:r>
-    </w:p>
-    <w:p>
-      <w:pPr>
-        <w:pStyle w:val="NormalWeb"/>
-      </w:pPr>
-      <w:r>
-        <w:rPr>
-          <w:rStyle w:val="Strong"/>
-        </w:rPr>
-        <w:t>DELETE</w:t>
-      </w:r>
-      <w:r>
-        <w:t xml:space="preserve"> </w:t>
-      </w:r>
-      <w:r>
-        <w:rPr>
-          <w:rStyle w:val="HTMLCode"/>
-          <w:rFonts w:eastAsiaTheme="majorEastAsia"/>
-        </w:rPr>
-        <w:t>/all</w:t>
-      </w:r>
-      <w:proofErr w:type="gramStart"/>
-      <w:r>
-        <w:rPr>
-          <w:rStyle w:val="HTMLCode"/>
-          <w:rFonts w:eastAsiaTheme="majorEastAsia"/>
-        </w:rPr>
-        <w:t>/:</w:t>
-      </w:r>
-      <w:proofErr w:type="spellStart"/>
-      <w:r>
-        <w:rPr>
-          <w:rStyle w:val="HTMLCode"/>
-          <w:rFonts w:eastAsiaTheme="majorEastAsia"/>
-        </w:rPr>
-        <w:t>machineCode</w:t>
-      </w:r>
-      <w:proofErr w:type="spellEnd"/>
-      <w:proofErr w:type="gramEnd"/>
-      <w:r>
-        <w:br/>
-        <w:t xml:space="preserve">Delete </w:t>
-      </w:r>
-      <w:r>
-        <w:rPr>
-          <w:rStyle w:val="Strong"/>
-        </w:rPr>
-        <w:t>all steps</w:t>
-      </w:r>
-      <w:r>
-        <w:t xml:space="preserve"> for a particular machine.</w:t>
-      </w:r>
-    </w:p>
-    <w:p>
-      <w:pPr>
-        <w:pStyle w:val="Heading4"/>
-      </w:pPr>
-      <w:r>
-        <w:t>Example:</w:t>
-      </w:r>
-    </w:p>
-    <w:p>
-      <w:pPr>
-        <w:pStyle w:val="HTMLPreformatted"/>
-        <w:rPr>
-          <w:rStyle w:val="HTMLCode"/>
-          <w:rFonts w:eastAsiaTheme="majorEastAsia"/>
-        </w:rPr>
-      </w:pPr>
-      <w:r>
-        <w:rPr>
-          <w:rStyle w:val="HTMLCode"/>
-          <w:rFonts w:eastAsiaTheme="majorEastAsia"/>
-        </w:rPr>
-        <w:t>DELETE /</w:t>
-      </w:r>
-      <w:proofErr w:type="spellStart"/>
-      <w:r>
-        <w:rPr>
-          <w:rStyle w:val="HTMLCode"/>
-          <w:rFonts w:eastAsiaTheme="majorEastAsia"/>
-        </w:rPr>
-        <w:t>api</w:t>
-      </w:r>
-      <w:proofErr w:type="spellEnd"/>
-      <w:r>
-        <w:rPr>
-          <w:rStyle w:val="HTMLCode"/>
-          <w:rFonts w:eastAsiaTheme="majorEastAsia"/>
-        </w:rPr>
-        <w:t>/onepointlesson2p0/all/MAC123</w:t>
-      </w:r>
-    </w:p>
-    <w:p>
-      <w:pPr>
-        <w:pStyle w:val="Heading4"/>
-      </w:pPr>
-      <w:r>
-        <w:t>Response:</w:t>
-      </w:r>
-    </w:p>
-    <w:p>
-      <w:pPr>
-        <w:pStyle w:val="HTMLPreformatted"/>
-        <w:rPr>
-          <w:rStyle w:val="HTMLCode"/>
-          <w:rFonts w:eastAsiaTheme="majorEastAsia"/>
-        </w:rPr>
-      </w:pPr>
-      <w:r>
-        <w:rPr>
-          <w:rStyle w:val="HTMLCode"/>
-          <w:rFonts w:eastAsiaTheme="majorEastAsia"/>
-        </w:rPr>
-        <w:t>{</w:t>
-      </w:r>
-    </w:p>
-    <w:p>
-      <w:pPr>
-        <w:pStyle w:val="HTMLPreformatted"/>
-        <w:rPr>
-          <w:rStyle w:val="HTMLCode"/>
-          <w:rFonts w:eastAsiaTheme="majorEastAsia"/>
-        </w:rPr>
-      </w:pPr>
-      <w:r>
-        <w:rPr>
-          <w:rStyle w:val="HTMLCode"/>
-          <w:rFonts w:eastAsiaTheme="majorEastAsia"/>
-        </w:rPr>
-        <w:t xml:space="preserve">  "message": "</w:t>
-      </w:r>
-      <w:r>
-        <w:rPr>
-          <w:rStyle w:val="HTMLCode"/>
-          <w:rFonts w:ascii="Segoe UI Emoji" w:eastAsiaTheme="majorEastAsia" w:hAnsi="Segoe UI Emoji" w:cs="Segoe UI Emoji"/>
-        </w:rPr>
-        <w:t>✅</w:t>
-      </w:r>
-      <w:r>
-        <w:rPr>
-          <w:rStyle w:val="HTMLCode"/>
-          <w:rFonts w:eastAsiaTheme="majorEastAsia"/>
-        </w:rPr>
-        <w:t xml:space="preserve"> Deleted 6 steps for </w:t>
-      </w:r>
-      <w:proofErr w:type="spellStart"/>
-      <w:r>
-        <w:rPr>
-          <w:rStyle w:val="HTMLCode"/>
-          <w:rFonts w:eastAsiaTheme="majorEastAsia"/>
-        </w:rPr>
-        <w:t>machineCode</w:t>
-      </w:r>
-      <w:proofErr w:type="spellEnd"/>
-      <w:r>
-        <w:rPr>
-          <w:rStyle w:val="HTMLCode"/>
-          <w:rFonts w:eastAsiaTheme="majorEastAsia"/>
-        </w:rPr>
-        <w:t xml:space="preserve"> MAC123"</w:t>
-      </w:r>
-    </w:p>
-    <w:p>
-      <w:pPr>
-        <w:pStyle w:val="HTMLPreformatted"/>
-        <w:rPr>
-          <w:rStyle w:val="HTMLCode"/>
-          <w:rFonts w:eastAsiaTheme="majorEastAsia"/>
-        </w:rPr>
-      </w:pPr>
-      <w:r>
-        <w:rPr>
-          <w:rStyle w:val="HTMLCode"/>
-          <w:rFonts w:eastAsiaTheme="majorEastAsia"/>
-        </w:rPr>
-        <w:t>}</w:t>
-      </w:r>
-    </w:p>
-    <w:p>
-      <w:r>
-        <w:pict w14:anchorId="6EEF94DF">
-          <v:rect id="_x0000_i1046" style="width:0;height:1.5pt" o:hralign="center" o:hrstd="t" o:hr="t" fillcolor="#a0a0a0" stroked="f"/>
-        </w:pict>
-      </w:r>
-    </w:p>
-    <w:p>
-      <w:pPr>
-        <w:pStyle w:val="Heading2"/>
-      </w:pPr>
-      <w:r>
-        <w:rPr>
-          <w:rFonts w:ascii="Segoe UI Emoji" w:hAnsi="Segoe UI Emoji" w:cs="Segoe UI Emoji"/>
-        </w:rPr>
-        <w:t>📝</w:t>
-      </w:r>
-      <w:r>
-        <w:t xml:space="preserve"> Notes:</w:t>
+        <w:t xml:space="preserve"> from the GET endpoint to delete individual steps.</w:t>
       </w:r>
     </w:p>
     <w:p>
@@ -1576,132 +1701,36 @@
         <w:pStyle w:val="NormalWeb"/>
         <w:numPr>
           <w:ilvl w:val="0"/>
-          <w:numId w:val="16"/>
+          <w:numId w:val="17"/>
         </w:numPr>
       </w:pPr>
       <w:r>
-        <w:t xml:space="preserve">All uploads must be </w:t>
-      </w:r>
-      <w:r>
-        <w:rPr>
-          <w:rStyle w:val="Strong"/>
-        </w:rPr>
-        <w:t>image files</w:t>
-      </w:r>
-      <w:r>
-        <w:t xml:space="preserve"> (</w:t>
-      </w:r>
-      <w:r>
-        <w:rPr>
-          <w:rStyle w:val="HTMLCode"/>
-          <w:rFonts w:eastAsiaTheme="majorEastAsia"/>
-        </w:rPr>
-        <w:t>jpg</w:t>
-      </w:r>
-      <w:r>
-        <w:t xml:space="preserve">, </w:t>
-      </w:r>
-      <w:r>
-        <w:rPr>
-          <w:rStyle w:val="HTMLCode"/>
-          <w:rFonts w:eastAsiaTheme="majorEastAsia"/>
-        </w:rPr>
-        <w:t>jpeg</w:t>
-      </w:r>
-      <w:r>
-        <w:t xml:space="preserve">, </w:t>
-      </w:r>
-      <w:proofErr w:type="spellStart"/>
-      <w:r>
-        <w:rPr>
-          <w:rStyle w:val="HTMLCode"/>
-          <w:rFonts w:eastAsiaTheme="majorEastAsia"/>
-        </w:rPr>
-        <w:t>png</w:t>
-      </w:r>
-      <w:proofErr w:type="spellEnd"/>
-      <w:r>
-        <w:t>)</w:t>
+        <w:t>Use file upload previews or server image paths (</w:t>
+      </w:r>
+      <w:r>
+        <w:rPr>
+          <w:rStyle w:val="HTMLCode"/>
+          <w:rFonts w:eastAsiaTheme="majorEastAsia"/>
+        </w:rPr>
+        <w:t>imagePath</w:t>
+      </w:r>
+      <w:r>
+        <w:t>) to display steps in UI.</w:t>
+      </w:r>
+    </w:p>
+    <w:p>
+      <w:r>
+        <w:pict w14:anchorId="6AF35A29">
+          <v:rect id="_x0000_i1045" style="width:0;height:1.5pt" o:hralign="center" o:hrstd="t" o:hr="t" fillcolor="#a0a0a0" stroked="f"/>
+        </w:pict>
       </w:r>
     </w:p>
     <w:p>
       <w:pPr>
         <w:pStyle w:val="NormalWeb"/>
-        <w:numPr>
-          <w:ilvl w:val="0"/>
-          <w:numId w:val="16"/>
-        </w:numPr>
-      </w:pPr>
-      <w:r>
-        <w:t>Arrays (</w:t>
-      </w:r>
-      <w:proofErr w:type="spellStart"/>
-      <w:r>
-        <w:rPr>
-          <w:rStyle w:val="HTMLCode"/>
-          <w:rFonts w:eastAsiaTheme="majorEastAsia"/>
-        </w:rPr>
-        <w:t>stepNumbers</w:t>
-      </w:r>
-      <w:proofErr w:type="spellEnd"/>
-      <w:r>
-        <w:t xml:space="preserve">, </w:t>
-      </w:r>
-      <w:r>
-        <w:rPr>
-          <w:rStyle w:val="HTMLCode"/>
-          <w:rFonts w:eastAsiaTheme="majorEastAsia"/>
-        </w:rPr>
-        <w:t>descriptions</w:t>
-      </w:r>
-      <w:r>
-        <w:t>) must be sent as valid JSON strings</w:t>
-      </w:r>
-    </w:p>
-    <w:p>
-      <w:pPr>
-        <w:pStyle w:val="NormalWeb"/>
-        <w:numPr>
-          <w:ilvl w:val="0"/>
-          <w:numId w:val="16"/>
-        </w:numPr>
-      </w:pPr>
-      <w:r>
-        <w:t xml:space="preserve">Maximum: </w:t>
-      </w:r>
-      <w:r>
-        <w:rPr>
-          <w:rStyle w:val="Strong"/>
-        </w:rPr>
-        <w:t>20 steps per request</w:t>
-      </w:r>
-    </w:p>
-    <w:p>
-      <w:pPr>
-        <w:pStyle w:val="NormalWeb"/>
-        <w:numPr>
-          <w:ilvl w:val="0"/>
-          <w:numId w:val="16"/>
-        </w:numPr>
-      </w:pPr>
-      <w:r>
-        <w:t>Each step requires an image, step number, and description</w:t>
-      </w:r>
-    </w:p>
-    <w:p>
-      <w:r>
-        <w:lastRenderedPageBreak/>
-        <w:pict w14:anchorId="782F3129">
-          <v:rect id="_x0000_i1047" style="width:0;height:1.5pt" o:hralign="center" o:hrstd="t" o:hr="t" fillcolor="#a0a0a0" stroked="f"/>
-        </w:pict>
-      </w:r>
-    </w:p>
-    <w:p>
-      <w:pPr>
-        <w:pStyle w:val="NormalWeb"/>
-      </w:pPr>
-      <w:r>
-        <w:t>Let me know if you want this exported to PDF or markdown format.</w:t>
+      </w:pPr>
+      <w:r>
+        <w:t>Let me know if you'd like this in PDF or Markdown format too.</w:t>
       </w:r>
     </w:p>
     <w:p/>
@@ -1980,6 +2009,155 @@
     </w:lvl>
   </w:abstractNum>
   <w:abstractNum w:abstractNumId="2" w15:restartNumberingAfterBreak="0">
+    <w:nsid w:val="1F441D69"/>
+    <w:multiLevelType w:val="multilevel"/>
+    <w:tmpl w:val="03F66690"/>
+    <w:lvl w:ilvl="0">
+      <w:start w:val="1"/>
+      <w:numFmt w:val="bullet"/>
+      <w:lvlText w:val=""/>
+      <w:lvlJc w:val="left"/>
+      <w:pPr>
+        <w:tabs>
+          <w:tab w:val="num" w:pos="720"/>
+        </w:tabs>
+        <w:ind w:left="720" w:hanging="360"/>
+      </w:pPr>
+      <w:rPr>
+        <w:rFonts w:ascii="Symbol" w:hAnsi="Symbol" w:hint="default"/>
+        <w:sz w:val="20"/>
+      </w:rPr>
+    </w:lvl>
+    <w:lvl w:ilvl="1" w:tentative="1">
+      <w:start w:val="1"/>
+      <w:numFmt w:val="bullet"/>
+      <w:lvlText w:val="o"/>
+      <w:lvlJc w:val="left"/>
+      <w:pPr>
+        <w:tabs>
+          <w:tab w:val="num" w:pos="1440"/>
+        </w:tabs>
+        <w:ind w:left="1440" w:hanging="360"/>
+      </w:pPr>
+      <w:rPr>
+        <w:rFonts w:ascii="Courier New" w:hAnsi="Courier New" w:hint="default"/>
+        <w:sz w:val="20"/>
+      </w:rPr>
+    </w:lvl>
+    <w:lvl w:ilvl="2" w:tentative="1">
+      <w:start w:val="1"/>
+      <w:numFmt w:val="bullet"/>
+      <w:lvlText w:val=""/>
+      <w:lvlJc w:val="left"/>
+      <w:pPr>
+        <w:tabs>
+          <w:tab w:val="num" w:pos="2160"/>
+        </w:tabs>
+        <w:ind w:left="2160" w:hanging="360"/>
+      </w:pPr>
+      <w:rPr>
+        <w:rFonts w:ascii="Wingdings" w:hAnsi="Wingdings" w:hint="default"/>
+        <w:sz w:val="20"/>
+      </w:rPr>
+    </w:lvl>
+    <w:lvl w:ilvl="3" w:tentative="1">
+      <w:start w:val="1"/>
+      <w:numFmt w:val="bullet"/>
+      <w:lvlText w:val=""/>
+      <w:lvlJc w:val="left"/>
+      <w:pPr>
+        <w:tabs>
+          <w:tab w:val="num" w:pos="2880"/>
+        </w:tabs>
+        <w:ind w:left="2880" w:hanging="360"/>
+      </w:pPr>
+      <w:rPr>
+        <w:rFonts w:ascii="Wingdings" w:hAnsi="Wingdings" w:hint="default"/>
+        <w:sz w:val="20"/>
+      </w:rPr>
+    </w:lvl>
+    <w:lvl w:ilvl="4" w:tentative="1">
+      <w:start w:val="1"/>
+      <w:numFmt w:val="bullet"/>
+      <w:lvlText w:val=""/>
+      <w:lvlJc w:val="left"/>
+      <w:pPr>
+        <w:tabs>
+          <w:tab w:val="num" w:pos="3600"/>
+        </w:tabs>
+        <w:ind w:left="3600" w:hanging="360"/>
+      </w:pPr>
+      <w:rPr>
+        <w:rFonts w:ascii="Wingdings" w:hAnsi="Wingdings" w:hint="default"/>
+        <w:sz w:val="20"/>
+      </w:rPr>
+    </w:lvl>
+    <w:lvl w:ilvl="5" w:tentative="1">
+      <w:start w:val="1"/>
+      <w:numFmt w:val="bullet"/>
+      <w:lvlText w:val=""/>
+      <w:lvlJc w:val="left"/>
+      <w:pPr>
+        <w:tabs>
+          <w:tab w:val="num" w:pos="4320"/>
+        </w:tabs>
+        <w:ind w:left="4320" w:hanging="360"/>
+      </w:pPr>
+      <w:rPr>
+        <w:rFonts w:ascii="Wingdings" w:hAnsi="Wingdings" w:hint="default"/>
+        <w:sz w:val="20"/>
+      </w:rPr>
+    </w:lvl>
+    <w:lvl w:ilvl="6" w:tentative="1">
+      <w:start w:val="1"/>
+      <w:numFmt w:val="bullet"/>
+      <w:lvlText w:val=""/>
+      <w:lvlJc w:val="left"/>
+      <w:pPr>
+        <w:tabs>
+          <w:tab w:val="num" w:pos="5040"/>
+        </w:tabs>
+        <w:ind w:left="5040" w:hanging="360"/>
+      </w:pPr>
+      <w:rPr>
+        <w:rFonts w:ascii="Wingdings" w:hAnsi="Wingdings" w:hint="default"/>
+        <w:sz w:val="20"/>
+      </w:rPr>
+    </w:lvl>
+    <w:lvl w:ilvl="7" w:tentative="1">
+      <w:start w:val="1"/>
+      <w:numFmt w:val="bullet"/>
+      <w:lvlText w:val=""/>
+      <w:lvlJc w:val="left"/>
+      <w:pPr>
+        <w:tabs>
+          <w:tab w:val="num" w:pos="5760"/>
+        </w:tabs>
+        <w:ind w:left="5760" w:hanging="360"/>
+      </w:pPr>
+      <w:rPr>
+        <w:rFonts w:ascii="Wingdings" w:hAnsi="Wingdings" w:hint="default"/>
+        <w:sz w:val="20"/>
+      </w:rPr>
+    </w:lvl>
+    <w:lvl w:ilvl="8" w:tentative="1">
+      <w:start w:val="1"/>
+      <w:numFmt w:val="bullet"/>
+      <w:lvlText w:val=""/>
+      <w:lvlJc w:val="left"/>
+      <w:pPr>
+        <w:tabs>
+          <w:tab w:val="num" w:pos="6480"/>
+        </w:tabs>
+        <w:ind w:left="6480" w:hanging="360"/>
+      </w:pPr>
+      <w:rPr>
+        <w:rFonts w:ascii="Wingdings" w:hAnsi="Wingdings" w:hint="default"/>
+        <w:sz w:val="20"/>
+      </w:rPr>
+    </w:lvl>
+  </w:abstractNum>
+  <w:abstractNum w:abstractNumId="3" w15:restartNumberingAfterBreak="0">
     <w:nsid w:val="227527A1"/>
     <w:multiLevelType w:val="multilevel"/>
     <w:tmpl w:val="FBC41068"/>
@@ -2128,7 +2306,7 @@
       </w:rPr>
     </w:lvl>
   </w:abstractNum>
-  <w:abstractNum w:abstractNumId="3" w15:restartNumberingAfterBreak="0">
+  <w:abstractNum w:abstractNumId="4" w15:restartNumberingAfterBreak="0">
     <w:nsid w:val="2E873AF2"/>
     <w:multiLevelType w:val="multilevel"/>
     <w:tmpl w:val="19EA7A12"/>
@@ -2241,7 +2419,7 @@
       </w:pPr>
     </w:lvl>
   </w:abstractNum>
-  <w:abstractNum w:abstractNumId="4" w15:restartNumberingAfterBreak="0">
+  <w:abstractNum w:abstractNumId="5" w15:restartNumberingAfterBreak="0">
     <w:nsid w:val="34322EAF"/>
     <w:multiLevelType w:val="multilevel"/>
     <w:tmpl w:val="44A02104"/>
@@ -2354,7 +2532,7 @@
       </w:pPr>
     </w:lvl>
   </w:abstractNum>
-  <w:abstractNum w:abstractNumId="5" w15:restartNumberingAfterBreak="0">
+  <w:abstractNum w:abstractNumId="6" w15:restartNumberingAfterBreak="0">
     <w:nsid w:val="350417C3"/>
     <w:multiLevelType w:val="multilevel"/>
     <w:tmpl w:val="B1D82DBC"/>
@@ -2503,7 +2681,7 @@
       </w:rPr>
     </w:lvl>
   </w:abstractNum>
-  <w:abstractNum w:abstractNumId="6" w15:restartNumberingAfterBreak="0">
+  <w:abstractNum w:abstractNumId="7" w15:restartNumberingAfterBreak="0">
     <w:nsid w:val="35955D2F"/>
     <w:multiLevelType w:val="multilevel"/>
     <w:tmpl w:val="423A0188"/>
@@ -2652,7 +2830,7 @@
       </w:rPr>
     </w:lvl>
   </w:abstractNum>
-  <w:abstractNum w:abstractNumId="7" w15:restartNumberingAfterBreak="0">
+  <w:abstractNum w:abstractNumId="8" w15:restartNumberingAfterBreak="0">
     <w:nsid w:val="35B53179"/>
     <w:multiLevelType w:val="multilevel"/>
     <w:tmpl w:val="3C946974"/>
@@ -2801,7 +2979,7 @@
       </w:rPr>
     </w:lvl>
   </w:abstractNum>
-  <w:abstractNum w:abstractNumId="8" w15:restartNumberingAfterBreak="0">
+  <w:abstractNum w:abstractNumId="9" w15:restartNumberingAfterBreak="0">
     <w:nsid w:val="41396A45"/>
     <w:multiLevelType w:val="multilevel"/>
     <w:tmpl w:val="30DCC72C"/>
@@ -2950,7 +3128,7 @@
       </w:rPr>
     </w:lvl>
   </w:abstractNum>
-  <w:abstractNum w:abstractNumId="9" w15:restartNumberingAfterBreak="0">
+  <w:abstractNum w:abstractNumId="10" w15:restartNumberingAfterBreak="0">
     <w:nsid w:val="46A435A2"/>
     <w:multiLevelType w:val="multilevel"/>
     <w:tmpl w:val="6CF0A3B4"/>
@@ -3063,7 +3241,7 @@
       </w:pPr>
     </w:lvl>
   </w:abstractNum>
-  <w:abstractNum w:abstractNumId="10" w15:restartNumberingAfterBreak="0">
+  <w:abstractNum w:abstractNumId="11" w15:restartNumberingAfterBreak="0">
     <w:nsid w:val="495B5ADA"/>
     <w:multiLevelType w:val="multilevel"/>
     <w:tmpl w:val="3C6202B8"/>
@@ -3212,7 +3390,7 @@
       </w:rPr>
     </w:lvl>
   </w:abstractNum>
-  <w:abstractNum w:abstractNumId="11" w15:restartNumberingAfterBreak="0">
+  <w:abstractNum w:abstractNumId="12" w15:restartNumberingAfterBreak="0">
     <w:nsid w:val="49724C7A"/>
     <w:multiLevelType w:val="multilevel"/>
     <w:tmpl w:val="47C4A3F0"/>
@@ -3361,7 +3539,7 @@
       </w:rPr>
     </w:lvl>
   </w:abstractNum>
-  <w:abstractNum w:abstractNumId="12" w15:restartNumberingAfterBreak="0">
+  <w:abstractNum w:abstractNumId="13" w15:restartNumberingAfterBreak="0">
     <w:nsid w:val="49F210BA"/>
     <w:multiLevelType w:val="multilevel"/>
     <w:tmpl w:val="C860902A"/>
@@ -3510,7 +3688,7 @@
       </w:rPr>
     </w:lvl>
   </w:abstractNum>
-  <w:abstractNum w:abstractNumId="13" w15:restartNumberingAfterBreak="0">
+  <w:abstractNum w:abstractNumId="14" w15:restartNumberingAfterBreak="0">
     <w:nsid w:val="506A42F7"/>
     <w:multiLevelType w:val="multilevel"/>
     <w:tmpl w:val="5EF658D0"/>
@@ -3659,7 +3837,7 @@
       </w:rPr>
     </w:lvl>
   </w:abstractNum>
-  <w:abstractNum w:abstractNumId="14" w15:restartNumberingAfterBreak="0">
+  <w:abstractNum w:abstractNumId="15" w15:restartNumberingAfterBreak="0">
     <w:nsid w:val="56D73A89"/>
     <w:multiLevelType w:val="multilevel"/>
     <w:tmpl w:val="993E84C0"/>
@@ -3776,7 +3954,7 @@
       </w:pPr>
     </w:lvl>
   </w:abstractNum>
-  <w:abstractNum w:abstractNumId="15" w15:restartNumberingAfterBreak="0">
+  <w:abstractNum w:abstractNumId="16" w15:restartNumberingAfterBreak="0">
     <w:nsid w:val="653602D5"/>
     <w:multiLevelType w:val="multilevel"/>
     <w:tmpl w:val="8B2A317C"/>
@@ -3926,52 +4104,55 @@
     </w:lvl>
   </w:abstractNum>
   <w:num w:numId="1" w16cid:durableId="839276068">
-    <w:abstractNumId w:val="12"/>
+    <w:abstractNumId w:val="13"/>
   </w:num>
   <w:num w:numId="2" w16cid:durableId="1735664746">
-    <w:abstractNumId w:val="14"/>
+    <w:abstractNumId w:val="15"/>
   </w:num>
   <w:num w:numId="3" w16cid:durableId="680007925">
-    <w:abstractNumId w:val="3"/>
+    <w:abstractNumId w:val="4"/>
   </w:num>
   <w:num w:numId="4" w16cid:durableId="723480984">
     <w:abstractNumId w:val="0"/>
   </w:num>
   <w:num w:numId="5" w16cid:durableId="839006999">
-    <w:abstractNumId w:val="9"/>
+    <w:abstractNumId w:val="10"/>
   </w:num>
   <w:num w:numId="6" w16cid:durableId="824202453">
-    <w:abstractNumId w:val="4"/>
+    <w:abstractNumId w:val="5"/>
   </w:num>
   <w:num w:numId="7" w16cid:durableId="878393020">
-    <w:abstractNumId w:val="13"/>
+    <w:abstractNumId w:val="14"/>
   </w:num>
   <w:num w:numId="8" w16cid:durableId="27881528">
     <w:abstractNumId w:val="1"/>
   </w:num>
   <w:num w:numId="9" w16cid:durableId="1402827477">
-    <w:abstractNumId w:val="10"/>
+    <w:abstractNumId w:val="11"/>
   </w:num>
   <w:num w:numId="10" w16cid:durableId="1543248788">
-    <w:abstractNumId w:val="2"/>
+    <w:abstractNumId w:val="3"/>
   </w:num>
   <w:num w:numId="11" w16cid:durableId="755174473">
-    <w:abstractNumId w:val="15"/>
+    <w:abstractNumId w:val="16"/>
   </w:num>
   <w:num w:numId="12" w16cid:durableId="1836414701">
-    <w:abstractNumId w:val="5"/>
+    <w:abstractNumId w:val="6"/>
   </w:num>
   <w:num w:numId="13" w16cid:durableId="743261496">
+    <w:abstractNumId w:val="8"/>
+  </w:num>
+  <w:num w:numId="14" w16cid:durableId="915477322">
+    <w:abstractNumId w:val="12"/>
+  </w:num>
+  <w:num w:numId="15" w16cid:durableId="725761127">
+    <w:abstractNumId w:val="9"/>
+  </w:num>
+  <w:num w:numId="16" w16cid:durableId="1809937003">
     <w:abstractNumId w:val="7"/>
   </w:num>
-  <w:num w:numId="14" w16cid:durableId="915477322">
-    <w:abstractNumId w:val="11"/>
-  </w:num>
-  <w:num w:numId="15" w16cid:durableId="725761127">
-    <w:abstractNumId w:val="8"/>
-  </w:num>
-  <w:num w:numId="16" w16cid:durableId="1809937003">
-    <w:abstractNumId w:val="6"/>
+  <w:num w:numId="17" w16cid:durableId="1731536503">
+    <w:abstractNumId w:val="2"/>
   </w:num>
 </w:numbering>
 </file>

</xml_diff>